<commit_message>
Strengthen Section 3.1: activation lemma, order-dependence proposition (P12), workflow-mix remark
Co-Authored-By: Claude Sonnet 5.5 <noreply@anthropic.com>
Claude-Session: https://claude.ai/code/session_018rhUQGpSb53LbsAUNxAKLi
</commit_message>
<xml_diff>
--- a/manuscript_revision/manuscript/manuscript_misq.docx
+++ b/manuscript_revision/manuscript/manuscript_misq.docx
@@ -199,7 +199,7 @@
         <w:t xml:space="preserve">frame shift</w:t>
       </w:r>
       <w:r>
-        <w:t xml:space="preserve">. The artifact exists before the quality decision is made, looks finished, and is already possessed and preselected, and these three features activate, respectively, present bias and the planning fallacy, fluency and automation bias, and default effects, loss aversion, and weak ownership. The contribution is not that these biases exist, since each has an established literature, but that one structural feature of generation-first assistance brings them to bear on the same decision at once, and that this has testable implications that rational acceleration does not share.</w:t>
+        <w:t xml:space="preserve">. The artifact exists before the quality decision is made, looks finished, and is already possessed and preselected, and these three features activate, respectively, present bias and the planning fallacy, fluency and automation bias, and default effects, loss aversion, and weak ownership. The contribution is not that these biases exist, since each has an established literature, but that one structural feature of generation-first assistance brings them to bear on the same decision at once, and that this has testable implications that rational acceleration does not share, chief among them that the effects depend on the order of events and not on the quality of the tool.</w:t>
       </w:r>
     </w:p>
     <w:p>
@@ -362,7 +362,23 @@
         <w:pStyle w:val="BodyText"/>
       </w:pPr>
       <w:r>
-        <w:t xml:space="preserve">Our theory holds that LLM assistance does something else that dominates this effect: it turns the decision from a choice into an acceptance. Before LLM assistance, E and Q are compared before either exists, and both lie in the future. With LLM assistance, an implementation, often an instance of E, exists as soon as the prompt returns, and the developer’s decision becomes whether to accept it or to do more work. The frame shift has three components, each of which activates a distinct set of mechanisms.</w:t>
+        <w:t xml:space="preserve">Our theory holds that LLM assistance does something else that dominates this effect: it changes the order of events in the decision. Before assistance, E and Q are compared before either exists, and both lie in the future. With assistance, an implementation, often an instance of E, exists as soon as the prompt returns, and the developer’s decision becomes whether to accept it or to do more work. We call this the</w:t>
+      </w:r>
+      <w:r>
+        <w:t xml:space="preserve"> </w:t>
+      </w:r>
+      <w:r>
+        <w:rPr>
+          <w:iCs/>
+          <w:i/>
+        </w:rPr>
+        <w:t xml:space="preserve">frame shift</w:t>
+      </w:r>
+      <w:r>
+        <w:t xml:space="preserve"> </w:t>
+      </w:r>
+      <w:r>
+        <w:t xml:space="preserve">and define it by a single structural condition: the frame has shifted when the implementation is generated before the quality decision is made. The shifted frame has three features, each of which engages a distinct set of mechanisms.</w:t>
       </w:r>
     </w:p>
     <w:p>
@@ -420,7 +436,257 @@
         <w:pStyle w:val="BodyText"/>
       </w:pPr>
       <w:r>
-        <w:t xml:space="preserve">The frame shift is a claim about a structural condition, not about a new bias: it applies when generation precedes the quality decision, and it does not apply when the developer decides before the code exists. This boundary is what separates it from the general observation that people are biased.</w:t>
+        <w:rPr>
+          <w:bCs/>
+          <w:b/>
+        </w:rPr>
+        <w:t xml:space="preserve">Why this is a structural claim and not a relabeling of known biases.</w:t>
+      </w:r>
+      <w:r>
+        <w:t xml:space="preserve"> </w:t>
+      </w:r>
+      <w:r>
+        <w:t xml:space="preserve">Each bias in our account is familiar, and we do not claim otherwise. The claim concerns</w:t>
+      </w:r>
+      <w:r>
+        <w:t xml:space="preserve"> </w:t>
+      </w:r>
+      <w:r>
+        <w:rPr>
+          <w:iCs/>
+          <w:i/>
+        </w:rPr>
+        <w:t xml:space="preserve">when they bind</w:t>
+      </w:r>
+      <w:r>
+        <w:t xml:space="preserve">. Present bias, loss aversion, imperfect perception, and default effects are properties of people and interfaces that exist in any setting, but whether one of them affects a particular decision depends on the decision’s structure, and the frame shift is what gives each of them something to act on. Present bias requires a cost that arrives before the benefit it buys. In the choice regime the extra effort of building quality and the rework it avoids both lie in the future, so present bias scales both sides of the comparison equally and drops out. Loss aversion requires a reference point, and before generation there is no artifact whose removal could be felt as a loss. Imperfect perception requires something to perceive: a developer who writes a shortcut knows that she has, whereas one who receives a polished artifact must decide whether to inspect it, an information problem that does not exist before generation. A default requires an option that is already selected for her. Lemma 1 in Section 4.3 makes this precise. In the choice regime, the probability of debt, the self-admitted share, and the lapse rate are the same for every value of the four wedges; in the acceptance regime, debt depends on each of them. The biases are latent before generation and active after it. What the technology changes is not how biased the developer is but which decision those biases apply to.</w:t>
+      </w:r>
+    </w:p>
+    <w:p>
+      <w:pPr>
+        <w:pStyle w:val="BodyText"/>
+      </w:pPr>
+      <w:r>
+        <w:t xml:space="preserve">This structure gives the theory empirical content that a list of biases does not.</w:t>
+      </w:r>
+      <w:r>
+        <w:t xml:space="preserve"> </w:t>
+      </w:r>
+      <w:r>
+        <w:rPr>
+          <w:iCs/>
+          <w:i/>
+        </w:rPr>
+        <w:t xml:space="preserve">First, the wedges should depend on the order of events and on little else.</w:t>
+      </w:r>
+      <w:r>
+        <w:t xml:space="preserve"> </w:t>
+      </w:r>
+      <w:r>
+        <w:t xml:space="preserve">Hold fixed the developer, the tool, the quality of the artifact, the stated costs, and the value of speed, and move the quality decision before generation, for example by requiring the developer to commit to an expedient-or-quality approach before the assistant produces code. The possession effect, the lapse of planned refactoring, and the self-admitted share should then return to their rational values (P12). Rational acceleration predicts no such dependence, because it operates through the value of speed and the price of quality, neither of which the order of events changes. A trait account, in which some developers are simply more biased, predicts differences between developers and none within one developer across orderings. And an account that attributes the debt to the lower quality of generated code predicts that decisions about an artifact of a given quality do not depend on when the decision is taken.</w:t>
+      </w:r>
+      <w:r>
+        <w:t xml:space="preserve"> </w:t>
+      </w:r>
+      <w:r>
+        <w:rPr>
+          <w:iCs/>
+          <w:i/>
+        </w:rPr>
+        <w:t xml:space="preserve">Second, because the decision is the unit of analysis, the wedge in aggregate debt should scale with the share of work that is generation-first.</w:t>
+      </w:r>
+      <w:r>
+        <w:t xml:space="preserve"> </w:t>
+      </w:r>
+      <w:r>
+        <w:t xml:space="preserve">If a share</w:t>
+      </w:r>
+      <w:r>
+        <w:t xml:space="preserve"> </w:t>
+      </w:r>
+      <m:oMath>
+        <m:r>
+          <m:t>θ</m:t>
+        </m:r>
+      </m:oMath>
+      <w:r>
+        <w:t xml:space="preserve"> </w:t>
+      </w:r>
+      <w:r>
+        <w:t xml:space="preserve">of tasks is done that way, aggregate debt is</w:t>
+      </w:r>
+      <w:r>
+        <w:t xml:space="preserve"> </w:t>
+      </w:r>
+      <m:oMath>
+        <m:d>
+          <m:dPr>
+            <m:begChr m:val="("/>
+            <m:endChr m:val=")"/>
+            <m:sepChr m:val=""/>
+            <m:grow/>
+          </m:dPr>
+          <m:e>
+            <m:r>
+              <m:t>1</m:t>
+            </m:r>
+            <m:r>
+              <m:rPr>
+                <m:sty m:val="p"/>
+              </m:rPr>
+              <m:t>−</m:t>
+            </m:r>
+            <m:r>
+              <m:t>θ</m:t>
+            </m:r>
+          </m:e>
+        </m:d>
+        <m:sSub>
+          <m:e>
+            <m:r>
+              <m:t>D</m:t>
+            </m:r>
+          </m:e>
+          <m:sub>
+            <m:r>
+              <m:t>C</m:t>
+            </m:r>
+          </m:sub>
+        </m:sSub>
+        <m:r>
+          <m:rPr>
+            <m:sty m:val="p"/>
+          </m:rPr>
+          <m:t>+</m:t>
+        </m:r>
+        <m:r>
+          <m:t>θ</m:t>
+        </m:r>
+        <m:sSub>
+          <m:e>
+            <m:r>
+              <m:t>D</m:t>
+            </m:r>
+          </m:e>
+          <m:sub>
+            <m:r>
+              <m:t>A</m:t>
+            </m:r>
+          </m:sub>
+        </m:sSub>
+      </m:oMath>
+      <w:r>
+        <w:t xml:space="preserve"> </w:t>
+      </w:r>
+      <w:r>
+        <w:t xml:space="preserve">and its behavioral wedge is</w:t>
+      </w:r>
+      <w:r>
+        <w:t xml:space="preserve"> </w:t>
+      </w:r>
+      <m:oMath>
+        <m:r>
+          <m:t>θ</m:t>
+        </m:r>
+        <m:d>
+          <m:dPr>
+            <m:begChr m:val="["/>
+            <m:endChr m:val="]"/>
+            <m:sepChr m:val=""/>
+            <m:grow/>
+          </m:dPr>
+          <m:e>
+            <m:sSub>
+              <m:e>
+                <m:r>
+                  <m:t>D</m:t>
+                </m:r>
+              </m:e>
+              <m:sub>
+                <m:r>
+                  <m:t>A</m:t>
+                </m:r>
+              </m:sub>
+            </m:sSub>
+            <m:r>
+              <m:rPr>
+                <m:sty m:val="p"/>
+              </m:rPr>
+              <m:t>−</m:t>
+            </m:r>
+            <m:sSubSup>
+              <m:e>
+                <m:r>
+                  <m:t>D</m:t>
+                </m:r>
+              </m:e>
+              <m:sub>
+                <m:r>
+                  <m:t>A</m:t>
+                </m:r>
+              </m:sub>
+              <m:sup>
+                <m:r>
+                  <m:rPr>
+                    <m:sty m:val="p"/>
+                  </m:rPr>
+                  <m:t>*</m:t>
+                </m:r>
+              </m:sup>
+            </m:sSubSup>
+          </m:e>
+        </m:d>
+      </m:oMath>
+      <w:r>
+        <w:t xml:space="preserve"> </w:t>
+      </w:r>
+      <w:r>
+        <w:t xml:space="preserve">(Section 4.4), so the intensity of use, and not adoption alone, is the relevant variable.</w:t>
+      </w:r>
+      <w:r>
+        <w:t xml:space="preserve"> </w:t>
+      </w:r>
+      <w:r>
+        <w:rPr>
+          <w:iCs/>
+          <w:i/>
+        </w:rPr>
+        <w:t xml:space="preserve">Third, the frame is not fixed.</w:t>
+      </w:r>
+      <w:r>
+        <w:t xml:space="preserve"> </w:t>
+      </w:r>
+      <w:r>
+        <w:t xml:space="preserve">Whether an artifact precedes the decision, and how costly it is to reject, are features of the interface, and Section 4.6 asks who sets them.</w:t>
+      </w:r>
+    </w:p>
+    <w:p>
+      <w:pPr>
+        <w:pStyle w:val="BodyText"/>
+      </w:pPr>
+      <w:r>
+        <w:rPr>
+          <w:bCs/>
+          <w:b/>
+        </w:rPr>
+        <w:t xml:space="preserve">Relation to neighboring ideas.</w:t>
+      </w:r>
+      <w:r>
+        <w:t xml:space="preserve"> </w:t>
+      </w:r>
+      <w:r>
+        <w:t xml:space="preserve">Choice architecture (Thaler and Sunstein 2008) treats the frame in which a decision is presented as given and asks how it can be redesigned. Here the technology itself creates the frame, and the question is how a change in technology reorganizes a decision that was previously made in a different order. The theory also differs from rational inattention (Sims 2003), which predicts that people inspect less when inspection is costly. That prediction is already part of our rational benchmark, in which the developer inspects optimally given the cost of inspecting and the value of what she might find; as Result 2(b) shows, the benchmark then yields a self-admitted share of</w:t>
+      </w:r>
+      <w:r>
+        <w:t xml:space="preserve"> </w:t>
+      </w:r>
+      <m:oMath>
+        <m:r>
+          <m:t>σ</m:t>
+        </m:r>
+      </m:oMath>
+      <w:r>
+        <w:t xml:space="preserve">, no possession effect, and no lapses. What the wedges add is behavior that a cost-of-inspection account does not produce in this model.</w:t>
       </w:r>
     </w:p>
     <w:p>
@@ -518,7 +784,7 @@
         <w:pStyle w:val="BodyText"/>
       </w:pPr>
       <w:r>
-        <w:t xml:space="preserve">Table 1 lists the mechanisms and the eleven propositions they imply. The propositions are the empirical hypotheses of the verbal theory; Section 4 formalizes the timing, appearance, and possession mechanisms at the level of a single decision, and the Online Appendix carries the ownership and incentive mechanisms to teams.</w:t>
+        <w:t xml:space="preserve">Table 1 lists the mechanisms and the twelve propositions they imply. The propositions are the empirical hypotheses of the verbal theory; Section 4 formalizes the timing, appearance, and possession mechanisms at the level of a single decision, and the Online Appendix carries the ownership and incentive mechanisms to teams.</w:t>
       </w:r>
     </w:p>
     <w:p>
@@ -1149,6 +1415,56 @@
           </w:p>
         </w:tc>
       </w:tr>
+      <w:tr>
+        <w:tc>
+          <w:tcPr/>
+          <w:p>
+            <w:pPr>
+              <w:pStyle w:val="Compact"/>
+              <w:jc w:val="left"/>
+            </w:pPr>
+            <w:r>
+              <w:t xml:space="preserve">P12</w:t>
+            </w:r>
+          </w:p>
+        </w:tc>
+        <w:tc>
+          <w:tcPr/>
+          <w:p>
+            <w:pPr>
+              <w:pStyle w:val="Compact"/>
+              <w:jc w:val="left"/>
+            </w:pPr>
+            <w:r>
+              <w:t xml:space="preserve">Holding the developer, the tool, the artifact’s quality, the stated costs, and the value of speed fixed, requiring the quality decision to be made before generation returns the possession effect, the lapse of planned refactoring, and the self-admitted share to their rational values.</w:t>
+            </w:r>
+          </w:p>
+        </w:tc>
+        <w:tc>
+          <w:tcPr/>
+          <w:p>
+            <w:pPr>
+              <w:pStyle w:val="Compact"/>
+              <w:jc w:val="left"/>
+            </w:pPr>
+            <w:r>
+              <w:t xml:space="preserve">Frame shift (order of events)</w:t>
+            </w:r>
+          </w:p>
+        </w:tc>
+        <w:tc>
+          <w:tcPr/>
+          <w:p>
+            <w:pPr>
+              <w:pStyle w:val="Compact"/>
+              <w:jc w:val="left"/>
+            </w:pPr>
+            <w:r>
+              <w:t xml:space="preserve">All</w:t>
+            </w:r>
+          </w:p>
+        </w:tc>
+      </w:tr>
     </w:tbl>
     <w:bookmarkEnd w:id="27"/>
     <w:bookmarkStart w:id="28" w:name="a-rival-account-rational-acceleration"/>
@@ -1507,6 +1823,44 @@
           </w:p>
         </w:tc>
       </w:tr>
+      <w:tr>
+        <w:tc>
+          <w:tcPr/>
+          <w:p>
+            <w:pPr>
+              <w:pStyle w:val="Compact"/>
+              <w:jc w:val="left"/>
+            </w:pPr>
+            <w:r>
+              <w:t xml:space="preserve">Order of events: quality decision made before versus after generation (P12)</w:t>
+            </w:r>
+          </w:p>
+        </w:tc>
+        <w:tc>
+          <w:tcPr/>
+          <w:p>
+            <w:pPr>
+              <w:pStyle w:val="Compact"/>
+              <w:jc w:val="left"/>
+            </w:pPr>
+            <w:r>
+              <w:t xml:space="preserve">No change in the three statistics</w:t>
+            </w:r>
+          </w:p>
+        </w:tc>
+        <w:tc>
+          <w:tcPr/>
+          <w:p>
+            <w:pPr>
+              <w:pStyle w:val="Compact"/>
+              <w:jc w:val="left"/>
+            </w:pPr>
+            <w:r>
+              <w:t xml:space="preserve">Statistics return to rational values when the decision precedes generation</w:t>
+            </w:r>
+          </w:p>
+        </w:tc>
+      </w:tr>
     </w:tbl>
     <w:p>
       <w:pPr>
@@ -3483,6 +3837,247 @@
       </w:pPr>
       <w:r>
         <w:rPr>
+          <w:bCs/>
+          <w:b/>
+        </w:rPr>
+        <w:t xml:space="preserve">Lemma 1 (activation).</w:t>
+      </w:r>
+      <w:r>
+        <w:t xml:space="preserve"> </w:t>
+      </w:r>
+      <w:r>
+        <w:t xml:space="preserve">(a) In the choice regime,</w:t>
+      </w:r>
+      <w:r>
+        <w:t xml:space="preserve"> </w:t>
+      </w:r>
+      <m:oMath>
+        <m:sSub>
+          <m:e>
+            <m:r>
+              <m:t>D</m:t>
+            </m:r>
+          </m:e>
+          <m:sub>
+            <m:r>
+              <m:t>C</m:t>
+            </m:r>
+          </m:sub>
+        </m:sSub>
+        <m:d>
+          <m:dPr>
+            <m:begChr m:val="("/>
+            <m:endChr m:val=")"/>
+            <m:sepChr m:val=""/>
+            <m:grow/>
+          </m:dPr>
+          <m:e>
+            <m:r>
+              <m:t>v</m:t>
+            </m:r>
+          </m:e>
+        </m:d>
+        <m:r>
+          <m:rPr>
+            <m:sty m:val="p"/>
+          </m:rPr>
+          <m:t>=</m:t>
+        </m:r>
+        <m:r>
+          <m:t>F</m:t>
+        </m:r>
+        <m:d>
+          <m:dPr>
+            <m:begChr m:val="("/>
+            <m:endChr m:val=")"/>
+            <m:sepChr m:val=""/>
+            <m:grow/>
+          </m:dPr>
+          <m:e>
+            <m:r>
+              <m:t>v</m:t>
+            </m:r>
+            <m:r>
+              <m:t>a</m:t>
+            </m:r>
+            <m:r>
+              <m:rPr>
+                <m:sty m:val="p"/>
+              </m:rPr>
+              <m:t>/</m:t>
+            </m:r>
+            <m:r>
+              <m:t>δ</m:t>
+            </m:r>
+          </m:e>
+        </m:d>
+      </m:oMath>
+      <w:r>
+        <w:t xml:space="preserve">, the self-admitted share equals</w:t>
+      </w:r>
+      <w:r>
+        <w:t xml:space="preserve"> </w:t>
+      </w:r>
+      <m:oMath>
+        <m:r>
+          <m:t>σ</m:t>
+        </m:r>
+      </m:oMath>
+      <w:r>
+        <w:t xml:space="preserve">, and the lapse rate is zero, for every value of</w:t>
+      </w:r>
+      <w:r>
+        <w:t xml:space="preserve"> </w:t>
+      </w:r>
+      <m:oMath>
+        <m:d>
+          <m:dPr>
+            <m:begChr m:val="("/>
+            <m:endChr m:val=")"/>
+            <m:sepChr m:val=""/>
+            <m:grow/>
+          </m:dPr>
+          <m:e>
+            <m:r>
+              <m:t>β</m:t>
+            </m:r>
+            <m:r>
+              <m:rPr>
+                <m:sty m:val="p"/>
+              </m:rPr>
+              <m:t>,</m:t>
+            </m:r>
+            <m:r>
+              <m:t>φ</m:t>
+            </m:r>
+            <m:r>
+              <m:rPr>
+                <m:sty m:val="p"/>
+              </m:rPr>
+              <m:t>,</m:t>
+            </m:r>
+            <m:r>
+              <m:t>α</m:t>
+            </m:r>
+            <m:r>
+              <m:rPr>
+                <m:sty m:val="p"/>
+              </m:rPr>
+              <m:t>,</m:t>
+            </m:r>
+            <m:r>
+              <m:t>λ</m:t>
+            </m:r>
+          </m:e>
+        </m:d>
+      </m:oMath>
+      <w:r>
+        <w:t xml:space="preserve">. (b) In the acceptance regime,</w:t>
+      </w:r>
+      <w:r>
+        <w:t xml:space="preserve"> </w:t>
+      </w:r>
+      <m:oMath>
+        <m:sSub>
+          <m:e>
+            <m:r>
+              <m:t>D</m:t>
+            </m:r>
+          </m:e>
+          <m:sub>
+            <m:r>
+              <m:t>A</m:t>
+            </m:r>
+          </m:sub>
+        </m:sSub>
+        <m:d>
+          <m:dPr>
+            <m:begChr m:val="("/>
+            <m:endChr m:val=")"/>
+            <m:sepChr m:val=""/>
+            <m:grow/>
+          </m:dPr>
+          <m:e>
+            <m:r>
+              <m:t>v</m:t>
+            </m:r>
+          </m:e>
+        </m:d>
+      </m:oMath>
+      <w:r>
+        <w:t xml:space="preserve"> </w:t>
+      </w:r>
+      <w:r>
+        <w:t xml:space="preserve">is weakly decreasing in</w:t>
+      </w:r>
+      <w:r>
+        <w:t xml:space="preserve"> </w:t>
+      </w:r>
+      <m:oMath>
+        <m:r>
+          <m:t>β</m:t>
+        </m:r>
+      </m:oMath>
+      <w:r>
+        <w:t xml:space="preserve"> </w:t>
+      </w:r>
+      <w:r>
+        <w:t xml:space="preserve">and in</w:t>
+      </w:r>
+      <w:r>
+        <w:t xml:space="preserve"> </w:t>
+      </w:r>
+      <m:oMath>
+        <m:r>
+          <m:t>φ</m:t>
+        </m:r>
+      </m:oMath>
+      <w:r>
+        <w:t xml:space="preserve"> </w:t>
+      </w:r>
+      <w:r>
+        <w:t xml:space="preserve">and weakly increasing in</w:t>
+      </w:r>
+      <w:r>
+        <w:t xml:space="preserve"> </w:t>
+      </w:r>
+      <m:oMath>
+        <m:r>
+          <m:t>α</m:t>
+        </m:r>
+      </m:oMath>
+      <w:r>
+        <w:t xml:space="preserve"> </w:t>
+      </w:r>
+      <w:r>
+        <w:t xml:space="preserve">and in</w:t>
+      </w:r>
+      <w:r>
+        <w:t xml:space="preserve"> </w:t>
+      </w:r>
+      <m:oMath>
+        <m:r>
+          <m:t>λ</m:t>
+        </m:r>
+      </m:oMath>
+      <w:r>
+        <w:t xml:space="preserve">, and strictly so when the wedge changes a decision on a set of tasks of positive probability.</w:t>
+      </w:r>
+    </w:p>
+    <w:p>
+      <w:pPr>
+        <w:pStyle w:val="BodyText"/>
+      </w:pPr>
+      <w:r>
+        <w:t xml:space="preserve">Part (a) says that the four wedges have no domain in the choice regime; part (b) says that each acquires one in the acceptance regime. This is the sense in which the frame shift activates the biases.</w:t>
+      </w:r>
+    </w:p>
+    <w:p>
+      <w:pPr>
+        <w:pStyle w:val="BodyText"/>
+      </w:pPr>
+      <w:r>
+        <w:rPr>
           <w:iCs/>
           <w:i/>
         </w:rPr>
@@ -4496,6 +5091,354 @@
       </w:r>
       <w:r>
         <w:t xml:space="preserve">with log-dispersion 0.79, the price effect lowers the probability of debt by 0.24 and the wedge raises it by 0.32 at a constant value of time, so that debt rises from 0.50 to 0.58 per task even though quality has become cheaper.</w:t>
+      </w:r>
+    </w:p>
+    <w:p>
+      <w:pPr>
+        <w:pStyle w:val="BodyText"/>
+      </w:pPr>
+      <w:r>
+        <w:rPr>
+          <w:bCs/>
+          <w:b/>
+        </w:rPr>
+        <w:t xml:space="preserve">Remark (workflow mix).</w:t>
+      </w:r>
+      <w:r>
+        <w:t xml:space="preserve"> </w:t>
+      </w:r>
+      <w:r>
+        <w:t xml:space="preserve">If a share</w:t>
+      </w:r>
+      <w:r>
+        <w:t xml:space="preserve"> </w:t>
+      </w:r>
+      <m:oMath>
+        <m:r>
+          <m:t>θ</m:t>
+        </m:r>
+      </m:oMath>
+      <w:r>
+        <w:t xml:space="preserve"> </w:t>
+      </w:r>
+      <w:r>
+        <w:t xml:space="preserve">of tasks is done generation-first and the rest in the choice regime, aggregate debt is</w:t>
+      </w:r>
+      <w:r>
+        <w:t xml:space="preserve"> </w:t>
+      </w:r>
+      <m:oMath>
+        <m:r>
+          <m:t>D</m:t>
+        </m:r>
+        <m:d>
+          <m:dPr>
+            <m:begChr m:val="("/>
+            <m:endChr m:val=")"/>
+            <m:sepChr m:val=""/>
+            <m:grow/>
+          </m:dPr>
+          <m:e>
+            <m:r>
+              <m:t>θ</m:t>
+            </m:r>
+            <m:r>
+              <m:rPr>
+                <m:sty m:val="p"/>
+              </m:rPr>
+              <m:t>,</m:t>
+            </m:r>
+            <m:r>
+              <m:t>v</m:t>
+            </m:r>
+          </m:e>
+        </m:d>
+        <m:r>
+          <m:rPr>
+            <m:sty m:val="p"/>
+          </m:rPr>
+          <m:t>=</m:t>
+        </m:r>
+        <m:d>
+          <m:dPr>
+            <m:begChr m:val="("/>
+            <m:endChr m:val=")"/>
+            <m:sepChr m:val=""/>
+            <m:grow/>
+          </m:dPr>
+          <m:e>
+            <m:r>
+              <m:t>1</m:t>
+            </m:r>
+            <m:r>
+              <m:rPr>
+                <m:sty m:val="p"/>
+              </m:rPr>
+              <m:t>−</m:t>
+            </m:r>
+            <m:r>
+              <m:t>θ</m:t>
+            </m:r>
+          </m:e>
+        </m:d>
+        <m:sSub>
+          <m:e>
+            <m:r>
+              <m:t>D</m:t>
+            </m:r>
+          </m:e>
+          <m:sub>
+            <m:r>
+              <m:t>C</m:t>
+            </m:r>
+          </m:sub>
+        </m:sSub>
+        <m:d>
+          <m:dPr>
+            <m:begChr m:val="("/>
+            <m:endChr m:val=")"/>
+            <m:sepChr m:val=""/>
+            <m:grow/>
+          </m:dPr>
+          <m:e>
+            <m:r>
+              <m:t>v</m:t>
+            </m:r>
+          </m:e>
+        </m:d>
+        <m:r>
+          <m:rPr>
+            <m:sty m:val="p"/>
+          </m:rPr>
+          <m:t>+</m:t>
+        </m:r>
+        <m:r>
+          <m:t>θ</m:t>
+        </m:r>
+        <m:sSub>
+          <m:e>
+            <m:r>
+              <m:t>D</m:t>
+            </m:r>
+          </m:e>
+          <m:sub>
+            <m:r>
+              <m:t>A</m:t>
+            </m:r>
+          </m:sub>
+        </m:sSub>
+        <m:d>
+          <m:dPr>
+            <m:begChr m:val="("/>
+            <m:endChr m:val=")"/>
+            <m:sepChr m:val=""/>
+            <m:grow/>
+          </m:dPr>
+          <m:e>
+            <m:r>
+              <m:t>v</m:t>
+            </m:r>
+          </m:e>
+        </m:d>
+      </m:oMath>
+      <w:r>
+        <w:t xml:space="preserve">. Because</w:t>
+      </w:r>
+      <w:r>
+        <w:t xml:space="preserve"> </w:t>
+      </w:r>
+      <m:oMath>
+        <m:sSub>
+          <m:e>
+            <m:r>
+              <m:t>D</m:t>
+            </m:r>
+          </m:e>
+          <m:sub>
+            <m:r>
+              <m:t>C</m:t>
+            </m:r>
+          </m:sub>
+        </m:sSub>
+      </m:oMath>
+      <w:r>
+        <w:t xml:space="preserve"> </w:t>
+      </w:r>
+      <w:r>
+        <w:t xml:space="preserve">does not depend on the wedges (Lemma 1), the behavioral wedge in aggregate debt is</w:t>
+      </w:r>
+      <w:r>
+        <w:t xml:space="preserve"> </w:t>
+      </w:r>
+      <m:oMath>
+        <m:r>
+          <m:t>D</m:t>
+        </m:r>
+        <m:d>
+          <m:dPr>
+            <m:begChr m:val="("/>
+            <m:endChr m:val=")"/>
+            <m:sepChr m:val=""/>
+            <m:grow/>
+          </m:dPr>
+          <m:e>
+            <m:r>
+              <m:t>θ</m:t>
+            </m:r>
+            <m:r>
+              <m:rPr>
+                <m:sty m:val="p"/>
+              </m:rPr>
+              <m:t>,</m:t>
+            </m:r>
+            <m:r>
+              <m:t>v</m:t>
+            </m:r>
+          </m:e>
+        </m:d>
+        <m:r>
+          <m:rPr>
+            <m:sty m:val="p"/>
+          </m:rPr>
+          <m:t>−</m:t>
+        </m:r>
+        <m:sSup>
+          <m:e>
+            <m:r>
+              <m:t>D</m:t>
+            </m:r>
+          </m:e>
+          <m:sup>
+            <m:r>
+              <m:rPr>
+                <m:sty m:val="p"/>
+              </m:rPr>
+              <m:t>*</m:t>
+            </m:r>
+          </m:sup>
+        </m:sSup>
+        <m:d>
+          <m:dPr>
+            <m:begChr m:val="("/>
+            <m:endChr m:val=")"/>
+            <m:sepChr m:val=""/>
+            <m:grow/>
+          </m:dPr>
+          <m:e>
+            <m:r>
+              <m:t>θ</m:t>
+            </m:r>
+            <m:r>
+              <m:rPr>
+                <m:sty m:val="p"/>
+              </m:rPr>
+              <m:t>,</m:t>
+            </m:r>
+            <m:r>
+              <m:t>v</m:t>
+            </m:r>
+          </m:e>
+        </m:d>
+        <m:r>
+          <m:rPr>
+            <m:sty m:val="p"/>
+          </m:rPr>
+          <m:t>=</m:t>
+        </m:r>
+        <m:r>
+          <m:t>θ</m:t>
+        </m:r>
+        <m:r>
+          <m:t> </m:t>
+        </m:r>
+        <m:d>
+          <m:dPr>
+            <m:begChr m:val="["/>
+            <m:endChr m:val="]"/>
+            <m:sepChr m:val=""/>
+            <m:grow/>
+          </m:dPr>
+          <m:e>
+            <m:sSub>
+              <m:e>
+                <m:r>
+                  <m:t>D</m:t>
+                </m:r>
+              </m:e>
+              <m:sub>
+                <m:r>
+                  <m:t>A</m:t>
+                </m:r>
+              </m:sub>
+            </m:sSub>
+            <m:d>
+              <m:dPr>
+                <m:begChr m:val="("/>
+                <m:endChr m:val=")"/>
+                <m:sepChr m:val=""/>
+                <m:grow/>
+              </m:dPr>
+              <m:e>
+                <m:r>
+                  <m:t>v</m:t>
+                </m:r>
+              </m:e>
+            </m:d>
+            <m:r>
+              <m:rPr>
+                <m:sty m:val="p"/>
+              </m:rPr>
+              <m:t>−</m:t>
+            </m:r>
+            <m:sSubSup>
+              <m:e>
+                <m:r>
+                  <m:t>D</m:t>
+                </m:r>
+              </m:e>
+              <m:sub>
+                <m:r>
+                  <m:t>A</m:t>
+                </m:r>
+              </m:sub>
+              <m:sup>
+                <m:r>
+                  <m:rPr>
+                    <m:sty m:val="p"/>
+                  </m:rPr>
+                  <m:t>*</m:t>
+                </m:r>
+              </m:sup>
+            </m:sSubSup>
+            <m:d>
+              <m:dPr>
+                <m:begChr m:val="("/>
+                <m:endChr m:val=")"/>
+                <m:sepChr m:val=""/>
+                <m:grow/>
+              </m:dPr>
+              <m:e>
+                <m:r>
+                  <m:t>v</m:t>
+                </m:r>
+              </m:e>
+            </m:d>
+          </m:e>
+        </m:d>
+      </m:oMath>
+      <w:r>
+        <w:t xml:space="preserve">, which scales with</w:t>
+      </w:r>
+      <w:r>
+        <w:t xml:space="preserve"> </w:t>
+      </w:r>
+      <m:oMath>
+        <m:r>
+          <m:t>θ</m:t>
+        </m:r>
+      </m:oMath>
+      <w:r>
+        <w:t xml:space="preserve">.</w:t>
       </w:r>
     </w:p>
     <w:p>
@@ -12203,7 +13146,7 @@
         <w:t xml:space="preserve"> </w:t>
       </w:r>
       <w:r>
-        <w:t xml:space="preserve">(acceptance versus choice, the possession effect), so the design recovers both parameters separately, while rational acceleration predicts all three differences are zero. To make costs real, one decision per participant is drawn at random and its stated minutes are deducted from a bonus. Simulations of the design, using the model’s own decision rule with realistic response noise and 15 percent random responders, show that a single session comparing choice and acceptance detects the possession effect with power above 0.85 at about 100 participants for moderate or mild effects, whereas separating</w:t>
+        <w:t xml:space="preserve">(acceptance versus choice, the possession effect), so the design recovers both parameters separately, while rational acceleration predicts all three differences are zero. The comparison of the choice and acceptance conditions is also the within-person test of the order-dependence implication (P12). To make costs real, one decision per participant is drawn at random and its stated minutes are deducted from a bonus. Simulations of the design, using the model’s own decision rule with realistic response noise and 15 percent random responders, show that a single session comparing choice and acceptance detects the possession effect with power above 0.85 at about 100 participants for moderate or mild effects, whereas separating</w:t>
       </w:r>
       <w:r>
         <w:t xml:space="preserve"> </w:t>
@@ -13318,6 +14261,30 @@
         <w:pStyle w:val="BodyText"/>
       </w:pPr>
       <w:r>
+        <w:t xml:space="preserve">Sims CA (2003) Implications of rational inattention.</w:t>
+      </w:r>
+      <w:r>
+        <w:t xml:space="preserve"> </w:t>
+      </w:r>
+      <w:r>
+        <w:rPr>
+          <w:iCs/>
+          <w:i/>
+        </w:rPr>
+        <w:t xml:space="preserve">J. Monetary Econom.</w:t>
+      </w:r>
+      <w:r>
+        <w:t xml:space="preserve"> </w:t>
+      </w:r>
+      <w:r>
+        <w:t xml:space="preserve">50(3):665–690.</w:t>
+      </w:r>
+    </w:p>
+    <w:p>
+      <w:pPr>
+        <w:pStyle w:val="BodyText"/>
+      </w:pPr>
+      <w:r>
         <w:t xml:space="preserve">Slater T (2025) Quantitative analysis of technical debt and pattern violation in large language model architectures. Working paper, arXiv:2512.04273.</w:t>
       </w:r>
     </w:p>
@@ -13454,6 +14421,303 @@
     <w:p>
       <w:pPr>
         <w:pStyle w:val="FirstParagraph"/>
+      </w:pPr>
+      <w:r>
+        <w:rPr>
+          <w:bCs/>
+          <w:b/>
+        </w:rPr>
+        <w:t xml:space="preserve">Lemma 1.</w:t>
+      </w:r>
+      <w:r>
+        <w:t xml:space="preserve"> </w:t>
+      </w:r>
+      <w:r>
+        <w:t xml:space="preserve">(a) Condition (1) contains none of</w:t>
+      </w:r>
+      <w:r>
+        <w:t xml:space="preserve"> </w:t>
+      </w:r>
+      <m:oMath>
+        <m:r>
+          <m:t>β</m:t>
+        </m:r>
+      </m:oMath>
+      <w:r>
+        <w:t xml:space="preserve">,</w:t>
+      </w:r>
+      <w:r>
+        <w:t xml:space="preserve"> </w:t>
+      </w:r>
+      <m:oMath>
+        <m:r>
+          <m:t>φ</m:t>
+        </m:r>
+      </m:oMath>
+      <w:r>
+        <w:t xml:space="preserve">,</w:t>
+      </w:r>
+      <w:r>
+        <w:t xml:space="preserve"> </w:t>
+      </w:r>
+      <m:oMath>
+        <m:r>
+          <m:t>α</m:t>
+        </m:r>
+      </m:oMath>
+      <w:r>
+        <w:t xml:space="preserve">,</w:t>
+      </w:r>
+      <w:r>
+        <w:t xml:space="preserve"> </w:t>
+      </w:r>
+      <m:oMath>
+        <m:r>
+          <m:t>λ</m:t>
+        </m:r>
+      </m:oMath>
+      <w:r>
+        <w:t xml:space="preserve">, so the decision in the choice regime and its debt probability</w:t>
+      </w:r>
+      <w:r>
+        <w:t xml:space="preserve"> </w:t>
+      </w:r>
+      <m:oMath>
+        <m:r>
+          <m:t>F</m:t>
+        </m:r>
+        <m:d>
+          <m:dPr>
+            <m:begChr m:val="("/>
+            <m:endChr m:val=")"/>
+            <m:sepChr m:val=""/>
+            <m:grow/>
+          </m:dPr>
+          <m:e>
+            <m:r>
+              <m:t>v</m:t>
+            </m:r>
+            <m:r>
+              <m:t>a</m:t>
+            </m:r>
+            <m:r>
+              <m:rPr>
+                <m:sty m:val="p"/>
+              </m:rPr>
+              <m:t>/</m:t>
+            </m:r>
+            <m:r>
+              <m:t>δ</m:t>
+            </m:r>
+          </m:e>
+        </m:d>
+      </m:oMath>
+      <w:r>
+        <w:t xml:space="preserve"> </w:t>
+      </w:r>
+      <w:r>
+        <w:t xml:space="preserve">do not depend on them. A shortcut chosen in this way is recognized, and so is admitted with probability</w:t>
+      </w:r>
+      <w:r>
+        <w:t xml:space="preserve"> </w:t>
+      </w:r>
+      <m:oMath>
+        <m:r>
+          <m:t>σ</m:t>
+        </m:r>
+      </m:oMath>
+      <w:r>
+        <w:t xml:space="preserve">. The decision taken at date 0 determines what is built at date 1, so there is no plan that can later lapse. (b) This is the wedge argument in the proof of Result 1:</w:t>
+      </w:r>
+      <w:r>
+        <w:t xml:space="preserve"> </w:t>
+      </w:r>
+      <m:oMath>
+        <m:r>
+          <m:t>β</m:t>
+        </m:r>
+        <m:r>
+          <m:rPr>
+            <m:sty m:val="p"/>
+          </m:rPr>
+          <m:t>&lt;</m:t>
+        </m:r>
+        <m:r>
+          <m:t>1</m:t>
+        </m:r>
+      </m:oMath>
+      <w:r>
+        <w:t xml:space="preserve"> </w:t>
+      </w:r>
+      <w:r>
+        <w:t xml:space="preserve">and</w:t>
+      </w:r>
+      <w:r>
+        <w:t xml:space="preserve"> </w:t>
+      </w:r>
+      <m:oMath>
+        <m:r>
+          <m:t>λ</m:t>
+        </m:r>
+        <m:r>
+          <m:rPr>
+            <m:sty m:val="p"/>
+          </m:rPr>
+          <m:t>&gt;</m:t>
+        </m:r>
+        <m:r>
+          <m:t>1</m:t>
+        </m:r>
+      </m:oMath>
+      <w:r>
+        <w:t xml:space="preserve"> </w:t>
+      </w:r>
+      <w:r>
+        <w:t xml:space="preserve">lower</w:t>
+      </w:r>
+      <w:r>
+        <w:t xml:space="preserve"> </w:t>
+      </w:r>
+      <m:oMath>
+        <m:r>
+          <m:t>β</m:t>
+        </m:r>
+        <m:r>
+          <m:t>δ</m:t>
+        </m:r>
+        <m:r>
+          <m:t>R</m:t>
+        </m:r>
+        <m:r>
+          <m:rPr>
+            <m:sty m:val="p"/>
+          </m:rPr>
+          <m:t>−</m:t>
+        </m:r>
+        <m:r>
+          <m:t>λ</m:t>
+        </m:r>
+        <m:r>
+          <m:t>v</m:t>
+        </m:r>
+        <m:r>
+          <m:t>r</m:t>
+        </m:r>
+      </m:oMath>
+      <w:r>
+        <w:t xml:space="preserve">;</w:t>
+      </w:r>
+      <w:r>
+        <w:t xml:space="preserve"> </w:t>
+      </w:r>
+      <m:oMath>
+        <m:r>
+          <m:t>φ</m:t>
+        </m:r>
+        <m:r>
+          <m:rPr>
+            <m:sty m:val="p"/>
+          </m:rPr>
+          <m:t>&lt;</m:t>
+        </m:r>
+        <m:r>
+          <m:t>1</m:t>
+        </m:r>
+      </m:oMath>
+      <w:r>
+        <w:t xml:space="preserve"> </w:t>
+      </w:r>
+      <w:r>
+        <w:t xml:space="preserve">lowers</w:t>
+      </w:r>
+      <w:r>
+        <w:t xml:space="preserve"> </w:t>
+      </w:r>
+      <m:oMath>
+        <m:acc>
+          <m:accPr>
+            <m:chr m:val="̃"/>
+          </m:accPr>
+          <m:e>
+            <m:r>
+              <m:t>q</m:t>
+            </m:r>
+          </m:e>
+        </m:acc>
+      </m:oMath>
+      <w:r>
+        <w:t xml:space="preserve">, which is increasing in</w:t>
+      </w:r>
+      <w:r>
+        <w:t xml:space="preserve"> </w:t>
+      </w:r>
+      <m:oMath>
+        <m:r>
+          <m:t>φ</m:t>
+        </m:r>
+      </m:oMath>
+      <w:r>
+        <w:t xml:space="preserve"> </w:t>
+      </w:r>
+      <w:r>
+        <w:t xml:space="preserve">because</w:t>
+      </w:r>
+      <w:r>
+        <w:t xml:space="preserve"> </w:t>
+      </w:r>
+      <m:oMath>
+        <m:r>
+          <m:t>η</m:t>
+        </m:r>
+        <m:r>
+          <m:rPr>
+            <m:sty m:val="p"/>
+          </m:rPr>
+          <m:t>≤</m:t>
+        </m:r>
+        <m:r>
+          <m:t>1</m:t>
+        </m:r>
+        <m:r>
+          <m:rPr>
+            <m:sty m:val="p"/>
+          </m:rPr>
+          <m:t>/</m:t>
+        </m:r>
+        <m:r>
+          <m:t>2</m:t>
+        </m:r>
+      </m:oMath>
+      <w:r>
+        <w:t xml:space="preserve">, and lowers the noticing probability; and</w:t>
+      </w:r>
+      <w:r>
+        <w:t xml:space="preserve"> </w:t>
+      </w:r>
+      <m:oMath>
+        <m:r>
+          <m:t>α</m:t>
+        </m:r>
+        <m:r>
+          <m:rPr>
+            <m:sty m:val="p"/>
+          </m:rPr>
+          <m:t>&gt;</m:t>
+        </m:r>
+        <m:r>
+          <m:t>0</m:t>
+        </m:r>
+      </m:oMath>
+      <w:r>
+        <w:t xml:space="preserve"> </w:t>
+      </w:r>
+      <w:r>
+        <w:t xml:space="preserve">removes inspections. Each makes debt pointwise weakly higher.</w:t>
+      </w:r>
+    </w:p>
+    <w:p>
+      <w:pPr>
+        <w:pStyle w:val="BodyText"/>
       </w:pPr>
       <w:r>
         <w:rPr>
@@ -17140,6 +18404,7 @@
     </w:p>
     <w:bookmarkEnd w:id="54"/>
     <w:sectPr>
+      <w:footerReference w:type="default" r:id="rId9"/>
       <w:pgMar w:bottom="1440" w:left="1440" w:right="1440" w:top="1440"/>
     </w:sectPr>
   </w:body>
@@ -17148,6 +18413,38 @@
 
 <file path=word/comments.xml><?xml version="1.0" encoding="utf-8"?>
 <w:comments xmlns:w="http://schemas.openxmlformats.org/wordprocessingml/2006/main" xmlns:m="http://schemas.openxmlformats.org/officeDocument/2006/math" xmlns:r="http://schemas.openxmlformats.org/officeDocument/2006/relationships" xmlns:o="urn:schemas-microsoft-com:office:office" xmlns:v="urn:schemas-microsoft-com:vml" xmlns:w10="urn:schemas-microsoft-com:office:word" xmlns:a="http://schemas.openxmlformats.org/drawingml/2006/main" xmlns:pic="http://schemas.openxmlformats.org/drawingml/2006/picture" xmlns:wp="http://schemas.openxmlformats.org/drawingml/2006/wordprocessingDrawing"/>
+</file>
+
+<file path=word/footer1.xml><?xml version="1.0" encoding="utf-8"?>
+<w:ftr xmlns:m="http://schemas.openxmlformats.org/officeDocument/2006/math" xmlns:mc="http://schemas.openxmlformats.org/markup-compatibility/2006" xmlns:mo="http://schemas.microsoft.com/office/mac/office/2008/main" xmlns:mv="urn:schemas-microsoft-com:mac:vml" xmlns:o="urn:schemas-microsoft-com:office:office" xmlns:r="http://schemas.openxmlformats.org/officeDocument/2006/relationships" xmlns:v="urn:schemas-microsoft-com:vml" xmlns:w10="urn:schemas-microsoft-com:office:word" xmlns:w14="http://schemas.microsoft.com/office/word/2010/wordml" xmlns:w="http://schemas.openxmlformats.org/wordprocessingml/2006/main" xmlns:wne="http://schemas.microsoft.com/office/word/2006/wordml" xmlns:wp14="http://schemas.microsoft.com/office/word/2010/wordprocessingDrawing" xmlns:wp="http://schemas.openxmlformats.org/drawingml/2006/wordprocessingDrawing" xmlns:wpc="http://schemas.microsoft.com/office/word/2010/wordprocessingCanvas" xmlns:wpg="http://schemas.microsoft.com/office/word/2010/wordprocessingGroup" xmlns:wpi="http://schemas.microsoft.com/office/word/2010/wordprocessingInk" xmlns:wps="http://schemas.microsoft.com/office/word/2010/wordprocessingShape" mc:Ignorable="w14 wp14">
+  <w:p>
+    <w:pPr>
+      <w:pStyle w:val="Footer"/>
+      <w:jc w:val="center"/>
+    </w:pPr>
+    <w:r>
+      <w:rPr>
+        <w:rFonts w:ascii="Times New Roman" w:hAnsi="Times New Roman"/>
+        <w:sz w:val="24"/>
+      </w:rPr>
+      <w:fldChar w:fldCharType="begin"/>
+    </w:r>
+    <w:r>
+      <w:rPr>
+        <w:rFonts w:ascii="Times New Roman" w:hAnsi="Times New Roman"/>
+        <w:sz w:val="24"/>
+      </w:rPr>
+      <w:instrText xml:space="preserve"> PAGE </w:instrText>
+    </w:r>
+    <w:r>
+      <w:rPr>
+        <w:rFonts w:ascii="Times New Roman" w:hAnsi="Times New Roman"/>
+        <w:sz w:val="24"/>
+      </w:rPr>
+      <w:fldChar w:fldCharType="end"/>
+    </w:r>
+  </w:p>
+</w:ftr>
 </file>
 
 <file path=word/footnotes.xml><?xml version="1.0" encoding="utf-8"?>

</xml_diff>

<commit_message>
Add Section 4.7 and Result 9: rational information as an alternative source of order dependence
Co-Authored-By: Claude Sonnet 5.5 <noreply@anthropic.com>
Claude-Session: https://claude.ai/code/session_018rhUQGpSb53LbsAUNxAKLi
</commit_message>
<xml_diff>
--- a/manuscript_revision/manuscript/manuscript_misq.docx
+++ b/manuscript_revision/manuscript/manuscript_misq.docx
@@ -483,7 +483,7 @@
         <w:t xml:space="preserve"> </w:t>
       </w:r>
       <w:r>
-        <w:t xml:space="preserve">Hold fixed the developer, the tool, the quality of the artifact, the stated costs, and the value of speed, and move the quality decision before generation, for example by requiring the developer to commit to an expedient-or-quality approach before the assistant produces code. The possession effect, the lapse of planned refactoring, and the self-admitted share should then return to their rational values (P12). Rational acceleration predicts no such dependence, because it operates through the value of speed and the price of quality, neither of which the order of events changes. A trait account, in which some developers are simply more biased, predicts differences between developers and none within one developer across orderings. And an account that attributes the debt to the lower quality of generated code predicts that decisions about an artifact of a given quality do not depend on when the decision is taken.</w:t>
+        <w:t xml:space="preserve">Hold fixed the developer, the tool, the quality of the artifact, the stated costs, and the value of speed, and move the quality decision before generation, for example by requiring the developer to commit to an expedient-or-quality approach before the assistant produces code. The possession effect, the lapse of planned refactoring, and the self-admitted share should then return to their rational values (P12). Rational acceleration predicts no such dependence, because it operates through the value of speed and the price of quality, neither of which the order of events changes. A trait account, in which some developers are simply more biased, predicts differences between developers and none within one developer across orderings. And an account that attributes the debt to the lower quality of generated code predicts that decisions about an artifact of a given quality do not depend on when the decision is taken. A rational developer can also behave differently before and after generation if the artifact reveals information about the work ahead; Section 4.7 shows that this channel is bounded by the dispersion of the signal, has a case-dependent sign, and is absent when costs are stated.</w:t>
       </w:r>
       <w:r>
         <w:t xml:space="preserve"> </w:t>
@@ -1890,7 +1890,7 @@
     </w:p>
     <w:bookmarkEnd w:id="29"/>
     <w:bookmarkEnd w:id="30"/>
-    <w:bookmarkStart w:id="37" w:name="a-formal-model-of-choosing-and-accepting"/>
+    <w:bookmarkStart w:id="38" w:name="a-formal-model-of-choosing-and-accepting"/>
     <w:p>
       <w:pPr>
         <w:pStyle w:val="Heading1"/>
@@ -1904,7 +1904,7 @@
         <w:pStyle w:val="FirstParagraph"/>
       </w:pPr>
       <w:r>
-        <w:t xml:space="preserve">This section formalizes the frame shift. It states the developer’s decision problem as a utility-maximization problem under each regime (Sections 4.1 to 4.3), extends it to debt dynamics and learning (4.5), and embeds the developer in a game with a tool vendor and her organization (4.6). Proofs of Results 1 to 3 and 5 to 7 are in Appendix A; proofs of Results 4 and 8 are in the Online Appendix. Every closed form was also checked against a brute-force evaluation of the problem it solves.</w:t>
+        <w:t xml:space="preserve">This section formalizes the frame shift. It states the developer’s decision problem as a utility-maximization problem under each regime (Sections 4.1 to 4.3), extends it to debt dynamics and learning (4.5), embeds the developer in a game with a tool vendor and her organization (4.6), and asks how far rational information can explain order dependence (4.7). Proofs of Results 1 to 3, 5 to 7, and 9 are in Appendix A; proofs of Results 4 and 8 are in the Online Appendix. Every closed form was also checked against a brute-force evaluation of the problem it solves.</w:t>
       </w:r>
     </w:p>
     <w:bookmarkStart w:id="31" w:name="environment"/>
@@ -11635,14 +11635,13 @@
       </w:r>
     </w:p>
     <w:bookmarkEnd w:id="36"/>
-    <w:bookmarkEnd w:id="37"/>
-    <w:bookmarkStart w:id="46" w:name="empirical-evidence"/>
+    <w:bookmarkStart w:id="37" w:name="X5fa26700188c78a6270967b2fafe01a40ddc08f"/>
     <w:p>
       <w:pPr>
-        <w:pStyle w:val="Heading1"/>
-      </w:pPr>
-      <w:r>
-        <w:t xml:space="preserve">5. Empirical Evidence</w:t>
+        <w:pStyle w:val="Heading2"/>
+      </w:pPr>
+      <w:r>
+        <w:t xml:space="preserve">4.7 Robustness: Can Rational Information Explain Order Dependence?</w:t>
       </w:r>
     </w:p>
     <w:p>
@@ -11650,10 +11649,1075 @@
         <w:pStyle w:val="FirstParagraph"/>
       </w:pPr>
       <w:r>
+        <w:t xml:space="preserve">A rational developer can also behave differently before and after generation if generating the artifact reveals information about the work ahead: that the code runs, that the task is easier than expected, or that the surrounding code is harder to change. This is a legitimate objection to the order-dependence implication (P12) and to the statistics that rest on it, and we address it inside the model. Let the rework cost</w:t>
+      </w:r>
+      <w:r>
+        <w:t xml:space="preserve"> </w:t>
+      </w:r>
+      <m:oMath>
+        <m:r>
+          <m:t>R</m:t>
+        </m:r>
+      </m:oMath>
+      <w:r>
+        <w:t xml:space="preserve"> </w:t>
+      </w:r>
+      <w:r>
+        <w:t xml:space="preserve">be unknown when the developer decides ex ante, with prior mean</w:t>
+      </w:r>
+      <w:r>
+        <w:t xml:space="preserve"> </w:t>
+      </w:r>
+      <m:oMath>
+        <m:acc>
+          <m:accPr>
+            <m:chr m:val="‾"/>
+          </m:accPr>
+          <m:e>
+            <m:r>
+              <m:t>R</m:t>
+            </m:r>
+          </m:e>
+        </m:acc>
+        <m:r>
+          <m:rPr>
+            <m:sty m:val="p"/>
+          </m:rPr>
+          <m:t>=</m:t>
+        </m:r>
+        <m:r>
+          <m:rPr>
+            <m:sty m:val="p"/>
+            <m:scr m:val="double-struck"/>
+          </m:rPr>
+          <m:t>E</m:t>
+        </m:r>
+        <m:d>
+          <m:dPr>
+            <m:begChr m:val="["/>
+            <m:endChr m:val="]"/>
+            <m:sepChr m:val=""/>
+            <m:grow/>
+          </m:dPr>
+          <m:e>
+            <m:r>
+              <m:t>R</m:t>
+            </m:r>
+          </m:e>
+        </m:d>
+      </m:oMath>
+      <w:r>
+        <w:t xml:space="preserve">, and let her observe a signal</w:t>
+      </w:r>
+      <w:r>
+        <w:t xml:space="preserve"> </w:t>
+      </w:r>
+      <m:oMath>
+        <m:r>
+          <m:t>S</m:t>
+        </m:r>
+      </m:oMath>
+      <w:r>
+        <w:t xml:space="preserve"> </w:t>
+      </w:r>
+      <w:r>
+        <w:t xml:space="preserve">about it only once the artifact exists, with posterior mean</w:t>
+      </w:r>
+      <w:r>
+        <w:t xml:space="preserve"> </w:t>
+      </w:r>
+      <m:oMath>
+        <m:r>
+          <m:t>m</m:t>
+        </m:r>
+        <m:d>
+          <m:dPr>
+            <m:begChr m:val="("/>
+            <m:endChr m:val=")"/>
+            <m:sepChr m:val=""/>
+            <m:grow/>
+          </m:dPr>
+          <m:e>
+            <m:r>
+              <m:t>S</m:t>
+            </m:r>
+          </m:e>
+        </m:d>
+        <m:r>
+          <m:rPr>
+            <m:sty m:val="p"/>
+          </m:rPr>
+          <m:t>=</m:t>
+        </m:r>
+        <m:r>
+          <m:rPr>
+            <m:sty m:val="p"/>
+            <m:scr m:val="double-struck"/>
+          </m:rPr>
+          <m:t>E</m:t>
+        </m:r>
+        <m:d>
+          <m:dPr>
+            <m:begChr m:val="["/>
+            <m:endChr m:val="]"/>
+            <m:sepChr m:val=""/>
+            <m:grow/>
+          </m:dPr>
+          <m:e>
+            <m:r>
+              <m:t>R</m:t>
+            </m:r>
+            <m:r>
+              <m:rPr>
+                <m:sty m:val="p"/>
+              </m:rPr>
+              <m:t>∣</m:t>
+            </m:r>
+            <m:r>
+              <m:t>S</m:t>
+            </m:r>
+          </m:e>
+        </m:d>
+      </m:oMath>
+      <w:r>
+        <w:t xml:space="preserve">, so that</w:t>
+      </w:r>
+      <w:r>
+        <w:t xml:space="preserve"> </w:t>
+      </w:r>
+      <m:oMath>
+        <m:r>
+          <m:rPr>
+            <m:sty m:val="p"/>
+            <m:scr m:val="double-struck"/>
+          </m:rPr>
+          <m:t>E</m:t>
+        </m:r>
+        <m:d>
+          <m:dPr>
+            <m:begChr m:val="["/>
+            <m:endChr m:val="]"/>
+            <m:sepChr m:val=""/>
+            <m:grow/>
+          </m:dPr>
+          <m:e>
+            <m:r>
+              <m:t>m</m:t>
+            </m:r>
+            <m:d>
+              <m:dPr>
+                <m:begChr m:val="("/>
+                <m:endChr m:val=")"/>
+                <m:sepChr m:val=""/>
+                <m:grow/>
+              </m:dPr>
+              <m:e>
+                <m:r>
+                  <m:t>S</m:t>
+                </m:r>
+              </m:e>
+            </m:d>
+          </m:e>
+        </m:d>
+        <m:r>
+          <m:rPr>
+            <m:sty m:val="p"/>
+          </m:rPr>
+          <m:t>=</m:t>
+        </m:r>
+        <m:acc>
+          <m:accPr>
+            <m:chr m:val="‾"/>
+          </m:accPr>
+          <m:e>
+            <m:r>
+              <m:t>R</m:t>
+            </m:r>
+          </m:e>
+        </m:acc>
+      </m:oMath>
+      <w:r>
+        <w:t xml:space="preserve">. A rational developer (</w:t>
+      </w:r>
+      <m:oMath>
+        <m:r>
+          <m:t>β</m:t>
+        </m:r>
+        <m:r>
+          <m:rPr>
+            <m:sty m:val="p"/>
+          </m:rPr>
+          <m:t>=</m:t>
+        </m:r>
+        <m:r>
+          <m:t>φ</m:t>
+        </m:r>
+        <m:r>
+          <m:rPr>
+            <m:sty m:val="p"/>
+          </m:rPr>
+          <m:t>=</m:t>
+        </m:r>
+        <m:r>
+          <m:t>λ</m:t>
+        </m:r>
+        <m:r>
+          <m:rPr>
+            <m:sty m:val="p"/>
+          </m:rPr>
+          <m:t>=</m:t>
+        </m:r>
+        <m:r>
+          <m:t>1</m:t>
+        </m:r>
+      </m:oMath>
+      <w:r>
+        <w:t xml:space="preserve">,</w:t>
+      </w:r>
+      <w:r>
+        <w:t xml:space="preserve"> </w:t>
+      </w:r>
+      <m:oMath>
+        <m:r>
+          <m:t>α</m:t>
+        </m:r>
+        <m:r>
+          <m:rPr>
+            <m:sty m:val="p"/>
+          </m:rPr>
+          <m:t>=</m:t>
+        </m:r>
+        <m:r>
+          <m:t>0</m:t>
+        </m:r>
+      </m:oMath>
+      <w:r>
+        <w:t xml:space="preserve">) improves the code if and only if</w:t>
+      </w:r>
+      <w:r>
+        <w:t xml:space="preserve"> </w:t>
+      </w:r>
+      <m:oMath>
+        <m:r>
+          <m:t>t</m:t>
+        </m:r>
+        <m:r>
+          <m:rPr>
+            <m:sty m:val="p"/>
+          </m:rPr>
+          <m:t>&lt;</m:t>
+        </m:r>
+        <m:r>
+          <m:t>m</m:t>
+        </m:r>
+      </m:oMath>
+      <w:r>
+        <w:t xml:space="preserve">, where</w:t>
+      </w:r>
+      <w:r>
+        <w:t xml:space="preserve"> </w:t>
+      </w:r>
+      <m:oMath>
+        <m:r>
+          <m:t>t</m:t>
+        </m:r>
+        <m:r>
+          <m:rPr>
+            <m:sty m:val="p"/>
+          </m:rPr>
+          <m:t>≡</m:t>
+        </m:r>
+        <m:r>
+          <m:t>v</m:t>
+        </m:r>
+        <m:r>
+          <m:t>c</m:t>
+        </m:r>
+        <m:r>
+          <m:rPr>
+            <m:sty m:val="p"/>
+          </m:rPr>
+          <m:t>/</m:t>
+        </m:r>
+        <m:r>
+          <m:t>δ</m:t>
+        </m:r>
+      </m:oMath>
+      <w:r>
+        <w:t xml:space="preserve"> </w:t>
+      </w:r>
+      <w:r>
+        <w:t xml:space="preserve">and</w:t>
+      </w:r>
+      <w:r>
+        <w:t xml:space="preserve"> </w:t>
+      </w:r>
+      <m:oMath>
+        <m:r>
+          <m:t>m</m:t>
+        </m:r>
+      </m:oMath>
+      <w:r>
+        <w:t xml:space="preserve"> </w:t>
+      </w:r>
+      <w:r>
+        <w:t xml:space="preserve">is her current posterior mean. For a given case, the</w:t>
+      </w:r>
+      <w:r>
+        <w:t xml:space="preserve"> </w:t>
+      </w:r>
+      <w:r>
+        <w:rPr>
+          <w:iCs/>
+          <w:i/>
+        </w:rPr>
+        <w:t xml:space="preserve">possession effect</w:t>
+      </w:r>
+      <w:r>
+        <w:t xml:space="preserve"> </w:t>
+      </w:r>
+      <w:r>
+        <w:t xml:space="preserve">is the probability of deferring after the artifact exists minus the probability of deferring ex ante.</w:t>
+      </w:r>
+    </w:p>
+    <w:p>
+      <w:pPr>
+        <w:pStyle w:val="BodyText"/>
+      </w:pPr>
+      <w:r>
+        <w:rPr>
+          <w:bCs/>
+          <w:b/>
+        </w:rPr>
+        <w:t xml:space="preserve">Result 9 (information and order).</w:t>
+      </w:r>
+      <w:r>
+        <w:t xml:space="preserve"> </w:t>
+      </w:r>
+      <w:r>
+        <w:t xml:space="preserve">(a) If the developer has the same information about</w:t>
+      </w:r>
+      <w:r>
+        <w:t xml:space="preserve"> </w:t>
+      </w:r>
+      <m:oMath>
+        <m:r>
+          <m:t>R</m:t>
+        </m:r>
+      </m:oMath>
+      <w:r>
+        <w:t xml:space="preserve"> </w:t>
+      </w:r>
+      <w:r>
+        <w:t xml:space="preserve">whenever she decides, in particular when</w:t>
+      </w:r>
+      <w:r>
+        <w:t xml:space="preserve"> </w:t>
+      </w:r>
+      <m:oMath>
+        <m:r>
+          <m:t>R</m:t>
+        </m:r>
+      </m:oMath>
+      <w:r>
+        <w:t xml:space="preserve"> </w:t>
+      </w:r>
+      <w:r>
+        <w:t xml:space="preserve">is stated, the rational thresholds coincide across orderings: the possession effect and the lapse rate are zero. (b) Otherwise, in a case with</w:t>
+      </w:r>
+      <w:r>
+        <w:t xml:space="preserve"> </w:t>
+      </w:r>
+      <m:oMath>
+        <m:acc>
+          <m:accPr>
+            <m:chr m:val="‾"/>
+          </m:accPr>
+          <m:e>
+            <m:r>
+              <m:t>R</m:t>
+            </m:r>
+          </m:e>
+        </m:acc>
+        <m:r>
+          <m:rPr>
+            <m:sty m:val="p"/>
+          </m:rPr>
+          <m:t>&gt;</m:t>
+        </m:r>
+        <m:r>
+          <m:t>t</m:t>
+        </m:r>
+      </m:oMath>
+      <w:r>
+        <w:t xml:space="preserve">, so that improvement is warranted ex ante, the rational possession effect equals</w:t>
+      </w:r>
+      <w:r>
+        <w:t xml:space="preserve"> </w:t>
+      </w:r>
+      <m:oMath>
+        <m:r>
+          <m:rPr>
+            <m:sty m:val="p"/>
+          </m:rPr>
+          <m:t>Pr</m:t>
+        </m:r>
+        <m:d>
+          <m:dPr>
+            <m:begChr m:val="("/>
+            <m:endChr m:val=")"/>
+            <m:sepChr m:val=""/>
+            <m:grow/>
+          </m:dPr>
+          <m:e>
+            <m:r>
+              <m:t>m</m:t>
+            </m:r>
+            <m:d>
+              <m:dPr>
+                <m:begChr m:val="("/>
+                <m:endChr m:val=")"/>
+                <m:sepChr m:val=""/>
+                <m:grow/>
+              </m:dPr>
+              <m:e>
+                <m:r>
+                  <m:t>S</m:t>
+                </m:r>
+              </m:e>
+            </m:d>
+            <m:r>
+              <m:rPr>
+                <m:sty m:val="p"/>
+              </m:rPr>
+              <m:t>≤</m:t>
+            </m:r>
+            <m:r>
+              <m:t>t</m:t>
+            </m:r>
+          </m:e>
+        </m:d>
+      </m:oMath>
+      <w:r>
+        <w:t xml:space="preserve">. It is bounded by</w:t>
+      </w:r>
+      <w:r>
+        <w:t xml:space="preserve"> </w:t>
+      </w:r>
+      <m:oMath>
+        <m:r>
+          <m:t>V</m:t>
+        </m:r>
+        <m:r>
+          <m:rPr>
+            <m:sty m:val="p"/>
+          </m:rPr>
+          <m:t>/</m:t>
+        </m:r>
+        <m:d>
+          <m:dPr>
+            <m:begChr m:val="["/>
+            <m:endChr m:val="]"/>
+            <m:sepChr m:val=""/>
+            <m:grow/>
+          </m:dPr>
+          <m:e>
+            <m:r>
+              <m:t>V</m:t>
+            </m:r>
+            <m:r>
+              <m:rPr>
+                <m:sty m:val="p"/>
+              </m:rPr>
+              <m:t>+</m:t>
+            </m:r>
+            <m:sSup>
+              <m:e>
+                <m:d>
+                  <m:dPr>
+                    <m:begChr m:val="("/>
+                    <m:endChr m:val=")"/>
+                    <m:sepChr m:val=""/>
+                    <m:grow/>
+                  </m:dPr>
+                  <m:e>
+                    <m:acc>
+                      <m:accPr>
+                        <m:chr m:val="‾"/>
+                      </m:accPr>
+                      <m:e>
+                        <m:r>
+                          <m:t>R</m:t>
+                        </m:r>
+                      </m:e>
+                    </m:acc>
+                    <m:r>
+                      <m:rPr>
+                        <m:sty m:val="p"/>
+                      </m:rPr>
+                      <m:t>−</m:t>
+                    </m:r>
+                    <m:r>
+                      <m:t>t</m:t>
+                    </m:r>
+                  </m:e>
+                </m:d>
+              </m:e>
+              <m:sup>
+                <m:r>
+                  <m:t>2</m:t>
+                </m:r>
+              </m:sup>
+            </m:sSup>
+          </m:e>
+        </m:d>
+      </m:oMath>
+      <w:r>
+        <w:t xml:space="preserve"> </w:t>
+      </w:r>
+      <w:r>
+        <w:t xml:space="preserve">with</w:t>
+      </w:r>
+      <w:r>
+        <w:t xml:space="preserve"> </w:t>
+      </w:r>
+      <m:oMath>
+        <m:r>
+          <m:t>V</m:t>
+        </m:r>
+        <m:r>
+          <m:rPr>
+            <m:sty m:val="p"/>
+          </m:rPr>
+          <m:t>=</m:t>
+        </m:r>
+        <m:r>
+          <m:rPr>
+            <m:sty m:val="p"/>
+          </m:rPr>
+          <m:t>V</m:t>
+        </m:r>
+        <m:r>
+          <m:rPr>
+            <m:sty m:val="p"/>
+          </m:rPr>
+          <m:t>a</m:t>
+        </m:r>
+        <m:r>
+          <m:rPr>
+            <m:sty m:val="p"/>
+          </m:rPr>
+          <m:t>r</m:t>
+        </m:r>
+        <m:d>
+          <m:dPr>
+            <m:begChr m:val="("/>
+            <m:endChr m:val=")"/>
+            <m:sepChr m:val=""/>
+            <m:grow/>
+          </m:dPr>
+          <m:e>
+            <m:r>
+              <m:t>m</m:t>
+            </m:r>
+            <m:d>
+              <m:dPr>
+                <m:begChr m:val="("/>
+                <m:endChr m:val=")"/>
+                <m:sepChr m:val=""/>
+                <m:grow/>
+              </m:dPr>
+              <m:e>
+                <m:r>
+                  <m:t>S</m:t>
+                </m:r>
+              </m:e>
+            </m:d>
+          </m:e>
+        </m:d>
+        <m:r>
+          <m:rPr>
+            <m:sty m:val="p"/>
+          </m:rPr>
+          <m:t>≤</m:t>
+        </m:r>
+        <m:r>
+          <m:rPr>
+            <m:sty m:val="p"/>
+          </m:rPr>
+          <m:t>V</m:t>
+        </m:r>
+        <m:r>
+          <m:rPr>
+            <m:sty m:val="p"/>
+          </m:rPr>
+          <m:t>a</m:t>
+        </m:r>
+        <m:r>
+          <m:rPr>
+            <m:sty m:val="p"/>
+          </m:rPr>
+          <m:t>r</m:t>
+        </m:r>
+        <m:d>
+          <m:dPr>
+            <m:begChr m:val="("/>
+            <m:endChr m:val=")"/>
+            <m:sepChr m:val=""/>
+            <m:grow/>
+          </m:dPr>
+          <m:e>
+            <m:r>
+              <m:t>R</m:t>
+            </m:r>
+          </m:e>
+        </m:d>
+      </m:oMath>
+      <w:r>
+        <w:t xml:space="preserve">, and it vanishes as the signal becomes uninformative. In a case with</w:t>
+      </w:r>
+      <w:r>
+        <w:t xml:space="preserve"> </w:t>
+      </w:r>
+      <m:oMath>
+        <m:acc>
+          <m:accPr>
+            <m:chr m:val="‾"/>
+          </m:accPr>
+          <m:e>
+            <m:r>
+              <m:t>R</m:t>
+            </m:r>
+          </m:e>
+        </m:acc>
+        <m:r>
+          <m:rPr>
+            <m:sty m:val="p"/>
+          </m:rPr>
+          <m:t>≤</m:t>
+        </m:r>
+        <m:r>
+          <m:t>t</m:t>
+        </m:r>
+      </m:oMath>
+      <w:r>
+        <w:t xml:space="preserve"> </w:t>
+      </w:r>
+      <w:r>
+        <w:t xml:space="preserve">it is nonpositive. (c) For a developer with the same information and wedges</w:t>
+      </w:r>
+      <w:r>
+        <w:t xml:space="preserve"> </w:t>
+      </w:r>
+      <m:oMath>
+        <m:r>
+          <m:t>β</m:t>
+        </m:r>
+        <m:r>
+          <m:rPr>
+            <m:sty m:val="p"/>
+          </m:rPr>
+          <m:t>&lt;</m:t>
+        </m:r>
+        <m:r>
+          <m:t>1</m:t>
+        </m:r>
+      </m:oMath>
+      <w:r>
+        <w:t xml:space="preserve"> </w:t>
+      </w:r>
+      <w:r>
+        <w:t xml:space="preserve">and</w:t>
+      </w:r>
+      <w:r>
+        <w:t xml:space="preserve"> </w:t>
+      </w:r>
+      <m:oMath>
+        <m:r>
+          <m:t>λ</m:t>
+        </m:r>
+        <m:r>
+          <m:rPr>
+            <m:sty m:val="p"/>
+          </m:rPr>
+          <m:t>&gt;</m:t>
+        </m:r>
+        <m:r>
+          <m:t>1</m:t>
+        </m:r>
+      </m:oMath>
+      <w:r>
+        <w:t xml:space="preserve">, the possession effect in a case with</w:t>
+      </w:r>
+      <w:r>
+        <w:t xml:space="preserve"> </w:t>
+      </w:r>
+      <m:oMath>
+        <m:acc>
+          <m:accPr>
+            <m:chr m:val="‾"/>
+          </m:accPr>
+          <m:e>
+            <m:r>
+              <m:t>R</m:t>
+            </m:r>
+          </m:e>
+        </m:acc>
+        <m:r>
+          <m:rPr>
+            <m:sty m:val="p"/>
+          </m:rPr>
+          <m:t>&gt;</m:t>
+        </m:r>
+        <m:r>
+          <m:t>t</m:t>
+        </m:r>
+      </m:oMath>
+      <w:r>
+        <w:t xml:space="preserve"> </w:t>
+      </w:r>
+      <w:r>
+        <w:t xml:space="preserve">is</w:t>
+      </w:r>
+      <w:r>
+        <w:t xml:space="preserve"> </w:t>
+      </w:r>
+      <m:oMath>
+        <m:r>
+          <m:rPr>
+            <m:sty m:val="p"/>
+          </m:rPr>
+          <m:t>Pr</m:t>
+        </m:r>
+        <m:d>
+          <m:dPr>
+            <m:begChr m:val="("/>
+            <m:endChr m:val=")"/>
+            <m:sepChr m:val=""/>
+            <m:grow/>
+          </m:dPr>
+          <m:e>
+            <m:r>
+              <m:t>m</m:t>
+            </m:r>
+            <m:d>
+              <m:dPr>
+                <m:begChr m:val="("/>
+                <m:endChr m:val=")"/>
+                <m:sepChr m:val=""/>
+                <m:grow/>
+              </m:dPr>
+              <m:e>
+                <m:r>
+                  <m:t>S</m:t>
+                </m:r>
+              </m:e>
+            </m:d>
+            <m:r>
+              <m:rPr>
+                <m:sty m:val="p"/>
+              </m:rPr>
+              <m:t>≤</m:t>
+            </m:r>
+            <m:r>
+              <m:t>λ</m:t>
+            </m:r>
+            <m:r>
+              <m:t>t</m:t>
+            </m:r>
+            <m:r>
+              <m:rPr>
+                <m:sty m:val="p"/>
+              </m:rPr>
+              <m:t>/</m:t>
+            </m:r>
+            <m:r>
+              <m:t>β</m:t>
+            </m:r>
+          </m:e>
+        </m:d>
+      </m:oMath>
+      <w:r>
+        <w:t xml:space="preserve">, which exceeds the rational effect by</w:t>
+      </w:r>
+      <w:r>
+        <w:t xml:space="preserve"> </w:t>
+      </w:r>
+      <m:oMath>
+        <m:r>
+          <m:rPr>
+            <m:sty m:val="p"/>
+          </m:rPr>
+          <m:t>Pr</m:t>
+        </m:r>
+        <m:d>
+          <m:dPr>
+            <m:begChr m:val="("/>
+            <m:endChr m:val=")"/>
+            <m:sepChr m:val=""/>
+            <m:grow/>
+          </m:dPr>
+          <m:e>
+            <m:r>
+              <m:t>t</m:t>
+            </m:r>
+            <m:r>
+              <m:rPr>
+                <m:sty m:val="p"/>
+              </m:rPr>
+              <m:t>&lt;</m:t>
+            </m:r>
+            <m:r>
+              <m:t>m</m:t>
+            </m:r>
+            <m:d>
+              <m:dPr>
+                <m:begChr m:val="("/>
+                <m:endChr m:val=")"/>
+                <m:sepChr m:val=""/>
+                <m:grow/>
+              </m:dPr>
+              <m:e>
+                <m:r>
+                  <m:t>S</m:t>
+                </m:r>
+              </m:e>
+            </m:d>
+            <m:r>
+              <m:rPr>
+                <m:sty m:val="p"/>
+              </m:rPr>
+              <m:t>≤</m:t>
+            </m:r>
+            <m:r>
+              <m:t>λ</m:t>
+            </m:r>
+            <m:r>
+              <m:t>t</m:t>
+            </m:r>
+            <m:r>
+              <m:rPr>
+                <m:sty m:val="p"/>
+              </m:rPr>
+              <m:t>/</m:t>
+            </m:r>
+            <m:r>
+              <m:t>β</m:t>
+            </m:r>
+          </m:e>
+        </m:d>
+        <m:r>
+          <m:rPr>
+            <m:sty m:val="p"/>
+          </m:rPr>
+          <m:t>≥</m:t>
+        </m:r>
+        <m:r>
+          <m:t>0</m:t>
+        </m:r>
+      </m:oMath>
+      <w:r>
+        <w:t xml:space="preserve">.</w:t>
+      </w:r>
+    </w:p>
+    <w:p>
+      <w:pPr>
+        <w:pStyle w:val="BodyText"/>
+      </w:pPr>
+      <w:r>
+        <w:t xml:space="preserve">Information therefore produces order effects of a different kind from the wedges. The informational effect depends on the case: it is nonnegative where improvement is warranted ex ante and nonpositive where it is not, because information moves decisions toward indifference. It is bounded by the dispersion of the signal, and it disappears when the signal is uninformative. The wedge effect is a one-directional shift of the deferral threshold by the factor</w:t>
+      </w:r>
+      <w:r>
+        <w:t xml:space="preserve"> </w:t>
+      </w:r>
+      <m:oMath>
+        <m:r>
+          <m:t>λ</m:t>
+        </m:r>
+        <m:r>
+          <m:rPr>
+            <m:sty m:val="p"/>
+          </m:rPr>
+          <m:t>/</m:t>
+        </m:r>
+        <m:r>
+          <m:t>β</m:t>
+        </m:r>
+      </m:oMath>
+      <w:r>
+        <w:t xml:space="preserve"> </w:t>
+      </w:r>
+      <w:r>
+        <w:t xml:space="preserve">and does not depend on any signal. Two consequences follow. In an experiment that states</w:t>
+      </w:r>
+      <w:r>
+        <w:t xml:space="preserve"> </w:t>
+      </w:r>
+      <m:oMath>
+        <m:r>
+          <m:t>R</m:t>
+        </m:r>
+      </m:oMath>
+      <w:r>
+        <w:t xml:space="preserve"> </w:t>
+      </w:r>
+      <w:r>
+        <w:t xml:space="preserve">and the artifact’s quality, information is identical across orderings and part (a) applies, so any order effect cannot be informational. In field data, part (b) gives a way to bound the informational channel from the observed dispersion of rework costs across similar tasks: a possession effect in warranted cases that exceeds</w:t>
+      </w:r>
+      <w:r>
+        <w:t xml:space="preserve"> </w:t>
+      </w:r>
+      <m:oMath>
+        <m:r>
+          <m:rPr>
+            <m:sty m:val="p"/>
+          </m:rPr>
+          <m:t>V</m:t>
+        </m:r>
+        <m:r>
+          <m:rPr>
+            <m:sty m:val="p"/>
+          </m:rPr>
+          <m:t>a</m:t>
+        </m:r>
+        <m:r>
+          <m:rPr>
+            <m:sty m:val="p"/>
+          </m:rPr>
+          <m:t>r</m:t>
+        </m:r>
+        <m:d>
+          <m:dPr>
+            <m:begChr m:val="("/>
+            <m:endChr m:val=")"/>
+            <m:sepChr m:val=""/>
+            <m:grow/>
+          </m:dPr>
+          <m:e>
+            <m:r>
+              <m:t>R</m:t>
+            </m:r>
+          </m:e>
+        </m:d>
+        <m:r>
+          <m:rPr>
+            <m:sty m:val="p"/>
+          </m:rPr>
+          <m:t>/</m:t>
+        </m:r>
+        <m:d>
+          <m:dPr>
+            <m:begChr m:val="["/>
+            <m:endChr m:val="]"/>
+            <m:sepChr m:val=""/>
+            <m:grow/>
+          </m:dPr>
+          <m:e>
+            <m:r>
+              <m:rPr>
+                <m:sty m:val="p"/>
+              </m:rPr>
+              <m:t>V</m:t>
+            </m:r>
+            <m:r>
+              <m:rPr>
+                <m:sty m:val="p"/>
+              </m:rPr>
+              <m:t>a</m:t>
+            </m:r>
+            <m:r>
+              <m:rPr>
+                <m:sty m:val="p"/>
+              </m:rPr>
+              <m:t>r</m:t>
+            </m:r>
+            <m:d>
+              <m:dPr>
+                <m:begChr m:val="("/>
+                <m:endChr m:val=")"/>
+                <m:sepChr m:val=""/>
+                <m:grow/>
+              </m:dPr>
+              <m:e>
+                <m:r>
+                  <m:t>R</m:t>
+                </m:r>
+              </m:e>
+            </m:d>
+            <m:r>
+              <m:rPr>
+                <m:sty m:val="p"/>
+              </m:rPr>
+              <m:t>+</m:t>
+            </m:r>
+            <m:sSup>
+              <m:e>
+                <m:d>
+                  <m:dPr>
+                    <m:begChr m:val="("/>
+                    <m:endChr m:val=")"/>
+                    <m:sepChr m:val=""/>
+                    <m:grow/>
+                  </m:dPr>
+                  <m:e>
+                    <m:acc>
+                      <m:accPr>
+                        <m:chr m:val="‾"/>
+                      </m:accPr>
+                      <m:e>
+                        <m:r>
+                          <m:t>R</m:t>
+                        </m:r>
+                      </m:e>
+                    </m:acc>
+                    <m:r>
+                      <m:rPr>
+                        <m:sty m:val="p"/>
+                      </m:rPr>
+                      <m:t>−</m:t>
+                    </m:r>
+                    <m:r>
+                      <m:t>t</m:t>
+                    </m:r>
+                  </m:e>
+                </m:d>
+              </m:e>
+              <m:sup>
+                <m:r>
+                  <m:t>2</m:t>
+                </m:r>
+              </m:sup>
+            </m:sSup>
+          </m:e>
+        </m:d>
+      </m:oMath>
+      <w:r>
+        <w:t xml:space="preserve"> </w:t>
+      </w:r>
+      <w:r>
+        <w:t xml:space="preserve">cannot be explained by information alone.</w:t>
+      </w:r>
+    </w:p>
+    <w:bookmarkEnd w:id="37"/>
+    <w:bookmarkEnd w:id="38"/>
+    <w:bookmarkStart w:id="47" w:name="empirical-evidence"/>
+    <w:p>
+      <w:pPr>
+        <w:pStyle w:val="Heading1"/>
+      </w:pPr>
+      <w:r>
+        <w:t xml:space="preserve">5. Empirical Evidence</w:t>
+      </w:r>
+    </w:p>
+    <w:p>
+      <w:pPr>
+        <w:pStyle w:val="FirstParagraph"/>
+      </w:pPr>
+      <w:r>
         <w:t xml:space="preserve">The contribution of this paper is theoretical, and the theory is built to be tested. This section reports what public data can and cannot say about it. We make two points up front. The mechanisms (present bias, loss aversion, perception) are not directly observable in archival data, and aggregate outcomes cannot separate the behavioral account from rational acceleration (Result 2a). Archival data can therefore only be consistent or inconsistent with the theory’s predictions, not test its mechanisms. Section 5.4 describes the experiment that can.</w:t>
       </w:r>
     </w:p>
-    <w:bookmarkStart w:id="38" w:name="data-and-measures"/>
+    <w:bookmarkStart w:id="39" w:name="data-and-measures"/>
     <w:p>
       <w:pPr>
         <w:pStyle w:val="Heading2"/>
@@ -11821,8 +12885,8 @@
         <w:t xml:space="preserve">, with controls for log size, repository fixed effects, and standard errors clustered by repository. Our observation windows are 1 to 14 August, 1 to 14 September, and 15 to 28 September 2025 (GH Archive payloads after about October 2025 no longer carry pull-request size or author fields), and the samples comprise 431,043 agent and 2,525,598 human pull requests, of which 211,624 and 160,944, respectively, are in repositories with both types.</w:t>
       </w:r>
     </w:p>
-    <w:bookmarkEnd w:id="38"/>
-    <w:bookmarkStart w:id="39" w:name="net-addition-and-review-intensity-p5-p7"/>
+    <w:bookmarkEnd w:id="39"/>
+    <w:bookmarkStart w:id="40" w:name="net-addition-and-review-intensity-p5-p7"/>
     <w:p>
       <w:pPr>
         <w:pStyle w:val="Heading2"/>
@@ -12255,8 +13319,8 @@
         <w:t xml:space="preserve">likely to be reviewed, and this reflects Copilot, whose workflow has a human steer the agent through review comments, so that those comments measure iteration and not scrutiny. Excluding Copilot the difference vanishes. In team repositories excluding Copilot, where review is feasible, 37.8 percent of human pull requests receive a human review against 20.3 percent of agent pull requests, and within the same repository agent pull requests are 5.9 percentage points less likely to be reviewed (and 4.5 points less likely to be reviewed within 24 hours), with the same sign in each window (−5.9 to −8.0 points). The number of inline comments does not differ. P7 is therefore supported for the presence of review in settings where review is feasible, and not for the intensity of commenting; the team-repository agent sample is small (5,981 agent against 84,231 human pull requests).</w:t>
       </w:r>
     </w:p>
-    <w:bookmarkEnd w:id="39"/>
-    <w:bookmarkStart w:id="40" w:name="self-admitted-debt-markers-p4-partial"/>
+    <w:bookmarkEnd w:id="40"/>
+    <w:bookmarkStart w:id="41" w:name="self-admitted-debt-markers-p4-partial"/>
     <w:p>
       <w:pPr>
         <w:pStyle w:val="Heading2"/>
@@ -12578,8 +13642,8 @@
         <w:t xml:space="preserve">Agent-authored code carries fewer self-admitted markers than the human baseline and, at the same time, more of the signals that usually accompany unadmitted debt, so markers per smell instance are about one seventh of the human level. The pattern holds within cells of language and patch size, in new and in modified files, and in each component of the score. A second comparison uses pull requests in which both the agent’s account and a human committed code: in 2,429 such pull requests, human commits carry 0.59 markers per 1,000 added lines and agent commits 0.34 (difference 0.25, 95 percent CI 0.13 to 0.36), though the difference is not significant under a wider definition of markers. These results match the direction P4 predicts. They are exploratory for three reasons. The human baseline is older, and comment conventions and tooling have changed. It is also selected for clear commit messages, and its repositories are not selected on stars. And fewer markers could reflect less debt rather than less admission, which these data cannot separate.</w:t>
       </w:r>
     </w:p>
-    <w:bookmarkEnd w:id="40"/>
-    <w:bookmarkStart w:id="44" w:name="event-study-around-agent-adoption"/>
+    <w:bookmarkEnd w:id="41"/>
+    <w:bookmarkStart w:id="45" w:name="event-study-around-agent-adoption"/>
     <w:p>
       <w:pPr>
         <w:pStyle w:val="Heading2"/>
@@ -12899,18 +13963,18 @@
           <wp:inline>
             <wp:extent cx="5334000" cy="1173480"/>
             <wp:effectExtent b="0" l="0" r="0" t="0"/>
-            <wp:docPr descr="Event-study estimates by period relative to adoption. Points are estimated effects relative to not-yet-treated repositories; bars are 95 percent confidence intervals." title="" id="42" name="Picture"/>
+            <wp:docPr descr="Event-study estimates by period relative to adoption. Points are estimated effects relative to not-yet-treated repositories; bars are 95 percent confidence intervals." title="" id="43" name="Picture"/>
             <a:graphic>
               <a:graphicData uri="http://schemas.openxmlformats.org/drawingml/2006/picture">
                 <pic:pic>
                   <pic:nvPicPr>
-                    <pic:cNvPr descr="event_study.png" id="43" name="Picture"/>
+                    <pic:cNvPr descr="event_study.png" id="44" name="Picture"/>
                     <pic:cNvPicPr>
                       <a:picLocks noChangeArrowheads="1" noChangeAspect="1"/>
                     </pic:cNvPicPr>
                   </pic:nvPicPr>
                   <pic:blipFill>
-                    <a:blip r:embed="rId41"/>
+                    <a:blip r:embed="rId42"/>
                     <a:stretch>
                       <a:fillRect/>
                     </a:stretch>
@@ -12953,8 +14017,8 @@
         <w:t xml:space="preserve">Net addition rises modestly after adoption (about 9 percent, t = 2.1), mostly in the adoption period itself and not at all among human pull requests, so it reflects the agent pull requests and does not spill over to human work. We find no repository-level change in the share reviewed or in the share of refactoring-titled pull requests. The merge rate falls slightly, but its estimate has a significant positive lead two periods before adoption, so part of that decline may be a reversal. Pooled placebo estimates are close to zero, although individual leads are not uniformly clean. These results are weak evidence. Only one of the outcomes in Table 5 is significant at 5 percent, which would not survive a correction for multiple outcomes. The refactoring measure is a keyword match on pull-request titles. All repositories eventually adopt, so late adopters serve as controls and common shocks to adopters are not removed. Only one week per month is observed, and estimates several periods after adoption rest on few repositories. And, as Result 2(a) says, repository-level means are aggregates that cannot distinguish the accounts; the event study is consistent with the pull-request-level finding on net addition and adds no discriminating test.</w:t>
       </w:r>
     </w:p>
-    <w:bookmarkEnd w:id="44"/>
-    <w:bookmarkStart w:id="45" w:name="the-decisive-test-experimental-design"/>
+    <w:bookmarkEnd w:id="45"/>
+    <w:bookmarkStart w:id="46" w:name="the-decisive-test-experimental-design"/>
     <w:p>
       <w:pPr>
         <w:pStyle w:val="Heading2"/>
@@ -13146,7 +14210,7 @@
         <w:t xml:space="preserve"> </w:t>
       </w:r>
       <w:r>
-        <w:t xml:space="preserve">(acceptance versus choice, the possession effect), so the design recovers both parameters separately, while rational acceleration predicts all three differences are zero. The comparison of the choice and acceptance conditions is also the within-person test of the order-dependence implication (P12). To make costs real, one decision per participant is drawn at random and its stated minutes are deducted from a bonus. Simulations of the design, using the model’s own decision rule with realistic response noise and 15 percent random responders, show that a single session comparing choice and acceptance detects the possession effect with power above 0.85 at about 100 participants for moderate or mild effects, whereas separating</w:t>
+        <w:t xml:space="preserve">(acceptance versus choice, the possession effect), so the design recovers both parameters separately, while rational acceleration predicts all three differences are zero. The comparison of the choice and acceptance conditions is also the within-person test of the order-dependence implication (P12). Because the rework cost and the code are stated, the developer has the same information in every condition, so rational information cannot explain differences across conditions (Result 9a). To make costs real, one decision per participant is drawn at random and its stated minutes are deducted from a bonus. Simulations of the design, using the model’s own decision rule with realistic response noise and 15 percent random responders, show that a single session comparing choice and acceptance detects the possession effect with power above 0.85 at about 100 participants for moderate or mild effects, whereas separating</w:t>
       </w:r>
       <w:r>
         <w:t xml:space="preserve"> </w:t>
@@ -13177,9 +14241,9 @@
         <w:t xml:space="preserve">for mild effects requires about 240 completers across two sessions. A threat to identification, that participants ignore loss aversion when planning, is addressed by an additional condition in which the artifact is already in hand when the plan is made. A companion module crosses an authorship label with actual authorship and seeded defects to separate label-driven automation bias from the appearance wedge. The design is described here as a proposal; the experiment has not been run.</w:t>
       </w:r>
     </w:p>
-    <w:bookmarkEnd w:id="45"/>
     <w:bookmarkEnd w:id="46"/>
-    <w:bookmarkStart w:id="51" w:name="discussion"/>
+    <w:bookmarkEnd w:id="47"/>
+    <w:bookmarkStart w:id="52" w:name="discussion"/>
     <w:p>
       <w:pPr>
         <w:pStyle w:val="Heading1"/>
@@ -13188,7 +14252,7 @@
         <w:t xml:space="preserve">6. Discussion</w:t>
       </w:r>
     </w:p>
-    <w:bookmarkStart w:id="47" w:name="theoretical-contributions"/>
+    <w:bookmarkStart w:id="48" w:name="theoretical-contributions"/>
     <w:p>
       <w:pPr>
         <w:pStyle w:val="Heading2"/>
@@ -13221,8 +14285,8 @@
         <w:t xml:space="preserve">Third, the model yields results that the verbal argument cannot establish: that more reliable models can increase debt, that present bias can create debt traps with hysteresis, and that temporary inspection mandates can have permanent effects when complacency suppresses the evidence that would correct it. Each is a consequence of the frame shift and none arises under rational acceleration alone.</w:t>
       </w:r>
     </w:p>
-    <w:bookmarkEnd w:id="47"/>
-    <w:bookmarkStart w:id="48" w:name="implications-for-practice"/>
+    <w:bookmarkEnd w:id="48"/>
+    <w:bookmarkStart w:id="49" w:name="implications-for-practice"/>
     <w:p>
       <w:pPr>
         <w:pStyle w:val="Heading2"/>
@@ -13239,8 +14303,8 @@
         <w:t xml:space="preserve">The rational model’s prescriptions, such as debt registers, interest estimates, and repayment sprints, assume that debt is visible and will be repaid when the numbers justify it. Our mechanisms suggest they will underperform, because the debt is not recorded (P4) and repayment is deferred (P1, P2). Choice-architecture interventions target the mechanisms directly. Review defaults that set a floor on review time per changed line and require reviewers to name reusable code counter automation bias and duplication (P7, P10). Reporting net rather than added lines and surfacing unreferenced functions make retention the active choice (P5). Owner sign-off on cross-boundary changes and routing defects to change authors restore ownership and internalize moral hazard (P6, P9). Interfaces that present large suggestions as diffs to be reviewed counter default acceptance (P8), and pairing throughput metrics with maintainability metrics at the team level addresses metric targeting (P11). The model adds two prescriptions: organizations should control assistant configuration centrally and enforce it against unsanctioned tools (Results 6 and 7), and where developers perceive little risk in generated code, a temporary inspection mandate can have lasting effects (Result 8).</w:t>
       </w:r>
     </w:p>
-    <w:bookmarkEnd w:id="48"/>
-    <w:bookmarkStart w:id="49" w:name="limitations"/>
+    <w:bookmarkEnd w:id="49"/>
+    <w:bookmarkStart w:id="50" w:name="limitations"/>
     <w:p>
       <w:pPr>
         <w:pStyle w:val="Heading2"/>
@@ -13254,7 +14318,7 @@
         <w:pStyle w:val="FirstParagraph"/>
       </w:pPr>
       <w:r>
-        <w:t xml:space="preserve">The theory and model are developed here and only partly tested. The formal model is deliberately minimal: tasks are independent, inspection detects defects perfectly, and the debt-trap result relies on a particular form of interest on debt, so its results are statements about mechanisms rather than calibrated magnitudes. The closed forms of the strategic extension assume a constant rework cost and uniform inspection time, although the sign results hold more generally (Online Appendix). The extensions abstract from competition among the organizations that use the tools, and they model learning only about the defect rate, not about the heuristic component of fluency, which may resist statistical evidence.</w:t>
+        <w:t xml:space="preserve">The theory and model are developed here and only partly tested. The formal model is deliberately minimal: tasks are independent, inspection detects defects perfectly, and the debt-trap result relies on a particular form of interest on debt, so its results are statements about mechanisms rather than calibrated magnitudes. The closed forms of the strategic extension assume a constant rework cost and uniform inspection time, although the sign results hold more generally (Online Appendix). In field data the informational channel cannot be removed, and Result 9 bounds it but does not eliminate it. The extensions abstract from competition among the organizations that use the tools, and they model learning only about the defect rate, not about the heuristic component of fluency, which may resist statistical evidence.</w:t>
       </w:r>
     </w:p>
     <w:p>
@@ -13265,8 +14329,8 @@
         <w:t xml:space="preserve">The empirical evidence is exploratory. It is observational and cannot identify the mechanisms. Agent labels are noisy and likely understate usage, which biases estimates toward zero. Static-analysis measures of debt are proxies that may not track the debt developers experience, and our smell score is not an established measure. The event study has limited power and no never-treated group. The experiment that could test the mechanisms directly has been designed but not run, and its cover story may not fully reproduce field conditions in which reviewers know the tools their colleagues use. Finally, the theory is silent on model capability: a sufficiently capable model might produce code whose surface fluency is matched by its structure, in which case the fluency mechanism becomes harmless. The evidence to date, which finds structural degradation increasing with model capability (Zhu et al. 2026), suggests this point has not been reached, but the theory should be understood as conditional on the current gap between apparent and actual quality.</w:t>
       </w:r>
     </w:p>
-    <w:bookmarkEnd w:id="49"/>
-    <w:bookmarkStart w:id="50" w:name="future-research"/>
+    <w:bookmarkEnd w:id="50"/>
+    <w:bookmarkStart w:id="51" w:name="future-research"/>
     <w:p>
       <w:pPr>
         <w:pStyle w:val="Heading2"/>
@@ -13283,9 +14347,9 @@
         <w:t xml:space="preserve">Three extensions are natural. First, the theory could be applied to other generative-AI artifacts, such as documentation, infrastructure configuration, and analytics notebooks, where the same mechanisms plausibly operate but the debt has not been named. Second, the propositions could be tested at the level of the individual developer over time, asking whether biases attenuate with experience or, as some automation-bias research suggests, intensify as trust accumulates. Third, the choice-architecture interventions in Section 6.2 could be studied as field experiments, which would provide both a test of the mechanisms and direct evidence on remedies; the sign of such an intervention’s effect on maintenance cost is itself a test of the wedges.</w:t>
       </w:r>
     </w:p>
-    <w:bookmarkEnd w:id="50"/>
     <w:bookmarkEnd w:id="51"/>
-    <w:bookmarkStart w:id="52" w:name="conclusion"/>
+    <w:bookmarkEnd w:id="52"/>
+    <w:bookmarkStart w:id="53" w:name="conclusion"/>
     <w:p>
       <w:pPr>
         <w:pStyle w:val="Heading1"/>
@@ -13302,8 +14366,8 @@
         <w:t xml:space="preserve">LLM coding assistants have made code cheap to produce, and the first evidence suggests they have made systems more expensive to maintain. We have argued that the explanation lies in how LLM assistance restructures the decision: it places a working artifact in the developer’s hand before the quality decision is made, dresses shortcuts as finished work, makes acceptance the default and deletion a loss, and weakens the ownership that effort would confer. A rational response to cheaper code can also produce more debt; what distinguishes our account is that the debt it predicts is unrecorded, underreviewed, and unrepaid, and the statistics derived here can tell the two apart. Public repository data are consistent with part of this picture, in particular a bias toward adding rather than deleting and fewer self-admitted markers relative to other signals of debt, but they cannot yet test the mechanisms. The model adds two warnings: better models do not guarantee less debt, and a codebase that has tipped into a high-debt state will not be rescued by the nudges that would have prevented it. If the theory is correct, the remedy is not better accounting but better choice architecture.</w:t>
       </w:r>
     </w:p>
-    <w:bookmarkEnd w:id="52"/>
-    <w:bookmarkStart w:id="53" w:name="references"/>
+    <w:bookmarkEnd w:id="53"/>
+    <w:bookmarkStart w:id="54" w:name="references"/>
     <w:p>
       <w:pPr>
         <w:pStyle w:val="Heading1"/>
@@ -14408,8 +15472,8 @@
         <w:t xml:space="preserve">Zhu Y, Tsantalis N, Rigby PC (2026) AI-generated smells: An analysis of code and architecture in LLM and agent-driven development. Working paper, arXiv:2605.02741.</w:t>
       </w:r>
     </w:p>
-    <w:bookmarkEnd w:id="53"/>
-    <w:bookmarkStart w:id="54" w:name="appendix-a.-proofs"/>
+    <w:bookmarkEnd w:id="54"/>
+    <w:bookmarkStart w:id="55" w:name="appendix-a.-proofs"/>
     <w:p>
       <w:pPr>
         <w:pStyle w:val="Heading1"/>
@@ -18402,7 +19466,532 @@
         <w:t xml:space="preserve">.</w:t>
       </w:r>
     </w:p>
-    <w:bookmarkEnd w:id="54"/>
+    <w:p>
+      <w:pPr>
+        <w:pStyle w:val="BodyText"/>
+      </w:pPr>
+      <w:r>
+        <w:rPr>
+          <w:bCs/>
+          <w:b/>
+        </w:rPr>
+        <w:t xml:space="preserve">Result 9.</w:t>
+      </w:r>
+      <w:r>
+        <w:t xml:space="preserve"> </w:t>
+      </w:r>
+      <w:r>
+        <w:t xml:space="preserve">(a) The rational rule depends on the information available only through the posterior mean, so identical information gives identical decisions in every ordering. With a plan at date 0 and execution at date 1 on the same information, the plan and its execution coincide, so no plan lapses. (b) With</w:t>
+      </w:r>
+      <w:r>
+        <w:t xml:space="preserve"> </w:t>
+      </w:r>
+      <m:oMath>
+        <m:acc>
+          <m:accPr>
+            <m:chr m:val="‾"/>
+          </m:accPr>
+          <m:e>
+            <m:r>
+              <m:t>R</m:t>
+            </m:r>
+          </m:e>
+        </m:acc>
+        <m:r>
+          <m:rPr>
+            <m:sty m:val="p"/>
+          </m:rPr>
+          <m:t>&gt;</m:t>
+        </m:r>
+        <m:r>
+          <m:t>t</m:t>
+        </m:r>
+      </m:oMath>
+      <w:r>
+        <w:t xml:space="preserve"> </w:t>
+      </w:r>
+      <w:r>
+        <w:t xml:space="preserve">the ex ante decision is to improve, so ex ante deferral is zero and the possession effect is</w:t>
+      </w:r>
+      <w:r>
+        <w:t xml:space="preserve"> </w:t>
+      </w:r>
+      <m:oMath>
+        <m:r>
+          <m:rPr>
+            <m:sty m:val="p"/>
+          </m:rPr>
+          <m:t>Pr</m:t>
+        </m:r>
+        <m:d>
+          <m:dPr>
+            <m:begChr m:val="("/>
+            <m:endChr m:val=")"/>
+            <m:sepChr m:val=""/>
+            <m:grow/>
+          </m:dPr>
+          <m:e>
+            <m:r>
+              <m:t>m</m:t>
+            </m:r>
+            <m:d>
+              <m:dPr>
+                <m:begChr m:val="("/>
+                <m:endChr m:val=")"/>
+                <m:sepChr m:val=""/>
+                <m:grow/>
+              </m:dPr>
+              <m:e>
+                <m:r>
+                  <m:t>S</m:t>
+                </m:r>
+              </m:e>
+            </m:d>
+            <m:r>
+              <m:rPr>
+                <m:sty m:val="p"/>
+              </m:rPr>
+              <m:t>≤</m:t>
+            </m:r>
+            <m:r>
+              <m:t>t</m:t>
+            </m:r>
+          </m:e>
+        </m:d>
+      </m:oMath>
+      <w:r>
+        <w:t xml:space="preserve">. Cantelli’s inequality for a variable with mean</w:t>
+      </w:r>
+      <w:r>
+        <w:t xml:space="preserve"> </w:t>
+      </w:r>
+      <m:oMath>
+        <m:acc>
+          <m:accPr>
+            <m:chr m:val="‾"/>
+          </m:accPr>
+          <m:e>
+            <m:r>
+              <m:t>R</m:t>
+            </m:r>
+          </m:e>
+        </m:acc>
+      </m:oMath>
+      <w:r>
+        <w:t xml:space="preserve"> </w:t>
+      </w:r>
+      <w:r>
+        <w:t xml:space="preserve">and variance</w:t>
+      </w:r>
+      <w:r>
+        <w:t xml:space="preserve"> </w:t>
+      </w:r>
+      <m:oMath>
+        <m:r>
+          <m:t>V</m:t>
+        </m:r>
+      </m:oMath>
+      <w:r>
+        <w:t xml:space="preserve"> </w:t>
+      </w:r>
+      <w:r>
+        <w:t xml:space="preserve">gives</w:t>
+      </w:r>
+      <w:r>
+        <w:t xml:space="preserve"> </w:t>
+      </w:r>
+      <m:oMath>
+        <m:r>
+          <m:rPr>
+            <m:sty m:val="p"/>
+          </m:rPr>
+          <m:t>Pr</m:t>
+        </m:r>
+        <m:d>
+          <m:dPr>
+            <m:begChr m:val="("/>
+            <m:endChr m:val=")"/>
+            <m:sepChr m:val=""/>
+            <m:grow/>
+          </m:dPr>
+          <m:e>
+            <m:r>
+              <m:t>m</m:t>
+            </m:r>
+            <m:r>
+              <m:rPr>
+                <m:sty m:val="p"/>
+              </m:rPr>
+              <m:t>≤</m:t>
+            </m:r>
+            <m:acc>
+              <m:accPr>
+                <m:chr m:val="‾"/>
+              </m:accPr>
+              <m:e>
+                <m:r>
+                  <m:t>R</m:t>
+                </m:r>
+              </m:e>
+            </m:acc>
+            <m:r>
+              <m:rPr>
+                <m:sty m:val="p"/>
+              </m:rPr>
+              <m:t>−</m:t>
+            </m:r>
+            <m:r>
+              <m:t>a</m:t>
+            </m:r>
+          </m:e>
+        </m:d>
+        <m:r>
+          <m:rPr>
+            <m:sty m:val="p"/>
+          </m:rPr>
+          <m:t>≤</m:t>
+        </m:r>
+        <m:r>
+          <m:t>V</m:t>
+        </m:r>
+        <m:r>
+          <m:rPr>
+            <m:sty m:val="p"/>
+          </m:rPr>
+          <m:t>/</m:t>
+        </m:r>
+        <m:d>
+          <m:dPr>
+            <m:begChr m:val="("/>
+            <m:endChr m:val=")"/>
+            <m:sepChr m:val=""/>
+            <m:grow/>
+          </m:dPr>
+          <m:e>
+            <m:r>
+              <m:t>V</m:t>
+            </m:r>
+            <m:r>
+              <m:rPr>
+                <m:sty m:val="p"/>
+              </m:rPr>
+              <m:t>+</m:t>
+            </m:r>
+            <m:sSup>
+              <m:e>
+                <m:r>
+                  <m:t>a</m:t>
+                </m:r>
+              </m:e>
+              <m:sup>
+                <m:r>
+                  <m:t>2</m:t>
+                </m:r>
+              </m:sup>
+            </m:sSup>
+          </m:e>
+        </m:d>
+      </m:oMath>
+      <w:r>
+        <w:t xml:space="preserve"> </w:t>
+      </w:r>
+      <w:r>
+        <w:t xml:space="preserve">with</w:t>
+      </w:r>
+      <w:r>
+        <w:t xml:space="preserve"> </w:t>
+      </w:r>
+      <m:oMath>
+        <m:r>
+          <m:t>a</m:t>
+        </m:r>
+        <m:r>
+          <m:rPr>
+            <m:sty m:val="p"/>
+          </m:rPr>
+          <m:t>=</m:t>
+        </m:r>
+        <m:acc>
+          <m:accPr>
+            <m:chr m:val="‾"/>
+          </m:accPr>
+          <m:e>
+            <m:r>
+              <m:t>R</m:t>
+            </m:r>
+          </m:e>
+        </m:acc>
+        <m:r>
+          <m:rPr>
+            <m:sty m:val="p"/>
+          </m:rPr>
+          <m:t>−</m:t>
+        </m:r>
+        <m:r>
+          <m:t>t</m:t>
+        </m:r>
+        <m:r>
+          <m:rPr>
+            <m:sty m:val="p"/>
+          </m:rPr>
+          <m:t>&gt;</m:t>
+        </m:r>
+        <m:r>
+          <m:t>0</m:t>
+        </m:r>
+      </m:oMath>
+      <w:r>
+        <w:t xml:space="preserve">, and</w:t>
+      </w:r>
+      <w:r>
+        <w:t xml:space="preserve"> </w:t>
+      </w:r>
+      <m:oMath>
+        <m:r>
+          <m:t>V</m:t>
+        </m:r>
+        <m:r>
+          <m:rPr>
+            <m:sty m:val="p"/>
+          </m:rPr>
+          <m:t>≤</m:t>
+        </m:r>
+        <m:r>
+          <m:rPr>
+            <m:sty m:val="p"/>
+          </m:rPr>
+          <m:t>V</m:t>
+        </m:r>
+        <m:r>
+          <m:rPr>
+            <m:sty m:val="p"/>
+          </m:rPr>
+          <m:t>a</m:t>
+        </m:r>
+        <m:r>
+          <m:rPr>
+            <m:sty m:val="p"/>
+          </m:rPr>
+          <m:t>r</m:t>
+        </m:r>
+        <m:d>
+          <m:dPr>
+            <m:begChr m:val="("/>
+            <m:endChr m:val=")"/>
+            <m:sepChr m:val=""/>
+            <m:grow/>
+          </m:dPr>
+          <m:e>
+            <m:r>
+              <m:t>R</m:t>
+            </m:r>
+          </m:e>
+        </m:d>
+      </m:oMath>
+      <w:r>
+        <w:t xml:space="preserve"> </w:t>
+      </w:r>
+      <w:r>
+        <w:t xml:space="preserve">by the law of total variance. If</w:t>
+      </w:r>
+      <w:r>
+        <w:t xml:space="preserve"> </w:t>
+      </w:r>
+      <m:oMath>
+        <m:acc>
+          <m:accPr>
+            <m:chr m:val="‾"/>
+          </m:accPr>
+          <m:e>
+            <m:r>
+              <m:t>R</m:t>
+            </m:r>
+          </m:e>
+        </m:acc>
+        <m:r>
+          <m:rPr>
+            <m:sty m:val="p"/>
+          </m:rPr>
+          <m:t>≤</m:t>
+        </m:r>
+        <m:r>
+          <m:t>t</m:t>
+        </m:r>
+      </m:oMath>
+      <w:r>
+        <w:t xml:space="preserve">, ex ante deferral is one and the post-generation probability cannot exceed one. If the signal is uninformative,</w:t>
+      </w:r>
+      <w:r>
+        <w:t xml:space="preserve"> </w:t>
+      </w:r>
+      <m:oMath>
+        <m:r>
+          <m:t>m</m:t>
+        </m:r>
+        <m:d>
+          <m:dPr>
+            <m:begChr m:val="("/>
+            <m:endChr m:val=")"/>
+            <m:sepChr m:val=""/>
+            <m:grow/>
+          </m:dPr>
+          <m:e>
+            <m:r>
+              <m:t>S</m:t>
+            </m:r>
+          </m:e>
+        </m:d>
+        <m:r>
+          <m:rPr>
+            <m:sty m:val="p"/>
+          </m:rPr>
+          <m:t>=</m:t>
+        </m:r>
+        <m:acc>
+          <m:accPr>
+            <m:chr m:val="‾"/>
+          </m:accPr>
+          <m:e>
+            <m:r>
+              <m:t>R</m:t>
+            </m:r>
+          </m:e>
+        </m:acc>
+        <m:r>
+          <m:rPr>
+            <m:sty m:val="p"/>
+          </m:rPr>
+          <m:t>&gt;</m:t>
+        </m:r>
+        <m:r>
+          <m:t>t</m:t>
+        </m:r>
+      </m:oMath>
+      <w:r>
+        <w:t xml:space="preserve"> </w:t>
+      </w:r>
+      <w:r>
+        <w:t xml:space="preserve">almost surely and the effect is zero. (c) The ex ante rule (1) does not involve</w:t>
+      </w:r>
+      <w:r>
+        <w:t xml:space="preserve"> </w:t>
+      </w:r>
+      <m:oMath>
+        <m:r>
+          <m:t>β</m:t>
+        </m:r>
+      </m:oMath>
+      <w:r>
+        <w:t xml:space="preserve"> </w:t>
+      </w:r>
+      <w:r>
+        <w:t xml:space="preserve">or</w:t>
+      </w:r>
+      <w:r>
+        <w:t xml:space="preserve"> </w:t>
+      </w:r>
+      <m:oMath>
+        <m:r>
+          <m:t>λ</m:t>
+        </m:r>
+      </m:oMath>
+      <w:r>
+        <w:t xml:space="preserve">, so ex ante deferral is again zero; after generation she defers when</w:t>
+      </w:r>
+      <w:r>
+        <w:t xml:space="preserve"> </w:t>
+      </w:r>
+      <m:oMath>
+        <m:r>
+          <m:t>m</m:t>
+        </m:r>
+        <m:d>
+          <m:dPr>
+            <m:begChr m:val="("/>
+            <m:endChr m:val=")"/>
+            <m:sepChr m:val=""/>
+            <m:grow/>
+          </m:dPr>
+          <m:e>
+            <m:r>
+              <m:t>S</m:t>
+            </m:r>
+          </m:e>
+        </m:d>
+        <m:r>
+          <m:rPr>
+            <m:sty m:val="p"/>
+          </m:rPr>
+          <m:t>≤</m:t>
+        </m:r>
+        <m:r>
+          <m:t>λ</m:t>
+        </m:r>
+        <m:r>
+          <m:t>t</m:t>
+        </m:r>
+        <m:r>
+          <m:rPr>
+            <m:sty m:val="p"/>
+          </m:rPr>
+          <m:t>/</m:t>
+        </m:r>
+        <m:r>
+          <m:t>β</m:t>
+        </m:r>
+      </m:oMath>
+      <w:r>
+        <w:t xml:space="preserve"> </w:t>
+      </w:r>
+      <w:r>
+        <w:t xml:space="preserve">by the analogue of (2), and the difference from the rational effect is the probability of the interval</w:t>
+      </w:r>
+      <w:r>
+        <w:t xml:space="preserve"> </w:t>
+      </w:r>
+      <m:oMath>
+        <m:r>
+          <m:rPr>
+            <m:sty m:val="p"/>
+          </m:rPr>
+          <m:t>(</m:t>
+        </m:r>
+        <m:r>
+          <m:t>t</m:t>
+        </m:r>
+        <m:r>
+          <m:rPr>
+            <m:sty m:val="p"/>
+          </m:rPr>
+          <m:t>,</m:t>
+        </m:r>
+        <m:r>
+          <m:t>λ</m:t>
+        </m:r>
+        <m:r>
+          <m:t>t</m:t>
+        </m:r>
+        <m:r>
+          <m:rPr>
+            <m:sty m:val="p"/>
+          </m:rPr>
+          <m:t>/</m:t>
+        </m:r>
+        <m:r>
+          <m:t>β</m:t>
+        </m:r>
+        <m:r>
+          <m:rPr>
+            <m:sty m:val="p"/>
+          </m:rPr>
+          <m:t>]</m:t>
+        </m:r>
+      </m:oMath>
+      <w:r>
+        <w:t xml:space="preserve">.</w:t>
+      </w:r>
+    </w:p>
+    <w:bookmarkEnd w:id="55"/>
     <w:sectPr>
       <w:footerReference w:type="default" r:id="rId9"/>
       <w:pgMar w:bottom="1440" w:left="1440" w:right="1440" w:top="1440"/>

</xml_diff>

<commit_message>
Add Online Appendix (proofs of Results 4, 8; general forms of Results 5-7; data construction; additional results; experimental protocol) with numerical checks
Co-Authored-By: Claude Sonnet 5.5 <noreply@anthropic.com>
Claude-Session: https://claude.ai/code/session_018rhUQGpSb53LbsAUNxAKLi
</commit_message>
<xml_diff>
--- a/manuscript_revision/manuscript/manuscript_misq.docx
+++ b/manuscript_revision/manuscript/manuscript_misq.docx
@@ -784,7 +784,7 @@
         <w:pStyle w:val="BodyText"/>
       </w:pPr>
       <w:r>
-        <w:t xml:space="preserve">Table 1 lists the mechanisms and the twelve propositions they imply. The propositions are the empirical hypotheses of the verbal theory; Section 4 formalizes the timing, appearance, and possession mechanisms at the level of a single decision, and the Online Appendix carries the ownership and incentive mechanisms to teams.</w:t>
+        <w:t xml:space="preserve">Table 1 lists the mechanisms and the twelve propositions they imply. The propositions are the empirical hypotheses of the verbal theory; Section 4 formalizes the timing, appearance, and possession mechanisms at the level of a single decision, and the ownership and incentive mechanisms (P6 and P9 to P11) are stated as hypotheses and are not formalized in this paper.</w:t>
       </w:r>
     </w:p>
     <w:p>
@@ -1904,7 +1904,7 @@
         <w:pStyle w:val="FirstParagraph"/>
       </w:pPr>
       <w:r>
-        <w:t xml:space="preserve">This section formalizes the frame shift. It states the developer’s decision problem as a utility-maximization problem under each regime (Sections 4.1 to 4.3), extends it to debt dynamics and learning (4.5), embeds the developer in a game with a tool vendor and her organization (4.6), and asks how far rational information can explain order dependence (4.7). Proofs of Results 1 to 3, 5 to 7, and 9 are in Appendix A; proofs of Results 4 and 8 are in the Online Appendix. Every closed form was also checked against a brute-force evaluation of the problem it solves.</w:t>
+        <w:t xml:space="preserve">This section formalizes the frame shift. It states the developer’s decision problem as a utility-maximization problem under each regime (Sections 4.1 to 4.3), extends it to debt dynamics and learning (4.5), embeds the developer in a game with a tool vendor and her organization (4.6), and asks how far rational information can explain order dependence (4.7). Proofs of Results 1 to 3, 5 to 7, and 9 are in Appendix A; proofs of Results 4 and 8 are in Online Appendix OA1 and OA2. Every closed form was also checked against a brute-force evaluation of the problem it solves.</w:t>
       </w:r>
     </w:p>
     <w:bookmarkStart w:id="31" w:name="environment"/>
@@ -12714,7 +12714,7 @@
         <w:pStyle w:val="FirstParagraph"/>
       </w:pPr>
       <w:r>
-        <w:t xml:space="preserve">The contribution of this paper is theoretical, and the theory is built to be tested. This section reports what public data can and cannot say about it. We make two points up front. The mechanisms (present bias, loss aversion, perception) are not directly observable in archival data, and aggregate outcomes cannot separate the behavioral account from rational acceleration (Result 2a). Archival data can therefore only be consistent or inconsistent with the theory’s predictions, not test its mechanisms. Section 5.4 describes the experiment that can.</w:t>
+        <w:t xml:space="preserve">The contribution of this paper is theoretical, and the theory is built to be tested. This section reports what public data can and cannot say about it. We make two points up front. The mechanisms (present bias, loss aversion, perception) are not directly observable in archival data, and aggregate outcomes cannot separate the behavioral account from rational acceleration (Result 2a). Archival data can therefore only be consistent or inconsistent with the theory’s predictions, not test its mechanisms. Section 5.4 describes the experiment that can. The construction of the data and additional results are in Online Appendix OA5 to OA8.</w:t>
       </w:r>
     </w:p>
     <w:bookmarkStart w:id="39" w:name="data-and-measures"/>
@@ -14238,7 +14238,7 @@
         <w:t xml:space="preserve"> </w:t>
       </w:r>
       <w:r>
-        <w:t xml:space="preserve">for mild effects requires about 240 completers across two sessions. A threat to identification, that participants ignore loss aversion when planning, is addressed by an additional condition in which the artifact is already in hand when the plan is made. A companion module crosses an authorship label with actual authorship and seeded defects to separate label-driven automation bias from the appearance wedge. The design is described here as a proposal; the experiment has not been run.</w:t>
+        <w:t xml:space="preserve">for mild effects requires about 240 completers across two sessions. A threat to identification, that participants ignore loss aversion when planning, is addressed by an additional condition in which the artifact is already in hand when the plan is made. A companion module crosses an authorship label with actual authorship and seeded defects to separate label-driven automation bias from the appearance wedge. The design is described here as a proposal; the experiment has not been run. The full protocol and its simulated power are in Online Appendix OA9.</w:t>
       </w:r>
     </w:p>
     <w:bookmarkEnd w:id="46"/>
@@ -14318,7 +14318,7 @@
         <w:pStyle w:val="FirstParagraph"/>
       </w:pPr>
       <w:r>
-        <w:t xml:space="preserve">The theory and model are developed here and only partly tested. The formal model is deliberately minimal: tasks are independent, inspection detects defects perfectly, and the debt-trap result relies on a particular form of interest on debt, so its results are statements about mechanisms rather than calibrated magnitudes. The closed forms of the strategic extension assume a constant rework cost and uniform inspection time, although the sign results hold more generally (Online Appendix). In field data the informational channel cannot be removed, and Result 9 bounds it but does not eliminate it. The extensions abstract from competition among the organizations that use the tools, and they model learning only about the defect rate, not about the heuristic component of fluency, which may resist statistical evidence.</w:t>
+        <w:t xml:space="preserve">The theory and model are developed here and only partly tested. The formal model is deliberately minimal: tasks are independent, inspection detects defects perfectly, and the debt-trap result relies on a particular form of interest on debt, so its results are statements about mechanisms rather than calibrated magnitudes. The closed forms of the strategic extension assume a constant rework cost and uniform inspection time, although the sign results hold more generally (Online Appendix OA3). In field data the informational channel cannot be removed, and Result 9 bounds it but does not eliminate it. The extensions abstract from competition among the organizations that use the tools, and they model learning only about the defect rate, not about the heuristic component of fluency, which may resist statistical evidence.</w:t>
       </w:r>
     </w:p>
     <w:p>

</xml_diff>

<commit_message>
Fix table formatting (column widths, rules, repeated headers), enlarge the event-study figure, set US Letter pages; add build script
Co-Authored-By: Claude Sonnet 5.5 <noreply@anthropic.com>
Claude-Session: https://claude.ai/code/session_018rhUQGpSb53LbsAUNxAKLi
</commit_message>
<xml_diff>
--- a/manuscript_revision/manuscript/manuscript_misq.docx
+++ b/manuscript_revision/manuscript/manuscript_misq.docx
@@ -790,6 +790,7 @@
     <w:p>
       <w:pPr>
         <w:pStyle w:val="BodyText"/>
+        <w:keepNext/>
       </w:pPr>
       <w:r>
         <w:rPr>
@@ -802,664 +803,1149 @@
     <w:tbl>
       <w:tblPr>
         <w:tblStyle w:val="Table"/>
-        <w:tblW w:type="pct" w:w="5000"/>
         <w:tblLook w:firstRow="1" w:lastRow="0" w:firstColumn="0" w:lastColumn="0" w:noHBand="0" w:noVBand="0" w:val="0020"/>
-        <w:jc w:val="start"/>
+        <w:tblW w:w="9360" w:type="dxa"/>
+        <w:jc w:val="center"/>
+        <w:tblLayout w:type="fixed"/>
+        <w:tblBorders>
+          <w:top w:val="single" w:sz="8" w:space="0" w:color="000000"/>
+          <w:bottom w:val="single" w:sz="8" w:space="0" w:color="000000"/>
+          <w:insideH w:val="single" w:sz="4" w:space="0" w:color="BFBFBF"/>
+          <w:left w:val="nil"/>
+          <w:right w:val="nil"/>
+          <w:insideV w:val="nil"/>
+        </w:tblBorders>
+        <w:tblCellMar>
+          <w:top w:w="40" w:type="dxa"/>
+          <w:left w:w="70" w:type="dxa"/>
+          <w:bottom w:w="40" w:type="dxa"/>
+          <w:right w:w="70" w:type="dxa"/>
+        </w:tblCellMar>
       </w:tblPr>
       <w:tblGrid>
-        <w:gridCol w:w="1980"/>
-        <w:gridCol w:w="1980"/>
-        <w:gridCol w:w="1980"/>
-        <w:gridCol w:w="1980"/>
+        <w:gridCol w:w="699"/>
+        <w:gridCol w:w="4799"/>
+        <w:gridCol w:w="2368"/>
+        <w:gridCol w:w="1494"/>
       </w:tblGrid>
       <w:tr>
         <w:trPr>
           <w:tblHeader w:val="true"/>
+          <w:cantSplit/>
+          <w:tblHeader/>
         </w:trPr>
         <w:tc>
-          <w:tcPr/>
+          <w:tcPr>
+            <w:tcW w:w="699" w:type="dxa"/>
+            <w:tcBorders>
+              <w:bottom w:val="single" w:sz="8" w:space="0" w:color="000000"/>
+            </w:tcBorders>
+          </w:tcPr>
           <w:p>
             <w:pPr>
               <w:pStyle w:val="Compact"/>
+              <w:spacing w:before="0" w:after="0" w:line="240" w:lineRule="auto"/>
+              <w:ind w:firstLine="0"/>
               <w:jc w:val="left"/>
             </w:pPr>
             <w:r>
+              <w:rPr>
+                <w:rFonts w:ascii="Times New Roman" w:hAnsi="Times New Roman"/>
+                <w:b/>
+                <w:sz w:val="20"/>
+              </w:rPr>
               <w:t xml:space="preserve">P</w:t>
             </w:r>
           </w:p>
         </w:tc>
         <w:tc>
-          <w:tcPr/>
+          <w:tcPr>
+            <w:tcW w:w="4799" w:type="dxa"/>
+            <w:tcBorders>
+              <w:bottom w:val="single" w:sz="8" w:space="0" w:color="000000"/>
+            </w:tcBorders>
+          </w:tcPr>
           <w:p>
             <w:pPr>
               <w:pStyle w:val="Compact"/>
+              <w:spacing w:before="0" w:after="0" w:line="240" w:lineRule="auto"/>
+              <w:ind w:firstLine="0"/>
               <w:jc w:val="left"/>
             </w:pPr>
             <w:r>
+              <w:rPr>
+                <w:rFonts w:ascii="Times New Roman" w:hAnsi="Times New Roman"/>
+                <w:b/>
+                <w:sz w:val="20"/>
+              </w:rPr>
               <w:t xml:space="preserve">Statement</w:t>
             </w:r>
           </w:p>
         </w:tc>
         <w:tc>
-          <w:tcPr/>
+          <w:tcPr>
+            <w:tcW w:w="2368" w:type="dxa"/>
+            <w:tcBorders>
+              <w:bottom w:val="single" w:sz="8" w:space="0" w:color="000000"/>
+            </w:tcBorders>
+          </w:tcPr>
           <w:p>
             <w:pPr>
               <w:pStyle w:val="Compact"/>
+              <w:spacing w:before="0" w:after="0" w:line="240" w:lineRule="auto"/>
+              <w:ind w:firstLine="0"/>
               <w:jc w:val="left"/>
             </w:pPr>
             <w:r>
+              <w:rPr>
+                <w:rFonts w:ascii="Times New Roman" w:hAnsi="Times New Roman"/>
+                <w:b/>
+                <w:sz w:val="20"/>
+              </w:rPr>
               <w:t xml:space="preserve">Mechanism</w:t>
             </w:r>
           </w:p>
         </w:tc>
         <w:tc>
-          <w:tcPr/>
+          <w:tcPr>
+            <w:tcW w:w="1494" w:type="dxa"/>
+            <w:tcBorders>
+              <w:bottom w:val="single" w:sz="8" w:space="0" w:color="000000"/>
+            </w:tcBorders>
+          </w:tcPr>
           <w:p>
             <w:pPr>
               <w:pStyle w:val="Compact"/>
+              <w:spacing w:before="0" w:after="0" w:line="240" w:lineRule="auto"/>
+              <w:ind w:firstLine="0"/>
               <w:jc w:val="left"/>
             </w:pPr>
             <w:r>
+              <w:rPr>
+                <w:rFonts w:ascii="Times New Roman" w:hAnsi="Times New Roman"/>
+                <w:b/>
+                <w:sz w:val="20"/>
+              </w:rPr>
               <w:t xml:space="preserve">Component</w:t>
             </w:r>
           </w:p>
         </w:tc>
       </w:tr>
       <w:tr>
+        <w:trPr>
+          <w:cantSplit/>
+        </w:trPr>
         <w:tc>
-          <w:tcPr/>
+          <w:tcPr>
+            <w:tcW w:w="699" w:type="dxa"/>
+          </w:tcPr>
           <w:p>
             <w:pPr>
               <w:pStyle w:val="Compact"/>
+              <w:spacing w:before="0" w:after="0" w:line="240" w:lineRule="auto"/>
+              <w:ind w:firstLine="0"/>
               <w:jc w:val="left"/>
             </w:pPr>
             <w:r>
+              <w:rPr>
+                <w:rFonts w:ascii="Times New Roman" w:hAnsi="Times New Roman"/>
+                <w:sz w:val="20"/>
+              </w:rPr>
               <w:t xml:space="preserve">P1</w:t>
             </w:r>
           </w:p>
         </w:tc>
         <w:tc>
-          <w:tcPr/>
+          <w:tcPr>
+            <w:tcW w:w="4799" w:type="dxa"/>
+          </w:tcPr>
           <w:p>
             <w:pPr>
               <w:pStyle w:val="Compact"/>
+              <w:spacing w:before="0" w:after="0" w:line="240" w:lineRule="auto"/>
+              <w:ind w:firstLine="0"/>
               <w:jc w:val="left"/>
             </w:pPr>
             <w:r>
+              <w:rPr>
+                <w:rFonts w:ascii="Times New Roman" w:hAnsi="Times New Roman"/>
+                <w:sz w:val="20"/>
+              </w:rPr>
               <w:t xml:space="preserve">(a) Refactoring per active contributor declines as the share of LLM-authored code rises. (b) Holding the cost of refactoring fixed, possessing a working generated artifact increases deferral and the lapse of planned refactoring.</w:t>
             </w:r>
           </w:p>
         </w:tc>
         <w:tc>
-          <w:tcPr/>
+          <w:tcPr>
+            <w:tcW w:w="2368" w:type="dxa"/>
+          </w:tcPr>
           <w:p>
             <w:pPr>
               <w:pStyle w:val="Compact"/>
+              <w:spacing w:before="0" w:after="0" w:line="240" w:lineRule="auto"/>
+              <w:ind w:firstLine="0"/>
               <w:jc w:val="left"/>
             </w:pPr>
             <w:r>
+              <w:rPr>
+                <w:rFonts w:ascii="Times New Roman" w:hAnsi="Times New Roman"/>
+                <w:sz w:val="20"/>
+              </w:rPr>
               <w:t xml:space="preserve">Present bias; planning fallacy</w:t>
             </w:r>
           </w:p>
         </w:tc>
         <w:tc>
-          <w:tcPr/>
+          <w:tcPr>
+            <w:tcW w:w="1494" w:type="dxa"/>
+          </w:tcPr>
           <w:p>
             <w:pPr>
               <w:pStyle w:val="Compact"/>
+              <w:spacing w:before="0" w:after="0" w:line="240" w:lineRule="auto"/>
+              <w:ind w:firstLine="0"/>
               <w:jc w:val="left"/>
             </w:pPr>
             <w:r>
+              <w:rPr>
+                <w:rFonts w:ascii="Times New Roman" w:hAnsi="Times New Roman"/>
+                <w:sz w:val="20"/>
+              </w:rPr>
               <w:t xml:space="preserve">Timing</w:t>
             </w:r>
           </w:p>
         </w:tc>
       </w:tr>
       <w:tr>
+        <w:trPr>
+          <w:cantSplit/>
+        </w:trPr>
         <w:tc>
-          <w:tcPr/>
+          <w:tcPr>
+            <w:tcW w:w="699" w:type="dxa"/>
+          </w:tcPr>
           <w:p>
             <w:pPr>
               <w:pStyle w:val="Compact"/>
+              <w:spacing w:before="0" w:after="0" w:line="240" w:lineRule="auto"/>
+              <w:ind w:firstLine="0"/>
               <w:jc w:val="left"/>
             </w:pPr>
             <w:r>
+              <w:rPr>
+                <w:rFonts w:ascii="Times New Roman" w:hAnsi="Times New Roman"/>
+                <w:sz w:val="20"/>
+              </w:rPr>
               <w:t xml:space="preserve">P2</w:t>
             </w:r>
           </w:p>
         </w:tc>
         <w:tc>
-          <w:tcPr/>
+          <w:tcPr>
+            <w:tcW w:w="4799" w:type="dxa"/>
+          </w:tcPr>
           <w:p>
             <w:pPr>
               <w:pStyle w:val="Compact"/>
+              <w:spacing w:before="0" w:after="0" w:line="240" w:lineRule="auto"/>
+              <w:ind w:firstLine="0"/>
               <w:jc w:val="left"/>
             </w:pPr>
             <w:r>
+              <w:rPr>
+                <w:rFonts w:ascii="Times New Roman" w:hAnsi="Times New Roman"/>
+                <w:sz w:val="20"/>
+              </w:rPr>
               <w:t xml:space="preserve">Comments deferring quality work on LLM-authored code are resolved less often and later than comparable comments on human-authored code.</w:t>
             </w:r>
           </w:p>
         </w:tc>
         <w:tc>
-          <w:tcPr/>
+          <w:tcPr>
+            <w:tcW w:w="2368" w:type="dxa"/>
+          </w:tcPr>
           <w:p>
             <w:pPr>
               <w:pStyle w:val="Compact"/>
+              <w:spacing w:before="0" w:after="0" w:line="240" w:lineRule="auto"/>
+              <w:ind w:firstLine="0"/>
               <w:jc w:val="left"/>
             </w:pPr>
             <w:r>
+              <w:rPr>
+                <w:rFonts w:ascii="Times New Roman" w:hAnsi="Times New Roman"/>
+                <w:sz w:val="20"/>
+              </w:rPr>
               <w:t xml:space="preserve">Present bias</w:t>
             </w:r>
           </w:p>
         </w:tc>
         <w:tc>
-          <w:tcPr/>
+          <w:tcPr>
+            <w:tcW w:w="1494" w:type="dxa"/>
+          </w:tcPr>
           <w:p>
             <w:pPr>
               <w:pStyle w:val="Compact"/>
+              <w:spacing w:before="0" w:after="0" w:line="240" w:lineRule="auto"/>
+              <w:ind w:firstLine="0"/>
               <w:jc w:val="left"/>
             </w:pPr>
             <w:r>
+              <w:rPr>
+                <w:rFonts w:ascii="Times New Roman" w:hAnsi="Times New Roman"/>
+                <w:sz w:val="20"/>
+              </w:rPr>
               <w:t xml:space="preserve">Timing</w:t>
             </w:r>
           </w:p>
         </w:tc>
       </w:tr>
       <w:tr>
+        <w:trPr>
+          <w:cantSplit/>
+        </w:trPr>
         <w:tc>
-          <w:tcPr/>
+          <w:tcPr>
+            <w:tcW w:w="699" w:type="dxa"/>
+          </w:tcPr>
           <w:p>
             <w:pPr>
               <w:pStyle w:val="Compact"/>
+              <w:spacing w:before="0" w:after="0" w:line="240" w:lineRule="auto"/>
+              <w:ind w:firstLine="0"/>
               <w:jc w:val="left"/>
             </w:pPr>
             <w:r>
+              <w:rPr>
+                <w:rFonts w:ascii="Times New Roman" w:hAnsi="Times New Roman"/>
+                <w:sz w:val="20"/>
+              </w:rPr>
               <w:t xml:space="preserve">P3</w:t>
             </w:r>
           </w:p>
         </w:tc>
         <w:tc>
-          <w:tcPr/>
+          <w:tcPr>
+            <w:tcW w:w="4799" w:type="dxa"/>
+          </w:tcPr>
           <w:p>
             <w:pPr>
               <w:pStyle w:val="Compact"/>
+              <w:spacing w:before="0" w:after="0" w:line="240" w:lineRule="auto"/>
+              <w:ind w:firstLine="0"/>
               <w:jc w:val="left"/>
             </w:pPr>
             <w:r>
+              <w:rPr>
+                <w:rFonts w:ascii="Times New Roman" w:hAnsi="Times New Roman"/>
+                <w:sz w:val="20"/>
+              </w:rPr>
               <w:t xml:space="preserve">At equal measured structural quality, reviewers rate LLM-authored code higher.</w:t>
             </w:r>
           </w:p>
         </w:tc>
         <w:tc>
-          <w:tcPr/>
+          <w:tcPr>
+            <w:tcW w:w="2368" w:type="dxa"/>
+          </w:tcPr>
           <w:p>
             <w:pPr>
               <w:pStyle w:val="Compact"/>
+              <w:spacing w:before="0" w:after="0" w:line="240" w:lineRule="auto"/>
+              <w:ind w:firstLine="0"/>
               <w:jc w:val="left"/>
             </w:pPr>
             <w:r>
+              <w:rPr>
+                <w:rFonts w:ascii="Times New Roman" w:hAnsi="Times New Roman"/>
+                <w:sz w:val="20"/>
+              </w:rPr>
               <w:t xml:space="preserve">Fluency heuristic</w:t>
             </w:r>
           </w:p>
         </w:tc>
         <w:tc>
-          <w:tcPr/>
+          <w:tcPr>
+            <w:tcW w:w="1494" w:type="dxa"/>
+          </w:tcPr>
           <w:p>
             <w:pPr>
               <w:pStyle w:val="Compact"/>
+              <w:spacing w:before="0" w:after="0" w:line="240" w:lineRule="auto"/>
+              <w:ind w:firstLine="0"/>
               <w:jc w:val="left"/>
             </w:pPr>
             <w:r>
+              <w:rPr>
+                <w:rFonts w:ascii="Times New Roman" w:hAnsi="Times New Roman"/>
+                <w:sz w:val="20"/>
+              </w:rPr>
               <w:t xml:space="preserve">Appearance</w:t>
             </w:r>
           </w:p>
         </w:tc>
       </w:tr>
       <w:tr>
+        <w:trPr>
+          <w:cantSplit/>
+        </w:trPr>
         <w:tc>
-          <w:tcPr/>
+          <w:tcPr>
+            <w:tcW w:w="699" w:type="dxa"/>
+          </w:tcPr>
           <w:p>
             <w:pPr>
               <w:pStyle w:val="Compact"/>
+              <w:spacing w:before="0" w:after="0" w:line="240" w:lineRule="auto"/>
+              <w:ind w:firstLine="0"/>
               <w:jc w:val="left"/>
             </w:pPr>
             <w:r>
+              <w:rPr>
+                <w:rFonts w:ascii="Times New Roman" w:hAnsi="Times New Roman"/>
+                <w:sz w:val="20"/>
+              </w:rPr>
               <w:t xml:space="preserve">P4</w:t>
             </w:r>
           </w:p>
         </w:tc>
         <w:tc>
-          <w:tcPr/>
+          <w:tcPr>
+            <w:tcW w:w="4799" w:type="dxa"/>
+          </w:tcPr>
           <w:p>
             <w:pPr>
               <w:pStyle w:val="Compact"/>
+              <w:spacing w:before="0" w:after="0" w:line="240" w:lineRule="auto"/>
+              <w:ind w:firstLine="0"/>
               <w:jc w:val="left"/>
             </w:pPr>
             <w:r>
+              <w:rPr>
+                <w:rFonts w:ascii="Times New Roman" w:hAnsi="Times New Roman"/>
+                <w:sz w:val="20"/>
+              </w:rPr>
               <w:t xml:space="preserve">For a given amount of statically detected debt introduced by a change, LLM-assisted changes carry fewer self-admitted debt markers.</w:t>
             </w:r>
           </w:p>
         </w:tc>
         <w:tc>
-          <w:tcPr/>
+          <w:tcPr>
+            <w:tcW w:w="2368" w:type="dxa"/>
+          </w:tcPr>
           <w:p>
             <w:pPr>
               <w:pStyle w:val="Compact"/>
+              <w:spacing w:before="0" w:after="0" w:line="240" w:lineRule="auto"/>
+              <w:ind w:firstLine="0"/>
               <w:jc w:val="left"/>
             </w:pPr>
             <w:r>
+              <w:rPr>
+                <w:rFonts w:ascii="Times New Roman" w:hAnsi="Times New Roman"/>
+                <w:sz w:val="20"/>
+              </w:rPr>
               <w:t xml:space="preserve">Fluency heuristic</w:t>
             </w:r>
           </w:p>
         </w:tc>
         <w:tc>
-          <w:tcPr/>
+          <w:tcPr>
+            <w:tcW w:w="1494" w:type="dxa"/>
+          </w:tcPr>
           <w:p>
             <w:pPr>
               <w:pStyle w:val="Compact"/>
+              <w:spacing w:before="0" w:after="0" w:line="240" w:lineRule="auto"/>
+              <w:ind w:firstLine="0"/>
               <w:jc w:val="left"/>
             </w:pPr>
             <w:r>
+              <w:rPr>
+                <w:rFonts w:ascii="Times New Roman" w:hAnsi="Times New Roman"/>
+                <w:sz w:val="20"/>
+              </w:rPr>
               <w:t xml:space="preserve">Appearance</w:t>
             </w:r>
           </w:p>
         </w:tc>
       </w:tr>
       <w:tr>
+        <w:trPr>
+          <w:cantSplit/>
+        </w:trPr>
         <w:tc>
-          <w:tcPr/>
+          <w:tcPr>
+            <w:tcW w:w="699" w:type="dxa"/>
+          </w:tcPr>
           <w:p>
             <w:pPr>
               <w:pStyle w:val="Compact"/>
+              <w:spacing w:before="0" w:after="0" w:line="240" w:lineRule="auto"/>
+              <w:ind w:firstLine="0"/>
               <w:jc w:val="left"/>
             </w:pPr>
             <w:r>
+              <w:rPr>
+                <w:rFonts w:ascii="Times New Roman" w:hAnsi="Times New Roman"/>
+                <w:sz w:val="20"/>
+              </w:rPr>
               <w:t xml:space="preserve">P5</w:t>
             </w:r>
           </w:p>
         </w:tc>
         <w:tc>
-          <w:tcPr/>
+          <w:tcPr>
+            <w:tcW w:w="4799" w:type="dxa"/>
+          </w:tcPr>
           <w:p>
             <w:pPr>
               <w:pStyle w:val="Compact"/>
+              <w:spacing w:before="0" w:after="0" w:line="240" w:lineRule="auto"/>
+              <w:ind w:firstLine="0"/>
               <w:jc w:val="left"/>
             </w:pPr>
             <w:r>
+              <w:rPr>
+                <w:rFonts w:ascii="Times New Roman" w:hAnsi="Times New Roman"/>
+                <w:sz w:val="20"/>
+              </w:rPr>
               <w:t xml:space="preserve">LLM-assisted commits add more relative to what they delete, and the surplus is concentrated in duplicated and unreachable code.</w:t>
             </w:r>
           </w:p>
         </w:tc>
         <w:tc>
-          <w:tcPr/>
+          <w:tcPr>
+            <w:tcW w:w="2368" w:type="dxa"/>
+          </w:tcPr>
           <w:p>
             <w:pPr>
               <w:pStyle w:val="Compact"/>
+              <w:spacing w:before="0" w:after="0" w:line="240" w:lineRule="auto"/>
+              <w:ind w:firstLine="0"/>
               <w:jc w:val="left"/>
             </w:pPr>
             <w:r>
+              <w:rPr>
+                <w:rFonts w:ascii="Times New Roman" w:hAnsi="Times New Roman"/>
+                <w:sz w:val="20"/>
+              </w:rPr>
               <w:t xml:space="preserve">Loss aversion</w:t>
             </w:r>
           </w:p>
         </w:tc>
         <w:tc>
-          <w:tcPr/>
+          <w:tcPr>
+            <w:tcW w:w="1494" w:type="dxa"/>
+          </w:tcPr>
           <w:p>
             <w:pPr>
               <w:pStyle w:val="Compact"/>
+              <w:spacing w:before="0" w:after="0" w:line="240" w:lineRule="auto"/>
+              <w:ind w:firstLine="0"/>
               <w:jc w:val="left"/>
             </w:pPr>
             <w:r>
+              <w:rPr>
+                <w:rFonts w:ascii="Times New Roman" w:hAnsi="Times New Roman"/>
+                <w:sz w:val="20"/>
+              </w:rPr>
               <w:t xml:space="preserve">Possession</w:t>
             </w:r>
           </w:p>
         </w:tc>
       </w:tr>
       <w:tr>
+        <w:trPr>
+          <w:cantSplit/>
+        </w:trPr>
         <w:tc>
-          <w:tcPr/>
+          <w:tcPr>
+            <w:tcW w:w="699" w:type="dxa"/>
+          </w:tcPr>
           <w:p>
             <w:pPr>
               <w:pStyle w:val="Compact"/>
+              <w:spacing w:before="0" w:after="0" w:line="240" w:lineRule="auto"/>
+              <w:ind w:firstLine="0"/>
               <w:jc w:val="left"/>
             </w:pPr>
             <w:r>
+              <w:rPr>
+                <w:rFonts w:ascii="Times New Roman" w:hAnsi="Times New Roman"/>
+                <w:sz w:val="20"/>
+              </w:rPr>
               <w:t xml:space="preserve">P6</w:t>
             </w:r>
           </w:p>
         </w:tc>
         <w:tc>
-          <w:tcPr/>
+          <w:tcPr>
+            <w:tcW w:w="4799" w:type="dxa"/>
+          </w:tcPr>
           <w:p>
             <w:pPr>
               <w:pStyle w:val="Compact"/>
+              <w:spacing w:before="0" w:after="0" w:line="240" w:lineRule="auto"/>
+              <w:ind w:firstLine="0"/>
               <w:jc w:val="left"/>
             </w:pPr>
             <w:r>
+              <w:rPr>
+                <w:rFonts w:ascii="Times New Roman" w:hAnsi="Times New Roman"/>
+                <w:sz w:val="20"/>
+              </w:rPr>
               <w:t xml:space="preserve">At equal severity and complexity, defects in code a developer generated are fixed more slowly than defects in code she wrote.</w:t>
             </w:r>
           </w:p>
         </w:tc>
         <w:tc>
-          <w:tcPr/>
+          <w:tcPr>
+            <w:tcW w:w="2368" w:type="dxa"/>
+          </w:tcPr>
           <w:p>
             <w:pPr>
               <w:pStyle w:val="Compact"/>
+              <w:spacing w:before="0" w:after="0" w:line="240" w:lineRule="auto"/>
+              <w:ind w:firstLine="0"/>
               <w:jc w:val="left"/>
             </w:pPr>
             <w:r>
+              <w:rPr>
+                <w:rFonts w:ascii="Times New Roman" w:hAnsi="Times New Roman"/>
+                <w:sz w:val="20"/>
+              </w:rPr>
               <w:t xml:space="preserve">Effort-based valuation</w:t>
             </w:r>
           </w:p>
         </w:tc>
         <w:tc>
-          <w:tcPr/>
+          <w:tcPr>
+            <w:tcW w:w="1494" w:type="dxa"/>
+          </w:tcPr>
           <w:p>
             <w:pPr>
               <w:pStyle w:val="Compact"/>
+              <w:spacing w:before="0" w:after="0" w:line="240" w:lineRule="auto"/>
+              <w:ind w:firstLine="0"/>
               <w:jc w:val="left"/>
             </w:pPr>
             <w:r>
+              <w:rPr>
+                <w:rFonts w:ascii="Times New Roman" w:hAnsi="Times New Roman"/>
+                <w:sz w:val="20"/>
+              </w:rPr>
               <w:t xml:space="preserve">Possession</w:t>
             </w:r>
           </w:p>
         </w:tc>
       </w:tr>
       <w:tr>
+        <w:trPr>
+          <w:cantSplit/>
+        </w:trPr>
         <w:tc>
-          <w:tcPr/>
+          <w:tcPr>
+            <w:tcW w:w="699" w:type="dxa"/>
+          </w:tcPr>
           <w:p>
             <w:pPr>
               <w:pStyle w:val="Compact"/>
+              <w:spacing w:before="0" w:after="0" w:line="240" w:lineRule="auto"/>
+              <w:ind w:firstLine="0"/>
               <w:jc w:val="left"/>
             </w:pPr>
             <w:r>
+              <w:rPr>
+                <w:rFonts w:ascii="Times New Roman" w:hAnsi="Times New Roman"/>
+                <w:sz w:val="20"/>
+              </w:rPr>
               <w:t xml:space="preserve">P7</w:t>
             </w:r>
           </w:p>
         </w:tc>
         <w:tc>
-          <w:tcPr/>
+          <w:tcPr>
+            <w:tcW w:w="4799" w:type="dxa"/>
+          </w:tcPr>
           <w:p>
             <w:pPr>
               <w:pStyle w:val="Compact"/>
+              <w:spacing w:before="0" w:after="0" w:line="240" w:lineRule="auto"/>
+              <w:ind w:firstLine="0"/>
               <w:jc w:val="left"/>
             </w:pPr>
             <w:r>
+              <w:rPr>
+                <w:rFonts w:ascii="Times New Roman" w:hAnsi="Times New Roman"/>
+                <w:sz w:val="20"/>
+              </w:rPr>
               <w:t xml:space="preserve">LLM-authored pull requests receive less review time per changed line and fewer substantive comments, with a gap that widens with size.</w:t>
             </w:r>
           </w:p>
         </w:tc>
         <w:tc>
-          <w:tcPr/>
+          <w:tcPr>
+            <w:tcW w:w="2368" w:type="dxa"/>
+          </w:tcPr>
           <w:p>
             <w:pPr>
               <w:pStyle w:val="Compact"/>
+              <w:spacing w:before="0" w:after="0" w:line="240" w:lineRule="auto"/>
+              <w:ind w:firstLine="0"/>
               <w:jc w:val="left"/>
             </w:pPr>
             <w:r>
+              <w:rPr>
+                <w:rFonts w:ascii="Times New Roman" w:hAnsi="Times New Roman"/>
+                <w:sz w:val="20"/>
+              </w:rPr>
               <w:t xml:space="preserve">Automation bias</w:t>
             </w:r>
           </w:p>
         </w:tc>
         <w:tc>
-          <w:tcPr/>
+          <w:tcPr>
+            <w:tcW w:w="1494" w:type="dxa"/>
+          </w:tcPr>
           <w:p>
             <w:pPr>
               <w:pStyle w:val="Compact"/>
+              <w:spacing w:before="0" w:after="0" w:line="240" w:lineRule="auto"/>
+              <w:ind w:firstLine="0"/>
               <w:jc w:val="left"/>
             </w:pPr>
             <w:r>
+              <w:rPr>
+                <w:rFonts w:ascii="Times New Roman" w:hAnsi="Times New Roman"/>
+                <w:sz w:val="20"/>
+              </w:rPr>
               <w:t xml:space="preserve">Appearance</w:t>
             </w:r>
           </w:p>
         </w:tc>
       </w:tr>
       <w:tr>
+        <w:trPr>
+          <w:cantSplit/>
+        </w:trPr>
         <w:tc>
-          <w:tcPr/>
+          <w:tcPr>
+            <w:tcW w:w="699" w:type="dxa"/>
+          </w:tcPr>
           <w:p>
             <w:pPr>
               <w:pStyle w:val="Compact"/>
+              <w:spacing w:before="0" w:after="0" w:line="240" w:lineRule="auto"/>
+              <w:ind w:firstLine="0"/>
               <w:jc w:val="left"/>
             </w:pPr>
             <w:r>
+              <w:rPr>
+                <w:rFonts w:ascii="Times New Roman" w:hAnsi="Times New Roman"/>
+                <w:sz w:val="20"/>
+              </w:rPr>
               <w:t xml:space="preserve">P8</w:t>
             </w:r>
           </w:p>
         </w:tc>
         <w:tc>
-          <w:tcPr/>
+          <w:tcPr>
+            <w:tcW w:w="4799" w:type="dxa"/>
+          </w:tcPr>
           <w:p>
             <w:pPr>
               <w:pStyle w:val="Compact"/>
+              <w:spacing w:before="0" w:after="0" w:line="240" w:lineRule="auto"/>
+              <w:ind w:firstLine="0"/>
               <w:jc w:val="left"/>
             </w:pPr>
             <w:r>
+              <w:rPr>
+                <w:rFonts w:ascii="Times New Roman" w:hAnsi="Times New Roman"/>
+                <w:sz w:val="20"/>
+              </w:rPr>
               <w:t xml:space="preserve">Acceptance of inline suggestions varies less with suggestion quality than with the interface cost of rejection.</w:t>
             </w:r>
           </w:p>
         </w:tc>
         <w:tc>
-          <w:tcPr/>
+          <w:tcPr>
+            <w:tcW w:w="2368" w:type="dxa"/>
+          </w:tcPr>
           <w:p>
             <w:pPr>
               <w:pStyle w:val="Compact"/>
+              <w:spacing w:before="0" w:after="0" w:line="240" w:lineRule="auto"/>
+              <w:ind w:firstLine="0"/>
               <w:jc w:val="left"/>
             </w:pPr>
             <w:r>
+              <w:rPr>
+                <w:rFonts w:ascii="Times New Roman" w:hAnsi="Times New Roman"/>
+                <w:sz w:val="20"/>
+              </w:rPr>
               <w:t xml:space="preserve">Default effect</w:t>
             </w:r>
           </w:p>
         </w:tc>
         <w:tc>
-          <w:tcPr/>
+          <w:tcPr>
+            <w:tcW w:w="1494" w:type="dxa"/>
+          </w:tcPr>
           <w:p>
             <w:pPr>
               <w:pStyle w:val="Compact"/>
+              <w:spacing w:before="0" w:after="0" w:line="240" w:lineRule="auto"/>
+              <w:ind w:firstLine="0"/>
               <w:jc w:val="left"/>
             </w:pPr>
             <w:r>
+              <w:rPr>
+                <w:rFonts w:ascii="Times New Roman" w:hAnsi="Times New Roman"/>
+                <w:sz w:val="20"/>
+              </w:rPr>
               <w:t xml:space="preserve">Possession</w:t>
             </w:r>
           </w:p>
         </w:tc>
       </w:tr>
       <w:tr>
+        <w:trPr>
+          <w:cantSplit/>
+        </w:trPr>
         <w:tc>
-          <w:tcPr/>
+          <w:tcPr>
+            <w:tcW w:w="699" w:type="dxa"/>
+          </w:tcPr>
           <w:p>
             <w:pPr>
               <w:pStyle w:val="Compact"/>
+              <w:spacing w:before="0" w:after="0" w:line="240" w:lineRule="auto"/>
+              <w:ind w:firstLine="0"/>
               <w:jc w:val="left"/>
             </w:pPr>
             <w:r>
+              <w:rPr>
+                <w:rFonts w:ascii="Times New Roman" w:hAnsi="Times New Roman"/>
+                <w:sz w:val="20"/>
+              </w:rPr>
               <w:t xml:space="preserve">P9</w:t>
             </w:r>
           </w:p>
         </w:tc>
         <w:tc>
-          <w:tcPr/>
+          <w:tcPr>
+            <w:tcW w:w="4799" w:type="dxa"/>
+          </w:tcPr>
           <w:p>
             <w:pPr>
               <w:pStyle w:val="Compact"/>
+              <w:spacing w:before="0" w:after="0" w:line="240" w:lineRule="auto"/>
+              <w:ind w:firstLine="0"/>
               <w:jc w:val="left"/>
             </w:pPr>
             <w:r>
+              <w:rPr>
+                <w:rFonts w:ascii="Times New Roman" w:hAnsi="Times New Roman"/>
+                <w:sz w:val="20"/>
+              </w:rPr>
               <w:t xml:space="preserve">Debt introduced by LLM-assisted changes concentrates in modules the author does not maintain.</w:t>
             </w:r>
           </w:p>
         </w:tc>
         <w:tc>
-          <w:tcPr/>
+          <w:tcPr>
+            <w:tcW w:w="2368" w:type="dxa"/>
+          </w:tcPr>
           <w:p>
             <w:pPr>
               <w:pStyle w:val="Compact"/>
+              <w:spacing w:before="0" w:after="0" w:line="240" w:lineRule="auto"/>
+              <w:ind w:firstLine="0"/>
               <w:jc w:val="left"/>
             </w:pPr>
             <w:r>
+              <w:rPr>
+                <w:rFonts w:ascii="Times New Roman" w:hAnsi="Times New Roman"/>
+                <w:sz w:val="20"/>
+              </w:rPr>
               <w:t xml:space="preserve">Moral hazard</w:t>
             </w:r>
           </w:p>
         </w:tc>
         <w:tc>
-          <w:tcPr/>
+          <w:tcPr>
+            <w:tcW w:w="1494" w:type="dxa"/>
+          </w:tcPr>
           <w:p>
             <w:pPr>
               <w:pStyle w:val="Compact"/>
+              <w:spacing w:before="0" w:after="0" w:line="240" w:lineRule="auto"/>
+              <w:ind w:firstLine="0"/>
               <w:jc w:val="left"/>
             </w:pPr>
             <w:r>
+              <w:rPr>
+                <w:rFonts w:ascii="Times New Roman" w:hAnsi="Times New Roman"/>
+                <w:sz w:val="20"/>
+              </w:rPr>
               <w:t xml:space="preserve">Incentive amplifier</w:t>
             </w:r>
           </w:p>
         </w:tc>
       </w:tr>
       <w:tr>
+        <w:trPr>
+          <w:cantSplit/>
+        </w:trPr>
         <w:tc>
-          <w:tcPr/>
+          <w:tcPr>
+            <w:tcW w:w="699" w:type="dxa"/>
+          </w:tcPr>
           <w:p>
             <w:pPr>
               <w:pStyle w:val="Compact"/>
+              <w:spacing w:before="0" w:after="0" w:line="240" w:lineRule="auto"/>
+              <w:ind w:firstLine="0"/>
               <w:jc w:val="left"/>
             </w:pPr>
             <w:r>
+              <w:rPr>
+                <w:rFonts w:ascii="Times New Roman" w:hAnsi="Times New Roman"/>
+                <w:sz w:val="20"/>
+              </w:rPr>
               <w:t xml:space="preserve">P10</w:t>
             </w:r>
           </w:p>
         </w:tc>
         <w:tc>
-          <w:tcPr/>
+          <w:tcPr>
+            <w:tcW w:w="4799" w:type="dxa"/>
+          </w:tcPr>
           <w:p>
             <w:pPr>
               <w:pStyle w:val="Compact"/>
+              <w:spacing w:before="0" w:after="0" w:line="240" w:lineRule="auto"/>
+              <w:ind w:firstLine="0"/>
               <w:jc w:val="left"/>
             </w:pPr>
             <w:r>
+              <w:rPr>
+                <w:rFonts w:ascii="Times New Roman" w:hAnsi="Times New Roman"/>
+                <w:sz w:val="20"/>
+              </w:rPr>
               <w:t xml:space="preserve">Duplication rises with LLM adoption, more so in repositories with more contributors and weaker ownership.</w:t>
             </w:r>
           </w:p>
         </w:tc>
         <w:tc>
-          <w:tcPr/>
+          <w:tcPr>
+            <w:tcW w:w="2368" w:type="dxa"/>
+          </w:tcPr>
           <w:p>
             <w:pPr>
               <w:pStyle w:val="Compact"/>
+              <w:spacing w:before="0" w:after="0" w:line="240" w:lineRule="auto"/>
+              <w:ind w:firstLine="0"/>
               <w:jc w:val="left"/>
             </w:pPr>
             <w:r>
+              <w:rPr>
+                <w:rFonts w:ascii="Times New Roman" w:hAnsi="Times New Roman"/>
+                <w:sz w:val="20"/>
+              </w:rPr>
               <w:t xml:space="preserve">Common pool; rebound</w:t>
             </w:r>
           </w:p>
         </w:tc>
         <w:tc>
-          <w:tcPr/>
+          <w:tcPr>
+            <w:tcW w:w="1494" w:type="dxa"/>
+          </w:tcPr>
           <w:p>
             <w:pPr>
               <w:pStyle w:val="Compact"/>
+              <w:spacing w:before="0" w:after="0" w:line="240" w:lineRule="auto"/>
+              <w:ind w:firstLine="0"/>
               <w:jc w:val="left"/>
             </w:pPr>
             <w:r>
+              <w:rPr>
+                <w:rFonts w:ascii="Times New Roman" w:hAnsi="Times New Roman"/>
+                <w:sz w:val="20"/>
+              </w:rPr>
               <w:t xml:space="preserve">Incentive amplifier</w:t>
             </w:r>
           </w:p>
         </w:tc>
       </w:tr>
       <w:tr>
+        <w:trPr>
+          <w:cantSplit/>
+        </w:trPr>
         <w:tc>
-          <w:tcPr/>
+          <w:tcPr>
+            <w:tcW w:w="699" w:type="dxa"/>
+          </w:tcPr>
           <w:p>
             <w:pPr>
               <w:pStyle w:val="Compact"/>
+              <w:spacing w:before="0" w:after="0" w:line="240" w:lineRule="auto"/>
+              <w:ind w:firstLine="0"/>
               <w:jc w:val="left"/>
             </w:pPr>
             <w:r>
+              <w:rPr>
+                <w:rFonts w:ascii="Times New Roman" w:hAnsi="Times New Roman"/>
+                <w:sz w:val="20"/>
+              </w:rPr>
               <w:t xml:space="preserve">P11</w:t>
             </w:r>
           </w:p>
         </w:tc>
         <w:tc>
-          <w:tcPr/>
+          <w:tcPr>
+            <w:tcW w:w="4799" w:type="dxa"/>
+          </w:tcPr>
           <w:p>
             <w:pPr>
               <w:pStyle w:val="Compact"/>
+              <w:spacing w:before="0" w:after="0" w:line="240" w:lineRule="auto"/>
+              <w:ind w:firstLine="0"/>
               <w:jc w:val="left"/>
             </w:pPr>
             <w:r>
+              <w:rPr>
+                <w:rFonts w:ascii="Times New Roman" w:hAnsi="Times New Roman"/>
+                <w:sz w:val="20"/>
+              </w:rPr>
               <w:t xml:space="preserve">The association between LLM adoption and debt growth is stronger where individual throughput is rewarded and maintainability is not measured.</w:t>
             </w:r>
           </w:p>
         </w:tc>
         <w:tc>
-          <w:tcPr/>
+          <w:tcPr>
+            <w:tcW w:w="2368" w:type="dxa"/>
+          </w:tcPr>
           <w:p>
             <w:pPr>
               <w:pStyle w:val="Compact"/>
+              <w:spacing w:before="0" w:after="0" w:line="240" w:lineRule="auto"/>
+              <w:ind w:firstLine="0"/>
               <w:jc w:val="left"/>
             </w:pPr>
             <w:r>
+              <w:rPr>
+                <w:rFonts w:ascii="Times New Roman" w:hAnsi="Times New Roman"/>
+                <w:sz w:val="20"/>
+              </w:rPr>
               <w:t xml:space="preserve">Metric targeting</w:t>
             </w:r>
           </w:p>
         </w:tc>
         <w:tc>
-          <w:tcPr/>
+          <w:tcPr>
+            <w:tcW w:w="1494" w:type="dxa"/>
+          </w:tcPr>
           <w:p>
             <w:pPr>
               <w:pStyle w:val="Compact"/>
+              <w:spacing w:before="0" w:after="0" w:line="240" w:lineRule="auto"/>
+              <w:ind w:firstLine="0"/>
               <w:jc w:val="left"/>
             </w:pPr>
             <w:r>
+              <w:rPr>
+                <w:rFonts w:ascii="Times New Roman" w:hAnsi="Times New Roman"/>
+                <w:sz w:val="20"/>
+              </w:rPr>
               <w:t xml:space="preserve">Incentive amplifier</w:t>
             </w:r>
           </w:p>
         </w:tc>
       </w:tr>
       <w:tr>
+        <w:trPr>
+          <w:cantSplit/>
+        </w:trPr>
         <w:tc>
-          <w:tcPr/>
+          <w:tcPr>
+            <w:tcW w:w="699" w:type="dxa"/>
+          </w:tcPr>
           <w:p>
             <w:pPr>
               <w:pStyle w:val="Compact"/>
+              <w:spacing w:before="0" w:after="0" w:line="240" w:lineRule="auto"/>
+              <w:ind w:firstLine="0"/>
               <w:jc w:val="left"/>
             </w:pPr>
             <w:r>
+              <w:rPr>
+                <w:rFonts w:ascii="Times New Roman" w:hAnsi="Times New Roman"/>
+                <w:sz w:val="20"/>
+              </w:rPr>
               <w:t xml:space="preserve">P12</w:t>
             </w:r>
           </w:p>
         </w:tc>
         <w:tc>
-          <w:tcPr/>
+          <w:tcPr>
+            <w:tcW w:w="4799" w:type="dxa"/>
+          </w:tcPr>
           <w:p>
             <w:pPr>
               <w:pStyle w:val="Compact"/>
+              <w:spacing w:before="0" w:after="0" w:line="240" w:lineRule="auto"/>
+              <w:ind w:firstLine="0"/>
               <w:jc w:val="left"/>
             </w:pPr>
             <w:r>
+              <w:rPr>
+                <w:rFonts w:ascii="Times New Roman" w:hAnsi="Times New Roman"/>
+                <w:sz w:val="20"/>
+              </w:rPr>
               <w:t xml:space="preserve">Holding the developer, the tool, the artifact’s quality, the stated costs, and the value of speed fixed, requiring the quality decision to be made before generation returns the possession effect, the lapse of planned refactoring, and the self-admitted share to their rational values.</w:t>
             </w:r>
           </w:p>
         </w:tc>
         <w:tc>
-          <w:tcPr/>
+          <w:tcPr>
+            <w:tcW w:w="2368" w:type="dxa"/>
+          </w:tcPr>
           <w:p>
             <w:pPr>
               <w:pStyle w:val="Compact"/>
+              <w:spacing w:before="0" w:after="0" w:line="240" w:lineRule="auto"/>
+              <w:ind w:firstLine="0"/>
               <w:jc w:val="left"/>
             </w:pPr>
             <w:r>
+              <w:rPr>
+                <w:rFonts w:ascii="Times New Roman" w:hAnsi="Times New Roman"/>
+                <w:sz w:val="20"/>
+              </w:rPr>
               <w:t xml:space="preserve">Frame shift (order of events)</w:t>
             </w:r>
           </w:p>
         </w:tc>
         <w:tc>
-          <w:tcPr/>
+          <w:tcPr>
+            <w:tcW w:w="1494" w:type="dxa"/>
+          </w:tcPr>
           <w:p>
             <w:pPr>
               <w:pStyle w:val="Compact"/>
+              <w:spacing w:before="0" w:after="0" w:line="240" w:lineRule="auto"/>
+              <w:ind w:firstLine="0"/>
               <w:jc w:val="left"/>
             </w:pPr>
             <w:r>
+              <w:rPr>
+                <w:rFonts w:ascii="Times New Roman" w:hAnsi="Times New Roman"/>
+                <w:sz w:val="20"/>
+              </w:rPr>
               <w:t xml:space="preserve">All</w:t>
             </w:r>
           </w:p>
@@ -1495,6 +1981,7 @@
     <w:p>
       <w:pPr>
         <w:pStyle w:val="BodyText"/>
+        <w:keepNext/>
       </w:pPr>
       <w:r>
         <w:rPr>
@@ -1507,355 +1994,624 @@
     <w:tbl>
       <w:tblPr>
         <w:tblStyle w:val="Table"/>
-        <w:tblW w:type="pct" w:w="5000"/>
         <w:tblLook w:firstRow="1" w:lastRow="0" w:firstColumn="0" w:lastColumn="0" w:noHBand="0" w:noVBand="0" w:val="0020"/>
-        <w:jc w:val="start"/>
+        <w:tblW w:w="9360" w:type="dxa"/>
+        <w:jc w:val="center"/>
+        <w:tblLayout w:type="fixed"/>
+        <w:tblBorders>
+          <w:top w:val="single" w:sz="8" w:space="0" w:color="000000"/>
+          <w:bottom w:val="single" w:sz="8" w:space="0" w:color="000000"/>
+          <w:insideH w:val="single" w:sz="4" w:space="0" w:color="BFBFBF"/>
+          <w:left w:val="nil"/>
+          <w:right w:val="nil"/>
+          <w:insideV w:val="nil"/>
+        </w:tblBorders>
+        <w:tblCellMar>
+          <w:top w:w="40" w:type="dxa"/>
+          <w:left w:w="70" w:type="dxa"/>
+          <w:bottom w:w="40" w:type="dxa"/>
+          <w:right w:w="70" w:type="dxa"/>
+        </w:tblCellMar>
       </w:tblPr>
       <w:tblGrid>
-        <w:gridCol w:w="2640"/>
-        <w:gridCol w:w="2640"/>
-        <w:gridCol w:w="2640"/>
+        <w:gridCol w:w="3579"/>
+        <w:gridCol w:w="2200"/>
+        <w:gridCol w:w="3581"/>
       </w:tblGrid>
       <w:tr>
         <w:trPr>
           <w:tblHeader w:val="true"/>
+          <w:cantSplit/>
+          <w:tblHeader/>
         </w:trPr>
         <w:tc>
-          <w:tcPr/>
+          <w:tcPr>
+            <w:tcW w:w="3579" w:type="dxa"/>
+            <w:tcBorders>
+              <w:bottom w:val="single" w:sz="8" w:space="0" w:color="000000"/>
+            </w:tcBorders>
+          </w:tcPr>
           <w:p>
             <w:pPr>
               <w:pStyle w:val="Compact"/>
+              <w:spacing w:before="0" w:after="0" w:line="240" w:lineRule="auto"/>
+              <w:ind w:firstLine="0"/>
               <w:jc w:val="left"/>
             </w:pPr>
             <w:r>
+              <w:rPr>
+                <w:rFonts w:ascii="Times New Roman" w:hAnsi="Times New Roman"/>
+                <w:b/>
+                <w:sz w:val="20"/>
+              </w:rPr>
               <w:t xml:space="preserve">Prediction</w:t>
             </w:r>
           </w:p>
         </w:tc>
         <w:tc>
-          <w:tcPr/>
+          <w:tcPr>
+            <w:tcW w:w="2200" w:type="dxa"/>
+            <w:tcBorders>
+              <w:bottom w:val="single" w:sz="8" w:space="0" w:color="000000"/>
+            </w:tcBorders>
+          </w:tcPr>
           <w:p>
             <w:pPr>
               <w:pStyle w:val="Compact"/>
+              <w:spacing w:before="0" w:after="0" w:line="240" w:lineRule="auto"/>
+              <w:ind w:firstLine="0"/>
               <w:jc w:val="left"/>
             </w:pPr>
             <w:r>
+              <w:rPr>
+                <w:rFonts w:ascii="Times New Roman" w:hAnsi="Times New Roman"/>
+                <w:b/>
+                <w:sz w:val="20"/>
+              </w:rPr>
               <w:t xml:space="preserve">Rational acceleration</w:t>
             </w:r>
           </w:p>
         </w:tc>
         <w:tc>
-          <w:tcPr/>
+          <w:tcPr>
+            <w:tcW w:w="3581" w:type="dxa"/>
+            <w:tcBorders>
+              <w:bottom w:val="single" w:sz="8" w:space="0" w:color="000000"/>
+            </w:tcBorders>
+          </w:tcPr>
           <w:p>
             <w:pPr>
               <w:pStyle w:val="Compact"/>
+              <w:spacing w:before="0" w:after="0" w:line="240" w:lineRule="auto"/>
+              <w:ind w:firstLine="0"/>
               <w:jc w:val="left"/>
             </w:pPr>
             <w:r>
+              <w:rPr>
+                <w:rFonts w:ascii="Times New Roman" w:hAnsi="Times New Roman"/>
+                <w:b/>
+                <w:sz w:val="20"/>
+              </w:rPr>
               <w:t xml:space="preserve">Behavioral theory</w:t>
             </w:r>
           </w:p>
         </w:tc>
       </w:tr>
       <w:tr>
+        <w:trPr>
+          <w:cantSplit/>
+        </w:trPr>
         <w:tc>
-          <w:tcPr/>
+          <w:tcPr>
+            <w:tcW w:w="3579" w:type="dxa"/>
+          </w:tcPr>
           <w:p>
             <w:pPr>
               <w:pStyle w:val="Compact"/>
+              <w:spacing w:before="0" w:after="0" w:line="240" w:lineRule="auto"/>
+              <w:ind w:firstLine="0"/>
               <w:jc w:val="left"/>
             </w:pPr>
             <w:r>
+              <w:rPr>
+                <w:rFonts w:ascii="Times New Roman" w:hAnsi="Times New Roman"/>
+                <w:sz w:val="20"/>
+              </w:rPr>
               <w:t xml:space="preserve">Aggregate debt after LLM adoption</w:t>
             </w:r>
           </w:p>
         </w:tc>
         <w:tc>
-          <w:tcPr/>
+          <w:tcPr>
+            <w:tcW w:w="2200" w:type="dxa"/>
+          </w:tcPr>
           <w:p>
             <w:pPr>
               <w:pStyle w:val="Compact"/>
+              <w:spacing w:before="0" w:after="0" w:line="240" w:lineRule="auto"/>
+              <w:ind w:firstLine="0"/>
               <w:jc w:val="left"/>
             </w:pPr>
             <w:r>
+              <w:rPr>
+                <w:rFonts w:ascii="Times New Roman" w:hAnsi="Times New Roman"/>
+                <w:sz w:val="20"/>
+              </w:rPr>
               <w:t xml:space="preserve">Rises</w:t>
             </w:r>
           </w:p>
         </w:tc>
         <w:tc>
-          <w:tcPr/>
+          <w:tcPr>
+            <w:tcW w:w="3581" w:type="dxa"/>
+          </w:tcPr>
           <w:p>
             <w:pPr>
               <w:pStyle w:val="Compact"/>
+              <w:spacing w:before="0" w:after="0" w:line="240" w:lineRule="auto"/>
+              <w:ind w:firstLine="0"/>
               <w:jc w:val="left"/>
             </w:pPr>
             <w:r>
+              <w:rPr>
+                <w:rFonts w:ascii="Times New Roman" w:hAnsi="Times New Roman"/>
+                <w:sz w:val="20"/>
+              </w:rPr>
               <w:t xml:space="preserve">Rises</w:t>
             </w:r>
           </w:p>
         </w:tc>
       </w:tr>
       <w:tr>
+        <w:trPr>
+          <w:cantSplit/>
+        </w:trPr>
         <w:tc>
-          <w:tcPr/>
+          <w:tcPr>
+            <w:tcW w:w="3579" w:type="dxa"/>
+          </w:tcPr>
           <w:p>
             <w:pPr>
               <w:pStyle w:val="Compact"/>
+              <w:spacing w:before="0" w:after="0" w:line="240" w:lineRule="auto"/>
+              <w:ind w:firstLine="0"/>
               <w:jc w:val="left"/>
             </w:pPr>
             <w:r>
+              <w:rPr>
+                <w:rFonts w:ascii="Times New Roman" w:hAnsi="Times New Roman"/>
+                <w:sz w:val="20"/>
+              </w:rPr>
               <w:t xml:space="preserve">Self-admitted debt per unit of detected debt introduced (P4)</w:t>
             </w:r>
           </w:p>
         </w:tc>
         <w:tc>
-          <w:tcPr/>
+          <w:tcPr>
+            <w:tcW w:w="2200" w:type="dxa"/>
+          </w:tcPr>
           <w:p>
             <w:pPr>
               <w:pStyle w:val="Compact"/>
+              <w:spacing w:before="0" w:after="0" w:line="240" w:lineRule="auto"/>
+              <w:ind w:firstLine="0"/>
               <w:jc w:val="left"/>
             </w:pPr>
             <w:r>
+              <w:rPr>
+                <w:rFonts w:ascii="Times New Roman" w:hAnsi="Times New Roman"/>
+                <w:sz w:val="20"/>
+              </w:rPr>
               <w:t xml:space="preserve">No difference by authorship</w:t>
             </w:r>
           </w:p>
         </w:tc>
         <w:tc>
-          <w:tcPr/>
+          <w:tcPr>
+            <w:tcW w:w="3581" w:type="dxa"/>
+          </w:tcPr>
           <w:p>
             <w:pPr>
               <w:pStyle w:val="Compact"/>
+              <w:spacing w:before="0" w:after="0" w:line="240" w:lineRule="auto"/>
+              <w:ind w:firstLine="0"/>
               <w:jc w:val="left"/>
             </w:pPr>
             <w:r>
+              <w:rPr>
+                <w:rFonts w:ascii="Times New Roman" w:hAnsi="Times New Roman"/>
+                <w:sz w:val="20"/>
+              </w:rPr>
               <w:t xml:space="preserve">Lower for LLM-assisted changes</w:t>
             </w:r>
           </w:p>
         </w:tc>
       </w:tr>
       <w:tr>
+        <w:trPr>
+          <w:cantSplit/>
+        </w:trPr>
         <w:tc>
-          <w:tcPr/>
+          <w:tcPr>
+            <w:tcW w:w="3579" w:type="dxa"/>
+          </w:tcPr>
           <w:p>
             <w:pPr>
               <w:pStyle w:val="Compact"/>
+              <w:spacing w:before="0" w:after="0" w:line="240" w:lineRule="auto"/>
+              <w:ind w:firstLine="0"/>
               <w:jc w:val="left"/>
             </w:pPr>
             <w:r>
+              <w:rPr>
+                <w:rFonts w:ascii="Times New Roman" w:hAnsi="Times New Roman"/>
+                <w:sz w:val="20"/>
+              </w:rPr>
               <w:t xml:space="preserve">Substantive review per changed line (P7)</w:t>
             </w:r>
           </w:p>
         </w:tc>
         <w:tc>
-          <w:tcPr/>
+          <w:tcPr>
+            <w:tcW w:w="2200" w:type="dxa"/>
+          </w:tcPr>
           <w:p>
             <w:pPr>
               <w:pStyle w:val="Compact"/>
+              <w:spacing w:before="0" w:after="0" w:line="240" w:lineRule="auto"/>
+              <w:ind w:firstLine="0"/>
               <w:jc w:val="left"/>
             </w:pPr>
             <w:r>
+              <w:rPr>
+                <w:rFonts w:ascii="Times New Roman" w:hAnsi="Times New Roman"/>
+                <w:sz w:val="20"/>
+              </w:rPr>
               <w:t xml:space="preserve">No lower for LLM-assisted changes</w:t>
             </w:r>
           </w:p>
         </w:tc>
         <w:tc>
-          <w:tcPr/>
+          <w:tcPr>
+            <w:tcW w:w="3581" w:type="dxa"/>
+          </w:tcPr>
           <w:p>
             <w:pPr>
               <w:pStyle w:val="Compact"/>
+              <w:spacing w:before="0" w:after="0" w:line="240" w:lineRule="auto"/>
+              <w:ind w:firstLine="0"/>
               <w:jc w:val="left"/>
             </w:pPr>
             <w:r>
+              <w:rPr>
+                <w:rFonts w:ascii="Times New Roman" w:hAnsi="Times New Roman"/>
+                <w:sz w:val="20"/>
+              </w:rPr>
               <w:t xml:space="preserve">Lower for LLM-assisted changes</w:t>
             </w:r>
           </w:p>
         </w:tc>
       </w:tr>
       <w:tr>
+        <w:trPr>
+          <w:cantSplit/>
+        </w:trPr>
         <w:tc>
-          <w:tcPr/>
+          <w:tcPr>
+            <w:tcW w:w="3579" w:type="dxa"/>
+          </w:tcPr>
           <w:p>
             <w:pPr>
               <w:pStyle w:val="Compact"/>
+              <w:spacing w:before="0" w:after="0" w:line="240" w:lineRule="auto"/>
+              <w:ind w:firstLine="0"/>
               <w:jc w:val="left"/>
             </w:pPr>
             <w:r>
+              <w:rPr>
+                <w:rFonts w:ascii="Times New Roman" w:hAnsi="Times New Roman"/>
+                <w:sz w:val="20"/>
+              </w:rPr>
               <w:t xml:space="preserve">Net-addition bias in single-contributor code (P5)</w:t>
             </w:r>
           </w:p>
         </w:tc>
         <w:tc>
-          <w:tcPr/>
+          <w:tcPr>
+            <w:tcW w:w="2200" w:type="dxa"/>
+          </w:tcPr>
           <w:p>
             <w:pPr>
               <w:pStyle w:val="Compact"/>
+              <w:spacing w:before="0" w:after="0" w:line="240" w:lineRule="auto"/>
+              <w:ind w:firstLine="0"/>
               <w:jc w:val="left"/>
             </w:pPr>
             <w:r>
+              <w:rPr>
+                <w:rFonts w:ascii="Times New Roman" w:hAnsi="Times New Roman"/>
+                <w:sz w:val="20"/>
+              </w:rPr>
               <w:t xml:space="preserve">Absent</w:t>
             </w:r>
           </w:p>
         </w:tc>
         <w:tc>
-          <w:tcPr/>
+          <w:tcPr>
+            <w:tcW w:w="3581" w:type="dxa"/>
+          </w:tcPr>
           <w:p>
             <w:pPr>
               <w:pStyle w:val="Compact"/>
+              <w:spacing w:before="0" w:after="0" w:line="240" w:lineRule="auto"/>
+              <w:ind w:firstLine="0"/>
               <w:jc w:val="left"/>
             </w:pPr>
             <w:r>
+              <w:rPr>
+                <w:rFonts w:ascii="Times New Roman" w:hAnsi="Times New Roman"/>
+                <w:sz w:val="20"/>
+              </w:rPr>
               <w:t xml:space="preserve">Present</w:t>
             </w:r>
           </w:p>
         </w:tc>
       </w:tr>
       <w:tr>
+        <w:trPr>
+          <w:cantSplit/>
+        </w:trPr>
         <w:tc>
-          <w:tcPr/>
+          <w:tcPr>
+            <w:tcW w:w="3579" w:type="dxa"/>
+          </w:tcPr>
           <w:p>
             <w:pPr>
               <w:pStyle w:val="Compact"/>
+              <w:spacing w:before="0" w:after="0" w:line="240" w:lineRule="auto"/>
+              <w:ind w:firstLine="0"/>
               <w:jc w:val="left"/>
             </w:pPr>
             <w:r>
+              <w:rPr>
+                <w:rFonts w:ascii="Times New Roman" w:hAnsi="Times New Roman"/>
+                <w:sz w:val="20"/>
+              </w:rPr>
               <w:t xml:space="preserve">Deferral with artifact in hand at equal cost; completion of planned refactoring (P1b, P2)</w:t>
             </w:r>
           </w:p>
         </w:tc>
         <w:tc>
-          <w:tcPr/>
+          <w:tcPr>
+            <w:tcW w:w="2200" w:type="dxa"/>
+          </w:tcPr>
           <w:p>
             <w:pPr>
               <w:pStyle w:val="Compact"/>
+              <w:spacing w:before="0" w:after="0" w:line="240" w:lineRule="auto"/>
+              <w:ind w:firstLine="0"/>
               <w:jc w:val="left"/>
             </w:pPr>
             <w:r>
+              <w:rPr>
+                <w:rFonts w:ascii="Times New Roman" w:hAnsi="Times New Roman"/>
+                <w:sz w:val="20"/>
+              </w:rPr>
               <w:t xml:space="preserve">No possession effect; plans carried out</w:t>
             </w:r>
           </w:p>
         </w:tc>
         <w:tc>
-          <w:tcPr/>
+          <w:tcPr>
+            <w:tcW w:w="3581" w:type="dxa"/>
+          </w:tcPr>
           <w:p>
             <w:pPr>
               <w:pStyle w:val="Compact"/>
+              <w:spacing w:before="0" w:after="0" w:line="240" w:lineRule="auto"/>
+              <w:ind w:firstLine="0"/>
               <w:jc w:val="left"/>
             </w:pPr>
             <w:r>
+              <w:rPr>
+                <w:rFonts w:ascii="Times New Roman" w:hAnsi="Times New Roman"/>
+                <w:sz w:val="20"/>
+              </w:rPr>
               <w:t xml:space="preserve">Possession raises deferral; plans lapse</w:t>
             </w:r>
           </w:p>
         </w:tc>
       </w:tr>
       <w:tr>
+        <w:trPr>
+          <w:cantSplit/>
+        </w:trPr>
         <w:tc>
-          <w:tcPr/>
+          <w:tcPr>
+            <w:tcW w:w="3579" w:type="dxa"/>
+          </w:tcPr>
           <w:p>
             <w:pPr>
               <w:pStyle w:val="Compact"/>
+              <w:spacing w:before="0" w:after="0" w:line="240" w:lineRule="auto"/>
+              <w:ind w:firstLine="0"/>
               <w:jc w:val="left"/>
             </w:pPr>
             <w:r>
+              <w:rPr>
+                <w:rFonts w:ascii="Times New Roman" w:hAnsi="Times New Roman"/>
+                <w:sz w:val="20"/>
+              </w:rPr>
               <w:t xml:space="preserve">Debt under developer-controlled versus organization-controlled configuration of the assistant (Result 6)</w:t>
             </w:r>
           </w:p>
         </w:tc>
         <w:tc>
-          <w:tcPr/>
+          <w:tcPr>
+            <w:tcW w:w="2200" w:type="dxa"/>
+          </w:tcPr>
           <w:p>
             <w:pPr>
               <w:pStyle w:val="Compact"/>
+              <w:spacing w:before="0" w:after="0" w:line="240" w:lineRule="auto"/>
+              <w:ind w:firstLine="0"/>
               <w:jc w:val="left"/>
             </w:pPr>
             <w:r>
+              <w:rPr>
+                <w:rFonts w:ascii="Times New Roman" w:hAnsi="Times New Roman"/>
+                <w:sz w:val="20"/>
+              </w:rPr>
               <w:t xml:space="preserve">No difference</w:t>
             </w:r>
           </w:p>
         </w:tc>
         <w:tc>
-          <w:tcPr/>
+          <w:tcPr>
+            <w:tcW w:w="3581" w:type="dxa"/>
+          </w:tcPr>
           <w:p>
             <w:pPr>
               <w:pStyle w:val="Compact"/>
+              <w:spacing w:before="0" w:after="0" w:line="240" w:lineRule="auto"/>
+              <w:ind w:firstLine="0"/>
               <w:jc w:val="left"/>
             </w:pPr>
             <w:r>
+              <w:rPr>
+                <w:rFonts w:ascii="Times New Roman" w:hAnsi="Times New Roman"/>
+                <w:sz w:val="20"/>
+              </w:rPr>
               <w:t xml:space="preserve">Lower under organization control</w:t>
             </w:r>
           </w:p>
         </w:tc>
       </w:tr>
       <w:tr>
+        <w:trPr>
+          <w:cantSplit/>
+        </w:trPr>
         <w:tc>
-          <w:tcPr/>
+          <w:tcPr>
+            <w:tcW w:w="3579" w:type="dxa"/>
+          </w:tcPr>
           <w:p>
             <w:pPr>
               <w:pStyle w:val="Compact"/>
+              <w:spacing w:before="0" w:after="0" w:line="240" w:lineRule="auto"/>
+              <w:ind w:firstLine="0"/>
               <w:jc w:val="left"/>
             </w:pPr>
             <w:r>
+              <w:rPr>
+                <w:rFonts w:ascii="Times New Roman" w:hAnsi="Times New Roman"/>
+                <w:sz w:val="20"/>
+              </w:rPr>
               <w:t xml:space="preserve">Duplication rising with team size; debt in nonowned modules; stronger effects under throughput metrics (P9 to P11)</w:t>
             </w:r>
           </w:p>
         </w:tc>
         <w:tc>
-          <w:tcPr/>
+          <w:tcPr>
+            <w:tcW w:w="2200" w:type="dxa"/>
+          </w:tcPr>
           <w:p>
             <w:pPr>
               <w:pStyle w:val="Compact"/>
+              <w:spacing w:before="0" w:after="0" w:line="240" w:lineRule="auto"/>
+              <w:ind w:firstLine="0"/>
               <w:jc w:val="left"/>
             </w:pPr>
             <w:r>
+              <w:rPr>
+                <w:rFonts w:ascii="Times New Roman" w:hAnsi="Times New Roman"/>
+                <w:sz w:val="20"/>
+              </w:rPr>
               <w:t xml:space="preserve">Yes</w:t>
             </w:r>
           </w:p>
         </w:tc>
         <w:tc>
-          <w:tcPr/>
+          <w:tcPr>
+            <w:tcW w:w="3581" w:type="dxa"/>
+          </w:tcPr>
           <w:p>
             <w:pPr>
               <w:pStyle w:val="Compact"/>
+              <w:spacing w:before="0" w:after="0" w:line="240" w:lineRule="auto"/>
+              <w:ind w:firstLine="0"/>
               <w:jc w:val="left"/>
             </w:pPr>
             <w:r>
+              <w:rPr>
+                <w:rFonts w:ascii="Times New Roman" w:hAnsi="Times New Roman"/>
+                <w:sz w:val="20"/>
+              </w:rPr>
               <w:t xml:space="preserve">Yes</w:t>
             </w:r>
           </w:p>
         </w:tc>
       </w:tr>
       <w:tr>
+        <w:trPr>
+          <w:cantSplit/>
+        </w:trPr>
         <w:tc>
-          <w:tcPr/>
+          <w:tcPr>
+            <w:tcW w:w="3579" w:type="dxa"/>
+          </w:tcPr>
           <w:p>
             <w:pPr>
               <w:pStyle w:val="Compact"/>
+              <w:spacing w:before="0" w:after="0" w:line="240" w:lineRule="auto"/>
+              <w:ind w:firstLine="0"/>
               <w:jc w:val="left"/>
             </w:pPr>
             <w:r>
+              <w:rPr>
+                <w:rFonts w:ascii="Times New Roman" w:hAnsi="Times New Roman"/>
+                <w:sz w:val="20"/>
+              </w:rPr>
               <w:t xml:space="preserve">Order of events: quality decision made before versus after generation (P12)</w:t>
             </w:r>
           </w:p>
         </w:tc>
         <w:tc>
-          <w:tcPr/>
+          <w:tcPr>
+            <w:tcW w:w="2200" w:type="dxa"/>
+          </w:tcPr>
           <w:p>
             <w:pPr>
               <w:pStyle w:val="Compact"/>
+              <w:spacing w:before="0" w:after="0" w:line="240" w:lineRule="auto"/>
+              <w:ind w:firstLine="0"/>
               <w:jc w:val="left"/>
             </w:pPr>
             <w:r>
+              <w:rPr>
+                <w:rFonts w:ascii="Times New Roman" w:hAnsi="Times New Roman"/>
+                <w:sz w:val="20"/>
+              </w:rPr>
               <w:t xml:space="preserve">No change in the three statistics</w:t>
             </w:r>
           </w:p>
         </w:tc>
         <w:tc>
-          <w:tcPr/>
+          <w:tcPr>
+            <w:tcW w:w="3581" w:type="dxa"/>
+          </w:tcPr>
           <w:p>
             <w:pPr>
               <w:pStyle w:val="Compact"/>
+              <w:spacing w:before="0" w:after="0" w:line="240" w:lineRule="auto"/>
+              <w:ind w:firstLine="0"/>
               <w:jc w:val="left"/>
             </w:pPr>
             <w:r>
+              <w:rPr>
+                <w:rFonts w:ascii="Times New Roman" w:hAnsi="Times New Roman"/>
+                <w:sz w:val="20"/>
+              </w:rPr>
               <w:t xml:space="preserve">Statistics return to rational values when the decision precedes generation</w:t>
             </w:r>
           </w:p>
@@ -1865,6 +2621,7 @@
     <w:p>
       <w:pPr>
         <w:pStyle w:val="BodyText"/>
+        <w:spacing w:before="160"/>
       </w:pPr>
       <w:r>
         <w:t xml:space="preserve">The comparison also marks the limits of the discrimination. Rebound, moral hazard, and metric targeting operate under both accounts, so Propositions 9 to 11 cannot distinguish them; their role is to measure how far debt spreads, not to adjudicate between accounts.</w:t>
@@ -12898,6 +13655,7 @@
     <w:p>
       <w:pPr>
         <w:pStyle w:val="FirstParagraph"/>
+        <w:keepNext/>
       </w:pPr>
       <w:r>
         <w:rPr>
@@ -12910,339 +13668,596 @@
     <w:tbl>
       <w:tblPr>
         <w:tblStyle w:val="Table"/>
-        <w:tblW w:type="pct" w:w="5000"/>
         <w:tblLook w:firstRow="1" w:lastRow="0" w:firstColumn="0" w:lastColumn="0" w:noHBand="0" w:noVBand="0" w:val="0020"/>
-        <w:jc w:val="start"/>
+        <w:tblW w:w="9360" w:type="dxa"/>
+        <w:jc w:val="center"/>
+        <w:tblLayout w:type="fixed"/>
+        <w:tblBorders>
+          <w:top w:val="single" w:sz="8" w:space="0" w:color="000000"/>
+          <w:bottom w:val="single" w:sz="8" w:space="0" w:color="000000"/>
+          <w:insideH w:val="single" w:sz="4" w:space="0" w:color="BFBFBF"/>
+          <w:left w:val="nil"/>
+          <w:right w:val="nil"/>
+          <w:insideV w:val="nil"/>
+        </w:tblBorders>
+        <w:tblCellMar>
+          <w:top w:w="40" w:type="dxa"/>
+          <w:left w:w="70" w:type="dxa"/>
+          <w:bottom w:w="40" w:type="dxa"/>
+          <w:right w:w="70" w:type="dxa"/>
+        </w:tblCellMar>
       </w:tblPr>
       <w:tblGrid>
-        <w:gridCol w:w="2640"/>
-        <w:gridCol w:w="2640"/>
-        <w:gridCol w:w="2640"/>
+        <w:gridCol w:w="3503"/>
+        <w:gridCol w:w="3524"/>
+        <w:gridCol w:w="2333"/>
       </w:tblGrid>
       <w:tr>
         <w:trPr>
           <w:tblHeader w:val="true"/>
+          <w:cantSplit/>
+          <w:tblHeader/>
         </w:trPr>
         <w:tc>
-          <w:tcPr/>
+          <w:tcPr>
+            <w:tcW w:w="3503" w:type="dxa"/>
+            <w:tcBorders>
+              <w:bottom w:val="single" w:sz="8" w:space="0" w:color="000000"/>
+            </w:tcBorders>
+          </w:tcPr>
           <w:p>
             <w:pPr>
               <w:pStyle w:val="Compact"/>
+              <w:spacing w:before="0" w:after="0" w:line="240" w:lineRule="auto"/>
+              <w:ind w:firstLine="0"/>
               <w:jc w:val="left"/>
             </w:pPr>
             <w:r>
+              <w:rPr>
+                <w:rFonts w:ascii="Times New Roman" w:hAnsi="Times New Roman"/>
+                <w:b/>
+                <w:sz w:val="20"/>
+              </w:rPr>
               <w:t xml:space="preserve">Outcome</w:t>
             </w:r>
           </w:p>
         </w:tc>
         <w:tc>
-          <w:tcPr/>
+          <w:tcPr>
+            <w:tcW w:w="3524" w:type="dxa"/>
+            <w:tcBorders>
+              <w:bottom w:val="single" w:sz="8" w:space="0" w:color="000000"/>
+            </w:tcBorders>
+          </w:tcPr>
           <w:p>
             <w:pPr>
               <w:pStyle w:val="Compact"/>
+              <w:spacing w:before="0" w:after="0" w:line="240" w:lineRule="auto"/>
+              <w:ind w:firstLine="0"/>
               <w:jc w:val="left"/>
             </w:pPr>
             <w:r>
+              <w:rPr>
+                <w:rFonts w:ascii="Times New Roman" w:hAnsi="Times New Roman"/>
+                <w:b/>
+                <w:sz w:val="20"/>
+              </w:rPr>
               <w:t xml:space="preserve">Sample</w:t>
             </w:r>
           </w:p>
         </w:tc>
         <w:tc>
-          <w:tcPr/>
+          <w:tcPr>
+            <w:tcW w:w="2333" w:type="dxa"/>
+            <w:tcBorders>
+              <w:bottom w:val="single" w:sz="8" w:space="0" w:color="000000"/>
+            </w:tcBorders>
+          </w:tcPr>
           <w:p>
             <w:pPr>
               <w:pStyle w:val="Compact"/>
-              <w:jc w:val="left"/>
+              <w:spacing w:before="0" w:after="0" w:line="240" w:lineRule="auto"/>
+              <w:ind w:firstLine="0"/>
+              <w:jc w:val="center"/>
             </w:pPr>
             <w:r>
+              <w:rPr>
+                <w:rFonts w:ascii="Times New Roman" w:hAnsi="Times New Roman"/>
+                <w:b/>
+                <w:sz w:val="20"/>
+              </w:rPr>
               <w:t xml:space="preserve">Agent coefficient (SE)</w:t>
             </w:r>
           </w:p>
         </w:tc>
       </w:tr>
       <w:tr>
+        <w:trPr>
+          <w:cantSplit/>
+        </w:trPr>
         <w:tc>
-          <w:tcPr/>
+          <w:tcPr>
+            <w:tcW w:w="3503" w:type="dxa"/>
+          </w:tcPr>
           <w:p>
             <w:pPr>
               <w:pStyle w:val="Compact"/>
+              <w:spacing w:before="0" w:after="0" w:line="240" w:lineRule="auto"/>
+              <w:ind w:firstLine="0"/>
               <w:jc w:val="left"/>
             </w:pPr>
             <w:r>
+              <w:rPr>
+                <w:rFonts w:ascii="Times New Roman" w:hAnsi="Times New Roman"/>
+                <w:sz w:val="20"/>
+              </w:rPr>
               <w:t xml:space="preserve">Net addition (log additions/deletions)</w:t>
             </w:r>
           </w:p>
         </w:tc>
         <w:tc>
-          <w:tcPr/>
+          <w:tcPr>
+            <w:tcW w:w="3524" w:type="dxa"/>
+          </w:tcPr>
           <w:p>
             <w:pPr>
               <w:pStyle w:val="Compact"/>
+              <w:spacing w:before="0" w:after="0" w:line="240" w:lineRule="auto"/>
+              <w:ind w:firstLine="0"/>
               <w:jc w:val="left"/>
             </w:pPr>
             <w:r>
+              <w:rPr>
+                <w:rFonts w:ascii="Times New Roman" w:hAnsi="Times New Roman"/>
+                <w:sz w:val="20"/>
+              </w:rPr>
               <w:t xml:space="preserve">All repositories</w:t>
             </w:r>
           </w:p>
         </w:tc>
         <w:tc>
-          <w:tcPr/>
+          <w:tcPr>
+            <w:tcW w:w="2333" w:type="dxa"/>
+          </w:tcPr>
           <w:p>
             <w:pPr>
               <w:pStyle w:val="Compact"/>
-              <w:jc w:val="left"/>
+              <w:spacing w:before="0" w:after="0" w:line="240" w:lineRule="auto"/>
+              <w:ind w:firstLine="0"/>
+              <w:jc w:val="center"/>
             </w:pPr>
             <w:r>
+              <w:rPr>
+                <w:rFonts w:ascii="Times New Roman" w:hAnsi="Times New Roman"/>
+                <w:sz w:val="20"/>
+              </w:rPr>
               <w:t xml:space="preserve">+0.597 (0.022)</w:t>
             </w:r>
           </w:p>
         </w:tc>
       </w:tr>
       <w:tr>
+        <w:trPr>
+          <w:cantSplit/>
+        </w:trPr>
         <w:tc>
-          <w:tcPr/>
+          <w:tcPr>
+            <w:tcW w:w="3503" w:type="dxa"/>
+          </w:tcPr>
           <w:p>
             <w:pPr>
               <w:pStyle w:val="Compact"/>
+              <w:spacing w:before="0" w:after="0" w:line="240" w:lineRule="auto"/>
+              <w:ind w:firstLine="0"/>
+              <w:jc w:val="left"/>
             </w:pPr>
           </w:p>
         </w:tc>
         <w:tc>
-          <w:tcPr/>
+          <w:tcPr>
+            <w:tcW w:w="3524" w:type="dxa"/>
+          </w:tcPr>
           <w:p>
             <w:pPr>
               <w:pStyle w:val="Compact"/>
+              <w:spacing w:before="0" w:after="0" w:line="240" w:lineRule="auto"/>
+              <w:ind w:firstLine="0"/>
               <w:jc w:val="left"/>
             </w:pPr>
             <w:r>
+              <w:rPr>
+                <w:rFonts w:ascii="Times New Roman" w:hAnsi="Times New Roman"/>
+                <w:sz w:val="20"/>
+              </w:rPr>
               <w:t xml:space="preserve">Solo repositories</w:t>
             </w:r>
           </w:p>
         </w:tc>
         <w:tc>
-          <w:tcPr/>
+          <w:tcPr>
+            <w:tcW w:w="2333" w:type="dxa"/>
+          </w:tcPr>
           <w:p>
             <w:pPr>
               <w:pStyle w:val="Compact"/>
-              <w:jc w:val="left"/>
+              <w:spacing w:before="0" w:after="0" w:line="240" w:lineRule="auto"/>
+              <w:ind w:firstLine="0"/>
+              <w:jc w:val="center"/>
             </w:pPr>
             <w:r>
+              <w:rPr>
+                <w:rFonts w:ascii="Times New Roman" w:hAnsi="Times New Roman"/>
+                <w:sz w:val="20"/>
+              </w:rPr>
               <w:t xml:space="preserve">+0.625 (0.026)</w:t>
             </w:r>
           </w:p>
         </w:tc>
       </w:tr>
       <w:tr>
+        <w:trPr>
+          <w:cantSplit/>
+        </w:trPr>
         <w:tc>
-          <w:tcPr/>
+          <w:tcPr>
+            <w:tcW w:w="3503" w:type="dxa"/>
+          </w:tcPr>
           <w:p>
             <w:pPr>
               <w:pStyle w:val="Compact"/>
+              <w:spacing w:before="0" w:after="0" w:line="240" w:lineRule="auto"/>
+              <w:ind w:firstLine="0"/>
+              <w:jc w:val="left"/>
             </w:pPr>
           </w:p>
         </w:tc>
         <w:tc>
-          <w:tcPr/>
+          <w:tcPr>
+            <w:tcW w:w="3524" w:type="dxa"/>
+          </w:tcPr>
           <w:p>
             <w:pPr>
               <w:pStyle w:val="Compact"/>
+              <w:spacing w:before="0" w:after="0" w:line="240" w:lineRule="auto"/>
+              <w:ind w:firstLine="0"/>
               <w:jc w:val="left"/>
             </w:pPr>
             <w:r>
+              <w:rPr>
+                <w:rFonts w:ascii="Times New Roman" w:hAnsi="Times New Roman"/>
+                <w:sz w:val="20"/>
+              </w:rPr>
               <w:t xml:space="preserve">Team repositories</w:t>
             </w:r>
           </w:p>
         </w:tc>
         <w:tc>
-          <w:tcPr/>
+          <w:tcPr>
+            <w:tcW w:w="2333" w:type="dxa"/>
+          </w:tcPr>
           <w:p>
             <w:pPr>
               <w:pStyle w:val="Compact"/>
-              <w:jc w:val="left"/>
+              <w:spacing w:before="0" w:after="0" w:line="240" w:lineRule="auto"/>
+              <w:ind w:firstLine="0"/>
+              <w:jc w:val="center"/>
             </w:pPr>
             <w:r>
+              <w:rPr>
+                <w:rFonts w:ascii="Times New Roman" w:hAnsi="Times New Roman"/>
+                <w:sz w:val="20"/>
+              </w:rPr>
               <w:t xml:space="preserve">+0.538 (0.045)</w:t>
             </w:r>
           </w:p>
         </w:tc>
       </w:tr>
       <w:tr>
+        <w:trPr>
+          <w:cantSplit/>
+        </w:trPr>
         <w:tc>
-          <w:tcPr/>
+          <w:tcPr>
+            <w:tcW w:w="3503" w:type="dxa"/>
+          </w:tcPr>
           <w:p>
             <w:pPr>
               <w:pStyle w:val="Compact"/>
+              <w:spacing w:before="0" w:after="0" w:line="240" w:lineRule="auto"/>
+              <w:ind w:firstLine="0"/>
               <w:jc w:val="left"/>
             </w:pPr>
             <w:r>
+              <w:rPr>
+                <w:rFonts w:ascii="Times New Roman" w:hAnsi="Times New Roman"/>
+                <w:sz w:val="20"/>
+              </w:rPr>
               <w:t xml:space="preserve">Any human review</w:t>
             </w:r>
           </w:p>
         </w:tc>
         <w:tc>
-          <w:tcPr/>
+          <w:tcPr>
+            <w:tcW w:w="3524" w:type="dxa"/>
+          </w:tcPr>
           <w:p>
             <w:pPr>
               <w:pStyle w:val="Compact"/>
+              <w:spacing w:before="0" w:after="0" w:line="240" w:lineRule="auto"/>
+              <w:ind w:firstLine="0"/>
               <w:jc w:val="left"/>
             </w:pPr>
             <w:r>
+              <w:rPr>
+                <w:rFonts w:ascii="Times New Roman" w:hAnsi="Times New Roman"/>
+                <w:sz w:val="20"/>
+              </w:rPr>
               <w:t xml:space="preserve">All repositories</w:t>
             </w:r>
           </w:p>
         </w:tc>
         <w:tc>
-          <w:tcPr/>
+          <w:tcPr>
+            <w:tcW w:w="2333" w:type="dxa"/>
+          </w:tcPr>
           <w:p>
             <w:pPr>
               <w:pStyle w:val="Compact"/>
-              <w:jc w:val="left"/>
+              <w:spacing w:before="0" w:after="0" w:line="240" w:lineRule="auto"/>
+              <w:ind w:firstLine="0"/>
+              <w:jc w:val="center"/>
             </w:pPr>
             <w:r>
+              <w:rPr>
+                <w:rFonts w:ascii="Times New Roman" w:hAnsi="Times New Roman"/>
+                <w:sz w:val="20"/>
+              </w:rPr>
               <w:t xml:space="preserve">+0.026 (0.002)</w:t>
             </w:r>
           </w:p>
         </w:tc>
       </w:tr>
       <w:tr>
+        <w:trPr>
+          <w:cantSplit/>
+        </w:trPr>
         <w:tc>
-          <w:tcPr/>
+          <w:tcPr>
+            <w:tcW w:w="3503" w:type="dxa"/>
+          </w:tcPr>
           <w:p>
             <w:pPr>
               <w:pStyle w:val="Compact"/>
+              <w:spacing w:before="0" w:after="0" w:line="240" w:lineRule="auto"/>
+              <w:ind w:firstLine="0"/>
+              <w:jc w:val="left"/>
             </w:pPr>
           </w:p>
         </w:tc>
         <w:tc>
-          <w:tcPr/>
+          <w:tcPr>
+            <w:tcW w:w="3524" w:type="dxa"/>
+          </w:tcPr>
           <w:p>
             <w:pPr>
               <w:pStyle w:val="Compact"/>
+              <w:spacing w:before="0" w:after="0" w:line="240" w:lineRule="auto"/>
+              <w:ind w:firstLine="0"/>
               <w:jc w:val="left"/>
             </w:pPr>
             <w:r>
+              <w:rPr>
+                <w:rFonts w:ascii="Times New Roman" w:hAnsi="Times New Roman"/>
+                <w:sz w:val="20"/>
+              </w:rPr>
               <w:t xml:space="preserve">Excluding Copilot</w:t>
             </w:r>
           </w:p>
         </w:tc>
         <w:tc>
-          <w:tcPr/>
+          <w:tcPr>
+            <w:tcW w:w="2333" w:type="dxa"/>
+          </w:tcPr>
           <w:p>
             <w:pPr>
               <w:pStyle w:val="Compact"/>
-              <w:jc w:val="left"/>
+              <w:spacing w:before="0" w:after="0" w:line="240" w:lineRule="auto"/>
+              <w:ind w:firstLine="0"/>
+              <w:jc w:val="center"/>
             </w:pPr>
             <w:r>
+              <w:rPr>
+                <w:rFonts w:ascii="Times New Roman" w:hAnsi="Times New Roman"/>
+                <w:sz w:val="20"/>
+              </w:rPr>
               <w:t xml:space="preserve">−0.005 (0.001)</w:t>
             </w:r>
           </w:p>
         </w:tc>
       </w:tr>
       <w:tr>
+        <w:trPr>
+          <w:cantSplit/>
+        </w:trPr>
         <w:tc>
-          <w:tcPr/>
+          <w:tcPr>
+            <w:tcW w:w="3503" w:type="dxa"/>
+          </w:tcPr>
           <w:p>
             <w:pPr>
               <w:pStyle w:val="Compact"/>
+              <w:spacing w:before="0" w:after="0" w:line="240" w:lineRule="auto"/>
+              <w:ind w:firstLine="0"/>
+              <w:jc w:val="left"/>
             </w:pPr>
           </w:p>
         </w:tc>
         <w:tc>
-          <w:tcPr/>
+          <w:tcPr>
+            <w:tcW w:w="3524" w:type="dxa"/>
+          </w:tcPr>
           <w:p>
             <w:pPr>
               <w:pStyle w:val="Compact"/>
+              <w:spacing w:before="0" w:after="0" w:line="240" w:lineRule="auto"/>
+              <w:ind w:firstLine="0"/>
               <w:jc w:val="left"/>
             </w:pPr>
             <w:r>
+              <w:rPr>
+                <w:rFonts w:ascii="Times New Roman" w:hAnsi="Times New Roman"/>
+                <w:sz w:val="20"/>
+              </w:rPr>
               <w:t xml:space="preserve">Team repositories, excluding Copilot</w:t>
             </w:r>
           </w:p>
         </w:tc>
         <w:tc>
-          <w:tcPr/>
+          <w:tcPr>
+            <w:tcW w:w="2333" w:type="dxa"/>
+          </w:tcPr>
           <w:p>
             <w:pPr>
               <w:pStyle w:val="Compact"/>
-              <w:jc w:val="left"/>
+              <w:spacing w:before="0" w:after="0" w:line="240" w:lineRule="auto"/>
+              <w:ind w:firstLine="0"/>
+              <w:jc w:val="center"/>
             </w:pPr>
             <w:r>
+              <w:rPr>
+                <w:rFonts w:ascii="Times New Roman" w:hAnsi="Times New Roman"/>
+                <w:sz w:val="20"/>
+              </w:rPr>
               <w:t xml:space="preserve">−0.059 (0.008)</w:t>
             </w:r>
           </w:p>
         </w:tc>
       </w:tr>
       <w:tr>
+        <w:trPr>
+          <w:cantSplit/>
+        </w:trPr>
         <w:tc>
-          <w:tcPr/>
+          <w:tcPr>
+            <w:tcW w:w="3503" w:type="dxa"/>
+          </w:tcPr>
           <w:p>
             <w:pPr>
               <w:pStyle w:val="Compact"/>
+              <w:spacing w:before="0" w:after="0" w:line="240" w:lineRule="auto"/>
+              <w:ind w:firstLine="0"/>
               <w:jc w:val="left"/>
             </w:pPr>
             <w:r>
+              <w:rPr>
+                <w:rFonts w:ascii="Times New Roman" w:hAnsi="Times New Roman"/>
+                <w:sz w:val="20"/>
+              </w:rPr>
               <w:t xml:space="preserve">Human review within 24 hours</w:t>
             </w:r>
           </w:p>
         </w:tc>
         <w:tc>
-          <w:tcPr/>
+          <w:tcPr>
+            <w:tcW w:w="3524" w:type="dxa"/>
+          </w:tcPr>
           <w:p>
             <w:pPr>
               <w:pStyle w:val="Compact"/>
+              <w:spacing w:before="0" w:after="0" w:line="240" w:lineRule="auto"/>
+              <w:ind w:firstLine="0"/>
               <w:jc w:val="left"/>
             </w:pPr>
             <w:r>
+              <w:rPr>
+                <w:rFonts w:ascii="Times New Roman" w:hAnsi="Times New Roman"/>
+                <w:sz w:val="20"/>
+              </w:rPr>
               <w:t xml:space="preserve">Team repositories, excluding Copilot</w:t>
             </w:r>
           </w:p>
         </w:tc>
         <w:tc>
-          <w:tcPr/>
+          <w:tcPr>
+            <w:tcW w:w="2333" w:type="dxa"/>
+          </w:tcPr>
           <w:p>
             <w:pPr>
               <w:pStyle w:val="Compact"/>
-              <w:jc w:val="left"/>
+              <w:spacing w:before="0" w:after="0" w:line="240" w:lineRule="auto"/>
+              <w:ind w:firstLine="0"/>
+              <w:jc w:val="center"/>
             </w:pPr>
             <w:r>
+              <w:rPr>
+                <w:rFonts w:ascii="Times New Roman" w:hAnsi="Times New Roman"/>
+                <w:sz w:val="20"/>
+              </w:rPr>
               <w:t xml:space="preserve">−0.045 (0.007)</w:t>
             </w:r>
           </w:p>
         </w:tc>
       </w:tr>
       <w:tr>
+        <w:trPr>
+          <w:cantSplit/>
+        </w:trPr>
         <w:tc>
-          <w:tcPr/>
+          <w:tcPr>
+            <w:tcW w:w="3503" w:type="dxa"/>
+          </w:tcPr>
           <w:p>
             <w:pPr>
               <w:pStyle w:val="Compact"/>
+              <w:spacing w:before="0" w:after="0" w:line="240" w:lineRule="auto"/>
+              <w:ind w:firstLine="0"/>
               <w:jc w:val="left"/>
             </w:pPr>
             <w:r>
+              <w:rPr>
+                <w:rFonts w:ascii="Times New Roman" w:hAnsi="Times New Roman"/>
+                <w:sz w:val="20"/>
+              </w:rPr>
               <w:t xml:space="preserve">Number of inline comments (log 1 + count)</w:t>
             </w:r>
           </w:p>
         </w:tc>
         <w:tc>
-          <w:tcPr/>
+          <w:tcPr>
+            <w:tcW w:w="3524" w:type="dxa"/>
+          </w:tcPr>
           <w:p>
             <w:pPr>
               <w:pStyle w:val="Compact"/>
+              <w:spacing w:before="0" w:after="0" w:line="240" w:lineRule="auto"/>
+              <w:ind w:firstLine="0"/>
               <w:jc w:val="left"/>
             </w:pPr>
             <w:r>
+              <w:rPr>
+                <w:rFonts w:ascii="Times New Roman" w:hAnsi="Times New Roman"/>
+                <w:sz w:val="20"/>
+              </w:rPr>
               <w:t xml:space="preserve">Excluding Copilot</w:t>
             </w:r>
           </w:p>
         </w:tc>
         <w:tc>
-          <w:tcPr/>
+          <w:tcPr>
+            <w:tcW w:w="2333" w:type="dxa"/>
+          </w:tcPr>
           <w:p>
             <w:pPr>
               <w:pStyle w:val="Compact"/>
-              <w:jc w:val="left"/>
+              <w:spacing w:before="0" w:after="0" w:line="240" w:lineRule="auto"/>
+              <w:ind w:firstLine="0"/>
+              <w:jc w:val="center"/>
             </w:pPr>
             <w:r>
+              <w:rPr>
+                <w:rFonts w:ascii="Times New Roman" w:hAnsi="Times New Roman"/>
+                <w:sz w:val="20"/>
+              </w:rPr>
               <w:t xml:space="preserve">+0.001 (0.001)</w:t>
             </w:r>
           </w:p>
@@ -13252,6 +14267,7 @@
     <w:p>
       <w:pPr>
         <w:pStyle w:val="BodyText"/>
+        <w:spacing w:before="160"/>
       </w:pPr>
       <w:r>
         <w:rPr>
@@ -13340,6 +14356,7 @@
     <w:p>
       <w:pPr>
         <w:pStyle w:val="BodyText"/>
+        <w:keepNext/>
       </w:pPr>
       <w:r>
         <w:rPr>
@@ -13352,264 +14369,469 @@
     <w:tbl>
       <w:tblPr>
         <w:tblStyle w:val="Table"/>
-        <w:tblW w:type="auto" w:w="0"/>
         <w:tblLook w:firstRow="1" w:lastRow="0" w:firstColumn="0" w:lastColumn="0" w:noHBand="0" w:noVBand="0" w:val="0020"/>
-        <w:jc w:val="start"/>
+        <w:tblW w:w="9360" w:type="dxa"/>
+        <w:jc w:val="center"/>
+        <w:tblLayout w:type="fixed"/>
+        <w:tblBorders>
+          <w:top w:val="single" w:sz="8" w:space="0" w:color="000000"/>
+          <w:bottom w:val="single" w:sz="8" w:space="0" w:color="000000"/>
+          <w:insideH w:val="single" w:sz="4" w:space="0" w:color="BFBFBF"/>
+          <w:left w:val="nil"/>
+          <w:right w:val="nil"/>
+          <w:insideV w:val="nil"/>
+        </w:tblBorders>
+        <w:tblCellMar>
+          <w:top w:w="40" w:type="dxa"/>
+          <w:left w:w="70" w:type="dxa"/>
+          <w:bottom w:w="40" w:type="dxa"/>
+          <w:right w:w="70" w:type="dxa"/>
+        </w:tblCellMar>
       </w:tblPr>
       <w:tblGrid>
-        <w:gridCol w:w="1980"/>
-        <w:gridCol w:w="1980"/>
-        <w:gridCol w:w="1980"/>
-        <w:gridCol w:w="1980"/>
+        <w:gridCol w:w="4440"/>
+        <w:gridCol w:w="1155"/>
+        <w:gridCol w:w="1155"/>
+        <w:gridCol w:w="2610"/>
       </w:tblGrid>
       <w:tr>
         <w:trPr>
           <w:tblHeader w:val="true"/>
+          <w:cantSplit/>
+          <w:tblHeader/>
         </w:trPr>
         <w:tc>
-          <w:tcPr/>
+          <w:tcPr>
+            <w:tcW w:w="4440" w:type="dxa"/>
+            <w:tcBorders>
+              <w:bottom w:val="single" w:sz="8" w:space="0" w:color="000000"/>
+            </w:tcBorders>
+          </w:tcPr>
           <w:p>
             <w:pPr>
               <w:pStyle w:val="Compact"/>
+              <w:spacing w:before="0" w:after="0" w:line="240" w:lineRule="auto"/>
+              <w:ind w:firstLine="0"/>
               <w:jc w:val="left"/>
             </w:pPr>
             <w:r>
+              <w:rPr>
+                <w:rFonts w:ascii="Times New Roman" w:hAnsi="Times New Roman"/>
+                <w:b/>
+                <w:sz w:val="20"/>
+              </w:rPr>
               <w:t xml:space="preserve">Measure</w:t>
             </w:r>
           </w:p>
         </w:tc>
         <w:tc>
-          <w:tcPr/>
+          <w:tcPr>
+            <w:tcW w:w="1155" w:type="dxa"/>
+            <w:tcBorders>
+              <w:bottom w:val="single" w:sz="8" w:space="0" w:color="000000"/>
+            </w:tcBorders>
+          </w:tcPr>
           <w:p>
             <w:pPr>
               <w:pStyle w:val="Compact"/>
-              <w:jc w:val="left"/>
+              <w:spacing w:before="0" w:after="0" w:line="240" w:lineRule="auto"/>
+              <w:ind w:firstLine="0"/>
+              <w:jc w:val="center"/>
             </w:pPr>
             <w:r>
+              <w:rPr>
+                <w:rFonts w:ascii="Times New Roman" w:hAnsi="Times New Roman"/>
+                <w:b/>
+                <w:sz w:val="20"/>
+              </w:rPr>
               <w:t xml:space="preserve">Agent</w:t>
             </w:r>
           </w:p>
         </w:tc>
         <w:tc>
-          <w:tcPr/>
+          <w:tcPr>
+            <w:tcW w:w="1155" w:type="dxa"/>
+            <w:tcBorders>
+              <w:bottom w:val="single" w:sz="8" w:space="0" w:color="000000"/>
+            </w:tcBorders>
+          </w:tcPr>
           <w:p>
             <w:pPr>
               <w:pStyle w:val="Compact"/>
-              <w:jc w:val="left"/>
+              <w:spacing w:before="0" w:after="0" w:line="240" w:lineRule="auto"/>
+              <w:ind w:firstLine="0"/>
+              <w:jc w:val="center"/>
             </w:pPr>
             <w:r>
+              <w:rPr>
+                <w:rFonts w:ascii="Times New Roman" w:hAnsi="Times New Roman"/>
+                <w:b/>
+                <w:sz w:val="20"/>
+              </w:rPr>
               <w:t xml:space="preserve">Human</w:t>
             </w:r>
           </w:p>
         </w:tc>
         <w:tc>
-          <w:tcPr/>
+          <w:tcPr>
+            <w:tcW w:w="2610" w:type="dxa"/>
+            <w:tcBorders>
+              <w:bottom w:val="single" w:sz="8" w:space="0" w:color="000000"/>
+            </w:tcBorders>
+          </w:tcPr>
           <w:p>
             <w:pPr>
               <w:pStyle w:val="Compact"/>
-              <w:jc w:val="left"/>
+              <w:spacing w:before="0" w:after="0" w:line="240" w:lineRule="auto"/>
+              <w:ind w:firstLine="0"/>
+              <w:jc w:val="center"/>
             </w:pPr>
             <w:r>
+              <w:rPr>
+                <w:rFonts w:ascii="Times New Roman" w:hAnsi="Times New Roman"/>
+                <w:b/>
+                <w:sz w:val="20"/>
+              </w:rPr>
               <w:t xml:space="preserve">Ratio (95% CI)</w:t>
             </w:r>
           </w:p>
         </w:tc>
       </w:tr>
       <w:tr>
+        <w:trPr>
+          <w:cantSplit/>
+        </w:trPr>
         <w:tc>
-          <w:tcPr/>
+          <w:tcPr>
+            <w:tcW w:w="4440" w:type="dxa"/>
+          </w:tcPr>
           <w:p>
             <w:pPr>
               <w:pStyle w:val="Compact"/>
+              <w:spacing w:before="0" w:after="0" w:line="240" w:lineRule="auto"/>
+              <w:ind w:firstLine="0"/>
               <w:jc w:val="left"/>
             </w:pPr>
             <w:r>
+              <w:rPr>
+                <w:rFonts w:ascii="Times New Roman" w:hAnsi="Times New Roman"/>
+                <w:sz w:val="20"/>
+              </w:rPr>
               <w:t xml:space="preserve">Self-admitted markers</w:t>
             </w:r>
           </w:p>
         </w:tc>
         <w:tc>
-          <w:tcPr/>
+          <w:tcPr>
+            <w:tcW w:w="1155" w:type="dxa"/>
+          </w:tcPr>
           <w:p>
             <w:pPr>
               <w:pStyle w:val="Compact"/>
-              <w:jc w:val="left"/>
+              <w:spacing w:before="0" w:after="0" w:line="240" w:lineRule="auto"/>
+              <w:ind w:firstLine="0"/>
+              <w:jc w:val="center"/>
             </w:pPr>
             <w:r>
+              <w:rPr>
+                <w:rFonts w:ascii="Times New Roman" w:hAnsi="Times New Roman"/>
+                <w:sz w:val="20"/>
+              </w:rPr>
               <w:t xml:space="preserve">0.62</w:t>
             </w:r>
           </w:p>
         </w:tc>
         <w:tc>
-          <w:tcPr/>
+          <w:tcPr>
+            <w:tcW w:w="1155" w:type="dxa"/>
+          </w:tcPr>
           <w:p>
             <w:pPr>
               <w:pStyle w:val="Compact"/>
-              <w:jc w:val="left"/>
+              <w:spacing w:before="0" w:after="0" w:line="240" w:lineRule="auto"/>
+              <w:ind w:firstLine="0"/>
+              <w:jc w:val="center"/>
             </w:pPr>
             <w:r>
+              <w:rPr>
+                <w:rFonts w:ascii="Times New Roman" w:hAnsi="Times New Roman"/>
+                <w:sz w:val="20"/>
+              </w:rPr>
               <w:t xml:space="preserve">1.38</w:t>
             </w:r>
           </w:p>
         </w:tc>
         <w:tc>
-          <w:tcPr/>
+          <w:tcPr>
+            <w:tcW w:w="2610" w:type="dxa"/>
+          </w:tcPr>
           <w:p>
             <w:pPr>
               <w:pStyle w:val="Compact"/>
-              <w:jc w:val="left"/>
+              <w:spacing w:before="0" w:after="0" w:line="240" w:lineRule="auto"/>
+              <w:ind w:firstLine="0"/>
+              <w:jc w:val="center"/>
             </w:pPr>
             <w:r>
+              <w:rPr>
+                <w:rFonts w:ascii="Times New Roman" w:hAnsi="Times New Roman"/>
+                <w:sz w:val="20"/>
+              </w:rPr>
               <w:t xml:space="preserve">0.45 (0.33–0.61)</w:t>
             </w:r>
           </w:p>
         </w:tc>
       </w:tr>
       <w:tr>
+        <w:trPr>
+          <w:cantSplit/>
+        </w:trPr>
         <w:tc>
-          <w:tcPr/>
+          <w:tcPr>
+            <w:tcW w:w="4440" w:type="dxa"/>
+          </w:tcPr>
           <w:p>
             <w:pPr>
               <w:pStyle w:val="Compact"/>
+              <w:spacing w:before="0" w:after="0" w:line="240" w:lineRule="auto"/>
+              <w:ind w:firstLine="0"/>
               <w:jc w:val="left"/>
             </w:pPr>
             <w:r>
+              <w:rPr>
+                <w:rFonts w:ascii="Times New Roman" w:hAnsi="Times New Roman"/>
+                <w:sz w:val="20"/>
+              </w:rPr>
               <w:t xml:space="preserve">Smell score</w:t>
             </w:r>
           </w:p>
         </w:tc>
         <w:tc>
-          <w:tcPr/>
+          <w:tcPr>
+            <w:tcW w:w="1155" w:type="dxa"/>
+          </w:tcPr>
           <w:p>
             <w:pPr>
               <w:pStyle w:val="Compact"/>
-              <w:jc w:val="left"/>
+              <w:spacing w:before="0" w:after="0" w:line="240" w:lineRule="auto"/>
+              <w:ind w:firstLine="0"/>
+              <w:jc w:val="center"/>
             </w:pPr>
             <w:r>
+              <w:rPr>
+                <w:rFonts w:ascii="Times New Roman" w:hAnsi="Times New Roman"/>
+                <w:sz w:val="20"/>
+              </w:rPr>
               <w:t xml:space="preserve">35.9</w:t>
             </w:r>
           </w:p>
         </w:tc>
         <w:tc>
-          <w:tcPr/>
+          <w:tcPr>
+            <w:tcW w:w="1155" w:type="dxa"/>
+          </w:tcPr>
           <w:p>
             <w:pPr>
               <w:pStyle w:val="Compact"/>
-              <w:jc w:val="left"/>
+              <w:spacing w:before="0" w:after="0" w:line="240" w:lineRule="auto"/>
+              <w:ind w:firstLine="0"/>
+              <w:jc w:val="center"/>
             </w:pPr>
             <w:r>
+              <w:rPr>
+                <w:rFonts w:ascii="Times New Roman" w:hAnsi="Times New Roman"/>
+                <w:sz w:val="20"/>
+              </w:rPr>
               <w:t xml:space="preserve">11.2</w:t>
             </w:r>
           </w:p>
         </w:tc>
         <w:tc>
-          <w:tcPr/>
+          <w:tcPr>
+            <w:tcW w:w="2610" w:type="dxa"/>
+          </w:tcPr>
           <w:p>
             <w:pPr>
               <w:pStyle w:val="Compact"/>
-              <w:jc w:val="left"/>
+              <w:spacing w:before="0" w:after="0" w:line="240" w:lineRule="auto"/>
+              <w:ind w:firstLine="0"/>
+              <w:jc w:val="center"/>
             </w:pPr>
             <w:r>
+              <w:rPr>
+                <w:rFonts w:ascii="Times New Roman" w:hAnsi="Times New Roman"/>
+                <w:sz w:val="20"/>
+              </w:rPr>
               <w:t xml:space="preserve">3.22 (2.85–3.71)</w:t>
             </w:r>
           </w:p>
         </w:tc>
       </w:tr>
       <w:tr>
+        <w:trPr>
+          <w:cantSplit/>
+        </w:trPr>
         <w:tc>
-          <w:tcPr/>
+          <w:tcPr>
+            <w:tcW w:w="4440" w:type="dxa"/>
+          </w:tcPr>
           <w:p>
             <w:pPr>
               <w:pStyle w:val="Compact"/>
+              <w:spacing w:before="0" w:after="0" w:line="240" w:lineRule="auto"/>
+              <w:ind w:firstLine="0"/>
               <w:jc w:val="left"/>
             </w:pPr>
             <w:r>
+              <w:rPr>
+                <w:rFonts w:ascii="Times New Roman" w:hAnsi="Times New Roman"/>
+                <w:sz w:val="20"/>
+              </w:rPr>
               <w:t xml:space="preserve">Smell score without repeated lines</w:t>
             </w:r>
           </w:p>
         </w:tc>
         <w:tc>
-          <w:tcPr/>
+          <w:tcPr>
+            <w:tcW w:w="1155" w:type="dxa"/>
+          </w:tcPr>
           <w:p>
             <w:pPr>
               <w:pStyle w:val="Compact"/>
-              <w:jc w:val="left"/>
+              <w:spacing w:before="0" w:after="0" w:line="240" w:lineRule="auto"/>
+              <w:ind w:firstLine="0"/>
+              <w:jc w:val="center"/>
             </w:pPr>
             <w:r>
+              <w:rPr>
+                <w:rFonts w:ascii="Times New Roman" w:hAnsi="Times New Roman"/>
+                <w:sz w:val="20"/>
+              </w:rPr>
               <w:t xml:space="preserve">13.1</w:t>
             </w:r>
           </w:p>
         </w:tc>
         <w:tc>
-          <w:tcPr/>
+          <w:tcPr>
+            <w:tcW w:w="1155" w:type="dxa"/>
+          </w:tcPr>
           <w:p>
             <w:pPr>
               <w:pStyle w:val="Compact"/>
-              <w:jc w:val="left"/>
+              <w:spacing w:before="0" w:after="0" w:line="240" w:lineRule="auto"/>
+              <w:ind w:firstLine="0"/>
+              <w:jc w:val="center"/>
             </w:pPr>
             <w:r>
+              <w:rPr>
+                <w:rFonts w:ascii="Times New Roman" w:hAnsi="Times New Roman"/>
+                <w:sz w:val="20"/>
+              </w:rPr>
               <w:t xml:space="preserve">4.3</w:t>
             </w:r>
           </w:p>
         </w:tc>
         <w:tc>
-          <w:tcPr/>
+          <w:tcPr>
+            <w:tcW w:w="2610" w:type="dxa"/>
+          </w:tcPr>
           <w:p>
             <w:pPr>
               <w:pStyle w:val="Compact"/>
-              <w:jc w:val="left"/>
+              <w:spacing w:before="0" w:after="0" w:line="240" w:lineRule="auto"/>
+              <w:ind w:firstLine="0"/>
+              <w:jc w:val="center"/>
             </w:pPr>
             <w:r>
+              <w:rPr>
+                <w:rFonts w:ascii="Times New Roman" w:hAnsi="Times New Roman"/>
+                <w:sz w:val="20"/>
+              </w:rPr>
               <w:t xml:space="preserve">3.04 (2.54–3.79)</w:t>
             </w:r>
           </w:p>
         </w:tc>
       </w:tr>
       <w:tr>
+        <w:trPr>
+          <w:cantSplit/>
+        </w:trPr>
         <w:tc>
-          <w:tcPr/>
+          <w:tcPr>
+            <w:tcW w:w="4440" w:type="dxa"/>
+          </w:tcPr>
           <w:p>
             <w:pPr>
               <w:pStyle w:val="Compact"/>
+              <w:spacing w:before="0" w:after="0" w:line="240" w:lineRule="auto"/>
+              <w:ind w:firstLine="0"/>
               <w:jc w:val="left"/>
             </w:pPr>
             <w:r>
+              <w:rPr>
+                <w:rFonts w:ascii="Times New Roman" w:hAnsi="Times New Roman"/>
+                <w:sz w:val="20"/>
+              </w:rPr>
               <w:t xml:space="preserve">Markers per smell instance</w:t>
             </w:r>
           </w:p>
         </w:tc>
         <w:tc>
-          <w:tcPr/>
+          <w:tcPr>
+            <w:tcW w:w="1155" w:type="dxa"/>
+          </w:tcPr>
           <w:p>
             <w:pPr>
               <w:pStyle w:val="Compact"/>
-              <w:jc w:val="left"/>
+              <w:spacing w:before="0" w:after="0" w:line="240" w:lineRule="auto"/>
+              <w:ind w:firstLine="0"/>
+              <w:jc w:val="center"/>
             </w:pPr>
             <w:r>
+              <w:rPr>
+                <w:rFonts w:ascii="Times New Roman" w:hAnsi="Times New Roman"/>
+                <w:sz w:val="20"/>
+              </w:rPr>
               <w:t xml:space="preserve">0.017</w:t>
             </w:r>
           </w:p>
         </w:tc>
         <w:tc>
-          <w:tcPr/>
+          <w:tcPr>
+            <w:tcW w:w="1155" w:type="dxa"/>
+          </w:tcPr>
           <w:p>
             <w:pPr>
               <w:pStyle w:val="Compact"/>
-              <w:jc w:val="left"/>
+              <w:spacing w:before="0" w:after="0" w:line="240" w:lineRule="auto"/>
+              <w:ind w:firstLine="0"/>
+              <w:jc w:val="center"/>
             </w:pPr>
             <w:r>
+              <w:rPr>
+                <w:rFonts w:ascii="Times New Roman" w:hAnsi="Times New Roman"/>
+                <w:sz w:val="20"/>
+              </w:rPr>
               <w:t xml:space="preserve">0.124</w:t>
             </w:r>
           </w:p>
         </w:tc>
         <w:tc>
-          <w:tcPr/>
+          <w:tcPr>
+            <w:tcW w:w="2610" w:type="dxa"/>
+          </w:tcPr>
           <w:p>
             <w:pPr>
               <w:pStyle w:val="Compact"/>
-              <w:jc w:val="left"/>
+              <w:spacing w:before="0" w:after="0" w:line="240" w:lineRule="auto"/>
+              <w:ind w:firstLine="0"/>
+              <w:jc w:val="center"/>
             </w:pPr>
             <w:r>
+              <w:rPr>
+                <w:rFonts w:ascii="Times New Roman" w:hAnsi="Times New Roman"/>
+                <w:sz w:val="20"/>
+              </w:rPr>
               <w:t xml:space="preserve">0.14 (0.10–0.19)</w:t>
             </w:r>
           </w:p>
@@ -13619,6 +14841,7 @@
     <w:p>
       <w:pPr>
         <w:pStyle w:val="BodyText"/>
+        <w:spacing w:before="160"/>
       </w:pPr>
       <w:r>
         <w:rPr>
@@ -13663,6 +14886,7 @@
     <w:p>
       <w:pPr>
         <w:pStyle w:val="BodyText"/>
+        <w:keepNext/>
       </w:pPr>
       <w:r>
         <w:rPr>
@@ -13675,279 +14899,494 @@
     <w:tbl>
       <w:tblPr>
         <w:tblStyle w:val="Table"/>
-        <w:tblW w:type="pct" w:w="5000"/>
         <w:tblLook w:firstRow="1" w:lastRow="0" w:firstColumn="0" w:lastColumn="0" w:noHBand="0" w:noVBand="0" w:val="0020"/>
-        <w:jc w:val="start"/>
+        <w:tblW w:w="9360" w:type="dxa"/>
+        <w:jc w:val="center"/>
+        <w:tblLayout w:type="fixed"/>
+        <w:tblBorders>
+          <w:top w:val="single" w:sz="8" w:space="0" w:color="000000"/>
+          <w:bottom w:val="single" w:sz="8" w:space="0" w:color="000000"/>
+          <w:insideH w:val="single" w:sz="4" w:space="0" w:color="BFBFBF"/>
+          <w:left w:val="nil"/>
+          <w:right w:val="nil"/>
+          <w:insideV w:val="nil"/>
+        </w:tblBorders>
+        <w:tblCellMar>
+          <w:top w:w="40" w:type="dxa"/>
+          <w:left w:w="70" w:type="dxa"/>
+          <w:bottom w:w="40" w:type="dxa"/>
+          <w:right w:w="70" w:type="dxa"/>
+        </w:tblCellMar>
       </w:tblPr>
       <w:tblGrid>
-        <w:gridCol w:w="2640"/>
-        <w:gridCol w:w="2640"/>
-        <w:gridCol w:w="2640"/>
+        <w:gridCol w:w="4491"/>
+        <w:gridCol w:w="2124"/>
+        <w:gridCol w:w="2745"/>
       </w:tblGrid>
       <w:tr>
         <w:trPr>
           <w:tblHeader w:val="true"/>
+          <w:cantSplit/>
+          <w:tblHeader/>
         </w:trPr>
         <w:tc>
-          <w:tcPr/>
+          <w:tcPr>
+            <w:tcW w:w="4491" w:type="dxa"/>
+            <w:tcBorders>
+              <w:bottom w:val="single" w:sz="8" w:space="0" w:color="000000"/>
+            </w:tcBorders>
+          </w:tcPr>
           <w:p>
             <w:pPr>
               <w:pStyle w:val="Compact"/>
+              <w:spacing w:before="0" w:after="0" w:line="240" w:lineRule="auto"/>
+              <w:ind w:firstLine="0"/>
               <w:jc w:val="left"/>
             </w:pPr>
             <w:r>
+              <w:rPr>
+                <w:rFonts w:ascii="Times New Roman" w:hAnsi="Times New Roman"/>
+                <w:b/>
+                <w:sz w:val="20"/>
+              </w:rPr>
               <w:t xml:space="preserve">Outcome (repository mean)</w:t>
             </w:r>
           </w:p>
         </w:tc>
         <w:tc>
-          <w:tcPr/>
+          <w:tcPr>
+            <w:tcW w:w="2124" w:type="dxa"/>
+            <w:tcBorders>
+              <w:bottom w:val="single" w:sz="8" w:space="0" w:color="000000"/>
+            </w:tcBorders>
+          </w:tcPr>
           <w:p>
             <w:pPr>
               <w:pStyle w:val="Compact"/>
-              <w:jc w:val="left"/>
+              <w:spacing w:before="0" w:after="0" w:line="240" w:lineRule="auto"/>
+              <w:ind w:firstLine="0"/>
+              <w:jc w:val="center"/>
             </w:pPr>
             <w:r>
+              <w:rPr>
+                <w:rFonts w:ascii="Times New Roman" w:hAnsi="Times New Roman"/>
+                <w:b/>
+                <w:sz w:val="20"/>
+              </w:rPr>
               <w:t xml:space="preserve">After adoption (SE)</w:t>
             </w:r>
           </w:p>
         </w:tc>
         <w:tc>
-          <w:tcPr/>
+          <w:tcPr>
+            <w:tcW w:w="2745" w:type="dxa"/>
+            <w:tcBorders>
+              <w:bottom w:val="single" w:sz="8" w:space="0" w:color="000000"/>
+            </w:tcBorders>
+          </w:tcPr>
           <w:p>
             <w:pPr>
               <w:pStyle w:val="Compact"/>
-              <w:jc w:val="left"/>
+              <w:spacing w:before="0" w:after="0" w:line="240" w:lineRule="auto"/>
+              <w:ind w:firstLine="0"/>
+              <w:jc w:val="center"/>
             </w:pPr>
             <w:r>
+              <w:rPr>
+                <w:rFonts w:ascii="Times New Roman" w:hAnsi="Times New Roman"/>
+                <w:b/>
+                <w:sz w:val="20"/>
+              </w:rPr>
               <w:t xml:space="preserve">Before adoption, placebo (SE)</w:t>
             </w:r>
           </w:p>
         </w:tc>
       </w:tr>
       <w:tr>
+        <w:trPr>
+          <w:cantSplit/>
+        </w:trPr>
         <w:tc>
-          <w:tcPr/>
+          <w:tcPr>
+            <w:tcW w:w="4491" w:type="dxa"/>
+          </w:tcPr>
           <w:p>
             <w:pPr>
               <w:pStyle w:val="Compact"/>
+              <w:spacing w:before="0" w:after="0" w:line="240" w:lineRule="auto"/>
+              <w:ind w:firstLine="0"/>
               <w:jc w:val="left"/>
             </w:pPr>
             <w:r>
+              <w:rPr>
+                <w:rFonts w:ascii="Times New Roman" w:hAnsi="Times New Roman"/>
+                <w:sz w:val="20"/>
+              </w:rPr>
               <w:t xml:space="preserve">Net addition, all pull requests</w:t>
             </w:r>
           </w:p>
         </w:tc>
         <w:tc>
-          <w:tcPr/>
+          <w:tcPr>
+            <w:tcW w:w="2124" w:type="dxa"/>
+          </w:tcPr>
           <w:p>
             <w:pPr>
               <w:pStyle w:val="Compact"/>
-              <w:jc w:val="left"/>
+              <w:spacing w:before="0" w:after="0" w:line="240" w:lineRule="auto"/>
+              <w:ind w:firstLine="0"/>
+              <w:jc w:val="center"/>
             </w:pPr>
             <w:r>
+              <w:rPr>
+                <w:rFonts w:ascii="Times New Roman" w:hAnsi="Times New Roman"/>
+                <w:sz w:val="20"/>
+              </w:rPr>
               <w:t xml:space="preserve">+0.089 (0.042)</w:t>
             </w:r>
           </w:p>
         </w:tc>
         <w:tc>
-          <w:tcPr/>
+          <w:tcPr>
+            <w:tcW w:w="2745" w:type="dxa"/>
+          </w:tcPr>
           <w:p>
             <w:pPr>
               <w:pStyle w:val="Compact"/>
-              <w:jc w:val="left"/>
+              <w:spacing w:before="0" w:after="0" w:line="240" w:lineRule="auto"/>
+              <w:ind w:firstLine="0"/>
+              <w:jc w:val="center"/>
             </w:pPr>
             <w:r>
+              <w:rPr>
+                <w:rFonts w:ascii="Times New Roman" w:hAnsi="Times New Roman"/>
+                <w:sz w:val="20"/>
+              </w:rPr>
               <w:t xml:space="preserve">+0.025 (0.039)</w:t>
             </w:r>
           </w:p>
         </w:tc>
       </w:tr>
       <w:tr>
+        <w:trPr>
+          <w:cantSplit/>
+        </w:trPr>
         <w:tc>
-          <w:tcPr/>
+          <w:tcPr>
+            <w:tcW w:w="4491" w:type="dxa"/>
+          </w:tcPr>
           <w:p>
             <w:pPr>
               <w:pStyle w:val="Compact"/>
+              <w:spacing w:before="0" w:after="0" w:line="240" w:lineRule="auto"/>
+              <w:ind w:firstLine="0"/>
               <w:jc w:val="left"/>
             </w:pPr>
             <w:r>
+              <w:rPr>
+                <w:rFonts w:ascii="Times New Roman" w:hAnsi="Times New Roman"/>
+                <w:sz w:val="20"/>
+              </w:rPr>
               <w:t xml:space="preserve">Net addition, human pull requests only</w:t>
             </w:r>
           </w:p>
         </w:tc>
         <w:tc>
-          <w:tcPr/>
+          <w:tcPr>
+            <w:tcW w:w="2124" w:type="dxa"/>
+          </w:tcPr>
           <w:p>
             <w:pPr>
               <w:pStyle w:val="Compact"/>
-              <w:jc w:val="left"/>
+              <w:spacing w:before="0" w:after="0" w:line="240" w:lineRule="auto"/>
+              <w:ind w:firstLine="0"/>
+              <w:jc w:val="center"/>
             </w:pPr>
             <w:r>
+              <w:rPr>
+                <w:rFonts w:ascii="Times New Roman" w:hAnsi="Times New Roman"/>
+                <w:sz w:val="20"/>
+              </w:rPr>
               <w:t xml:space="preserve">+0.037 (0.042)</w:t>
             </w:r>
           </w:p>
         </w:tc>
         <w:tc>
-          <w:tcPr/>
+          <w:tcPr>
+            <w:tcW w:w="2745" w:type="dxa"/>
+          </w:tcPr>
           <w:p>
             <w:pPr>
               <w:pStyle w:val="Compact"/>
-              <w:jc w:val="left"/>
+              <w:spacing w:before="0" w:after="0" w:line="240" w:lineRule="auto"/>
+              <w:ind w:firstLine="0"/>
+              <w:jc w:val="center"/>
             </w:pPr>
             <w:r>
+              <w:rPr>
+                <w:rFonts w:ascii="Times New Roman" w:hAnsi="Times New Roman"/>
+                <w:sz w:val="20"/>
+              </w:rPr>
               <w:t xml:space="preserve">+0.026 (0.040)</w:t>
             </w:r>
           </w:p>
         </w:tc>
       </w:tr>
       <w:tr>
+        <w:trPr>
+          <w:cantSplit/>
+        </w:trPr>
         <w:tc>
-          <w:tcPr/>
+          <w:tcPr>
+            <w:tcW w:w="4491" w:type="dxa"/>
+          </w:tcPr>
           <w:p>
             <w:pPr>
               <w:pStyle w:val="Compact"/>
+              <w:spacing w:before="0" w:after="0" w:line="240" w:lineRule="auto"/>
+              <w:ind w:firstLine="0"/>
               <w:jc w:val="left"/>
             </w:pPr>
             <w:r>
+              <w:rPr>
+                <w:rFonts w:ascii="Times New Roman" w:hAnsi="Times New Roman"/>
+                <w:sz w:val="20"/>
+              </w:rPr>
               <w:t xml:space="preserve">Share with a human review, all</w:t>
             </w:r>
           </w:p>
         </w:tc>
         <w:tc>
-          <w:tcPr/>
+          <w:tcPr>
+            <w:tcW w:w="2124" w:type="dxa"/>
+          </w:tcPr>
           <w:p>
             <w:pPr>
               <w:pStyle w:val="Compact"/>
-              <w:jc w:val="left"/>
+              <w:spacing w:before="0" w:after="0" w:line="240" w:lineRule="auto"/>
+              <w:ind w:firstLine="0"/>
+              <w:jc w:val="center"/>
             </w:pPr>
             <w:r>
+              <w:rPr>
+                <w:rFonts w:ascii="Times New Roman" w:hAnsi="Times New Roman"/>
+                <w:sz w:val="20"/>
+              </w:rPr>
               <w:t xml:space="preserve">−0.010 (0.011)</w:t>
             </w:r>
           </w:p>
         </w:tc>
         <w:tc>
-          <w:tcPr/>
+          <w:tcPr>
+            <w:tcW w:w="2745" w:type="dxa"/>
+          </w:tcPr>
           <w:p>
             <w:pPr>
               <w:pStyle w:val="Compact"/>
-              <w:jc w:val="left"/>
+              <w:spacing w:before="0" w:after="0" w:line="240" w:lineRule="auto"/>
+              <w:ind w:firstLine="0"/>
+              <w:jc w:val="center"/>
             </w:pPr>
             <w:r>
+              <w:rPr>
+                <w:rFonts w:ascii="Times New Roman" w:hAnsi="Times New Roman"/>
+                <w:sz w:val="20"/>
+              </w:rPr>
               <w:t xml:space="preserve">+0.005 (0.011)</w:t>
             </w:r>
           </w:p>
         </w:tc>
       </w:tr>
       <w:tr>
+        <w:trPr>
+          <w:cantSplit/>
+        </w:trPr>
         <w:tc>
-          <w:tcPr/>
+          <w:tcPr>
+            <w:tcW w:w="4491" w:type="dxa"/>
+          </w:tcPr>
           <w:p>
             <w:pPr>
               <w:pStyle w:val="Compact"/>
+              <w:spacing w:before="0" w:after="0" w:line="240" w:lineRule="auto"/>
+              <w:ind w:firstLine="0"/>
               <w:jc w:val="left"/>
             </w:pPr>
             <w:r>
+              <w:rPr>
+                <w:rFonts w:ascii="Times New Roman" w:hAnsi="Times New Roman"/>
+                <w:sz w:val="20"/>
+              </w:rPr>
               <w:t xml:space="preserve">Share of refactoring-titled pull requests</w:t>
             </w:r>
           </w:p>
         </w:tc>
         <w:tc>
-          <w:tcPr/>
+          <w:tcPr>
+            <w:tcW w:w="2124" w:type="dxa"/>
+          </w:tcPr>
           <w:p>
             <w:pPr>
               <w:pStyle w:val="Compact"/>
-              <w:jc w:val="left"/>
+              <w:spacing w:before="0" w:after="0" w:line="240" w:lineRule="auto"/>
+              <w:ind w:firstLine="0"/>
+              <w:jc w:val="center"/>
             </w:pPr>
             <w:r>
+              <w:rPr>
+                <w:rFonts w:ascii="Times New Roman" w:hAnsi="Times New Roman"/>
+                <w:sz w:val="20"/>
+              </w:rPr>
               <w:t xml:space="preserve">+0.001 (0.005)</w:t>
             </w:r>
           </w:p>
         </w:tc>
         <w:tc>
-          <w:tcPr/>
+          <w:tcPr>
+            <w:tcW w:w="2745" w:type="dxa"/>
+          </w:tcPr>
           <w:p>
             <w:pPr>
               <w:pStyle w:val="Compact"/>
-              <w:jc w:val="left"/>
+              <w:spacing w:before="0" w:after="0" w:line="240" w:lineRule="auto"/>
+              <w:ind w:firstLine="0"/>
+              <w:jc w:val="center"/>
             </w:pPr>
             <w:r>
+              <w:rPr>
+                <w:rFonts w:ascii="Times New Roman" w:hAnsi="Times New Roman"/>
+                <w:sz w:val="20"/>
+              </w:rPr>
               <w:t xml:space="preserve">0.000 (0.005)</w:t>
             </w:r>
           </w:p>
         </w:tc>
       </w:tr>
       <w:tr>
+        <w:trPr>
+          <w:cantSplit/>
+        </w:trPr>
         <w:tc>
-          <w:tcPr/>
+          <w:tcPr>
+            <w:tcW w:w="4491" w:type="dxa"/>
+          </w:tcPr>
           <w:p>
             <w:pPr>
               <w:pStyle w:val="Compact"/>
+              <w:spacing w:before="0" w:after="0" w:line="240" w:lineRule="auto"/>
+              <w:ind w:firstLine="0"/>
               <w:jc w:val="left"/>
             </w:pPr>
             <w:r>
+              <w:rPr>
+                <w:rFonts w:ascii="Times New Roman" w:hAnsi="Times New Roman"/>
+                <w:sz w:val="20"/>
+              </w:rPr>
               <w:t xml:space="preserve">Merge rate, all</w:t>
             </w:r>
           </w:p>
         </w:tc>
         <w:tc>
-          <w:tcPr/>
+          <w:tcPr>
+            <w:tcW w:w="2124" w:type="dxa"/>
+          </w:tcPr>
           <w:p>
             <w:pPr>
               <w:pStyle w:val="Compact"/>
-              <w:jc w:val="left"/>
+              <w:spacing w:before="0" w:after="0" w:line="240" w:lineRule="auto"/>
+              <w:ind w:firstLine="0"/>
+              <w:jc w:val="center"/>
             </w:pPr>
             <w:r>
+              <w:rPr>
+                <w:rFonts w:ascii="Times New Roman" w:hAnsi="Times New Roman"/>
+                <w:sz w:val="20"/>
+              </w:rPr>
               <w:t xml:space="preserve">−0.017 (0.008)</w:t>
             </w:r>
           </w:p>
         </w:tc>
         <w:tc>
-          <w:tcPr/>
+          <w:tcPr>
+            <w:tcW w:w="2745" w:type="dxa"/>
+          </w:tcPr>
           <w:p>
             <w:pPr>
               <w:pStyle w:val="Compact"/>
-              <w:jc w:val="left"/>
+              <w:spacing w:before="0" w:after="0" w:line="240" w:lineRule="auto"/>
+              <w:ind w:firstLine="0"/>
+              <w:jc w:val="center"/>
             </w:pPr>
             <w:r>
+              <w:rPr>
+                <w:rFonts w:ascii="Times New Roman" w:hAnsi="Times New Roman"/>
+                <w:sz w:val="20"/>
+              </w:rPr>
               <w:t xml:space="preserve">+0.010 (0.007)</w:t>
             </w:r>
           </w:p>
         </w:tc>
       </w:tr>
       <w:tr>
+        <w:trPr>
+          <w:cantSplit/>
+        </w:trPr>
         <w:tc>
-          <w:tcPr/>
+          <w:tcPr>
+            <w:tcW w:w="4491" w:type="dxa"/>
+          </w:tcPr>
           <w:p>
             <w:pPr>
               <w:pStyle w:val="Compact"/>
+              <w:spacing w:before="0" w:after="0" w:line="240" w:lineRule="auto"/>
+              <w:ind w:firstLine="0"/>
               <w:jc w:val="left"/>
             </w:pPr>
             <w:r>
+              <w:rPr>
+                <w:rFonts w:ascii="Times New Roman" w:hAnsi="Times New Roman"/>
+                <w:sz w:val="20"/>
+              </w:rPr>
               <w:t xml:space="preserve">log(1 + pull-request count), all</w:t>
             </w:r>
           </w:p>
         </w:tc>
         <w:tc>
-          <w:tcPr/>
+          <w:tcPr>
+            <w:tcW w:w="2124" w:type="dxa"/>
+          </w:tcPr>
           <w:p>
             <w:pPr>
               <w:pStyle w:val="Compact"/>
-              <w:jc w:val="left"/>
+              <w:spacing w:before="0" w:after="0" w:line="240" w:lineRule="auto"/>
+              <w:ind w:firstLine="0"/>
+              <w:jc w:val="center"/>
             </w:pPr>
             <w:r>
+              <w:rPr>
+                <w:rFonts w:ascii="Times New Roman" w:hAnsi="Times New Roman"/>
+                <w:sz w:val="20"/>
+              </w:rPr>
               <w:t xml:space="preserve">+0.061 (0.019)</w:t>
             </w:r>
           </w:p>
         </w:tc>
         <w:tc>
-          <w:tcPr/>
+          <w:tcPr>
+            <w:tcW w:w="2745" w:type="dxa"/>
+          </w:tcPr>
           <w:p>
             <w:pPr>
               <w:pStyle w:val="Compact"/>
-              <w:jc w:val="left"/>
+              <w:spacing w:before="0" w:after="0" w:line="240" w:lineRule="auto"/>
+              <w:ind w:firstLine="0"/>
+              <w:jc w:val="center"/>
             </w:pPr>
             <w:r>
+              <w:rPr>
+                <w:rFonts w:ascii="Times New Roman" w:hAnsi="Times New Roman"/>
+                <w:sz w:val="20"/>
+              </w:rPr>
               <w:t xml:space="preserve">n.a.</w:t>
             </w:r>
           </w:p>
@@ -13957,13 +15396,14 @@
     <w:p>
       <w:pPr>
         <w:pStyle w:val="CaptionedFigure"/>
+        <w:spacing w:before="160"/>
       </w:pPr>
       <w:r>
         <w:drawing>
           <wp:inline>
-            <wp:extent cx="5334000" cy="1173480"/>
+            <wp:extent cx="5943600" cy="5118099"/>
             <wp:effectExtent b="0" l="0" r="0" t="0"/>
-            <wp:docPr descr="Event-study estimates by period relative to adoption. Points are estimated effects relative to not-yet-treated repositories; bars are 95 percent confidence intervals." title="" id="43" name="Picture"/>
+            <wp:docPr descr="Figure 1. Event-study estimates by period relative to adoption. Points are estimated effects relative to not-yet-treated repositories; bars are 95 percent confidence intervals. Open circles mark the base period, normalized to zero." title="" id="43" name="Picture"/>
             <a:graphic>
               <a:graphicData uri="http://schemas.openxmlformats.org/drawingml/2006/picture">
                 <pic:pic>
@@ -13982,7 +15422,7 @@
                   <pic:spPr bwMode="auto">
                     <a:xfrm>
                       <a:off x="0" y="0"/>
-                      <a:ext cx="5334000" cy="1173480"/>
+                      <a:ext cx="5943600" cy="5118099"/>
                     </a:xfrm>
                     <a:prstGeom prst="rect">
                       <a:avLst/>
@@ -14006,7 +15446,7 @@
         <w:pStyle w:val="ImageCaption"/>
       </w:pPr>
       <w:r>
-        <w:t xml:space="preserve">Event-study estimates by period relative to adoption. Points are estimated effects relative to not-yet-treated repositories; bars are 95 percent confidence intervals.</w:t>
+        <w:t xml:space="preserve">Figure 1. Event-study estimates by period relative to adoption. Points are estimated effects relative to not-yet-treated repositories; bars are 95 percent confidence intervals. Open circles mark the base period, normalized to zero.</w:t>
       </w:r>
     </w:p>
     <w:p>
@@ -19994,6 +21434,7 @@
     <w:bookmarkEnd w:id="55"/>
     <w:sectPr>
       <w:footerReference w:type="default" r:id="rId9"/>
+      <w:pgSz w:w="12240" w:h="15840"/>
       <w:pgMar w:bottom="1440" w:left="1440" w:right="1440" w:top="1440"/>
     </w:sectPr>
   </w:body>

</xml_diff>